<commit_message>
paper: rebuild paper.docx from updated paper.md (Phase 5 diagnosis, McNemar 2x2, input-asymmetry/indexer caveats)
</commit_message>
<xml_diff>
--- a/paper/paper.docx
+++ b/paper/paper.docx
@@ -2,20 +2,11 @@
 <file path=word/document.xml><?xml version="1.0" encoding="utf-8"?>
 <w:document xmlns:w="http://schemas.openxmlformats.org/wordprocessingml/2006/main" xmlns:m="http://schemas.openxmlformats.org/officeDocument/2006/math" xmlns:r="http://schemas.openxmlformats.org/officeDocument/2006/relationships" xmlns:o="urn:schemas-microsoft-com:office:office" xmlns:v="urn:schemas-microsoft-com:vml" xmlns:w10="urn:schemas-microsoft-com:office:word" xmlns:a="http://schemas.openxmlformats.org/drawingml/2006/main" xmlns:pic="http://schemas.openxmlformats.org/drawingml/2006/picture" xmlns:wp="http://schemas.openxmlformats.org/drawingml/2006/wordprocessingDrawing">
   <w:body>
-    <w:bookmarkStart w:id="86" w:name="X2ddac61a38ed9c25ada36f223803948c7dd92e7"/>
+    <w:bookmarkStart w:id="87" w:name="X2ddac61a38ed9c25ada36f223803948c7dd92e7"/>
     <w:p>
       <w:pPr>
         <w:pStyle w:val="Heading1"/>
       </w:pPr>
-      <w:r>
-        <w:rPr>
-          <w:rStyle w:val="SectionNumber"/>
-        </w:rPr>
-        <w:t xml:space="preserve">1</w:t>
-      </w:r>
-      <w:r>
-        <w:tab/>
-      </w:r>
       <w:r>
         <w:t xml:space="preserve">PXRD-Diff: Conditional Diffusion for Powder-Diffraction Inversion — an Encoder-Bottleneck Diagnosis and Shared-Harness Reproduction</w:t>
       </w:r>
@@ -66,15 +57,6 @@
         <w:pStyle w:val="Heading2"/>
       </w:pPr>
       <w:r>
-        <w:rPr>
-          <w:rStyle w:val="SectionNumber"/>
-        </w:rPr>
-        <w:t xml:space="preserve">1.1</w:t>
-      </w:r>
-      <w:r>
-        <w:tab/>
-      </w:r>
-      <w:r>
         <w:t xml:space="preserve">Abstract</w:t>
       </w:r>
     </w:p>
@@ -164,7 +146,23 @@
         <w:t xml:space="preserve">mechanism</w:t>
       </w:r>
       <w:r>
-        <w:t xml:space="preserve">: the learned PXRD encoder reaches a 0.007 auxiliary lattice-regression loss in isolation, but the denoiser cannot extract absolute d-spacings well enough to predict the lattice from scratch. A perturbation study locates a sharp sensitivity knee at ~0.5 Å cell error, and a true-lattice oracle lifts match from</w:t>
+        <w:t xml:space="preserve">: the learned PXRD encoder reaches a 0.007</w:t>
+      </w:r>
+      <w:r>
+        <w:t xml:space="preserve"> </w:t>
+      </w:r>
+      <w:r>
+        <w:rPr>
+          <w:i/>
+          <w:iCs/>
+        </w:rPr>
+        <w:t xml:space="preserve">normalised</w:t>
+      </w:r>
+      <w:r>
+        <w:t xml:space="preserve"> </w:t>
+      </w:r>
+      <w:r>
+        <w:t xml:space="preserve">auxiliary lattice-regression loss in isolation, but that relative fit does not survive conversion to absolute scale — substituting the auxiliary head’s own lattice into the sampler recovers only 1.2 %, because its ~1.1 Å length error shifts every Bragg peak by ~15 % and collapses pattern agreement. The bottleneck is the global pooling that discards absolute peak positions, not the denoiser alone: neither the pooled encoding nor the denoiser fixes the lattice from scratch. A perturbation study locates a sharp sensitivity knee at ~0.5 Å cell error, and a true-lattice oracle lifts match from</w:t>
       </w:r>
       <w:r>
         <w:t xml:space="preserve"> </w:t>
@@ -294,15 +292,6 @@
       <w:pPr>
         <w:pStyle w:val="Heading2"/>
       </w:pPr>
-      <w:r>
-        <w:rPr>
-          <w:rStyle w:val="SectionNumber"/>
-        </w:rPr>
-        <w:t xml:space="preserve">1.2</w:t>
-      </w:r>
-      <w:r>
-        <w:tab/>
-      </w:r>
       <w:r>
         <w:t xml:space="preserve">1. Introduction</w:t>
       </w:r>
@@ -504,7 +493,39 @@
         <w:t xml:space="preserve"> </w:t>
       </w:r>
       <w:r>
-        <w:t xml:space="preserve">at n = 1000, with non-overlapping 95 % Wilson CIs. The encoder reaches 0.007 aux lattice loss in isolation but the denoiser under-uses the signal — the lattice channel, not coordinates, is the dominant bottleneck.</w:t>
+        <w:t xml:space="preserve">at n = 1000, with non-overlapping 95 % Wilson CIs. The encoder reaches a 0.007</w:t>
+      </w:r>
+      <w:r>
+        <w:t xml:space="preserve"> </w:t>
+      </w:r>
+      <w:r>
+        <w:rPr>
+          <w:i/>
+          <w:iCs/>
+        </w:rPr>
+        <w:t xml:space="preserve">normalised</w:t>
+      </w:r>
+      <w:r>
+        <w:t xml:space="preserve"> </w:t>
+      </w:r>
+      <w:r>
+        <w:t xml:space="preserve">aux lattice loss in isolation, but substituting that head’s lattice into the sampler recovers only 1.2 % (§5.6) — its ~1.1 Å error sits well above the knee — so the pooled encoding, not merely the denoiser, fails to deliver absolute d-spacings. The lattice channel is the dominant</w:t>
+      </w:r>
+      <w:r>
+        <w:t xml:space="preserve"> </w:t>
+      </w:r>
+      <w:r>
+        <w:rPr>
+          <w:i/>
+          <w:iCs/>
+        </w:rPr>
+        <w:t xml:space="preserve">accessible</w:t>
+      </w:r>
+      <w:r>
+        <w:t xml:space="preserve"> </w:t>
+      </w:r>
+      <w:r>
+        <w:t xml:space="preserve">limiter; the 5.6 % oracle ceiling shows coordinates remain a co-bottleneck.</w:t>
       </w:r>
     </w:p>
     <w:p>
@@ -647,15 +668,6 @@
         <w:pStyle w:val="Heading2"/>
       </w:pPr>
       <w:r>
-        <w:rPr>
-          <w:rStyle w:val="SectionNumber"/>
-        </w:rPr>
-        <w:t xml:space="preserve">1.3</w:t>
-      </w:r>
-      <w:r>
-        <w:tab/>
-      </w:r>
-      <w:r>
         <w:t xml:space="preserve">2. Related work</w:t>
       </w:r>
     </w:p>
@@ -1008,15 +1020,6 @@
         <w:pStyle w:val="Heading2"/>
       </w:pPr>
       <w:r>
-        <w:rPr>
-          <w:rStyle w:val="SectionNumber"/>
-        </w:rPr>
-        <w:t xml:space="preserve">1.4</w:t>
-      </w:r>
-      <w:r>
-        <w:tab/>
-      </w:r>
-      <w:r>
         <w:t xml:space="preserve">3. Method</w:t>
       </w:r>
     </w:p>
@@ -1025,15 +1028,6 @@
       <w:pPr>
         <w:pStyle w:val="Heading3"/>
       </w:pPr>
-      <w:r>
-        <w:rPr>
-          <w:rStyle w:val="SectionNumber"/>
-        </w:rPr>
-        <w:t xml:space="preserve">1.4.1</w:t>
-      </w:r>
-      <w:r>
-        <w:tab/>
-      </w:r>
       <w:r>
         <w:t xml:space="preserve">3.1 Problem formulation</w:t>
       </w:r>
@@ -1587,15 +1581,6 @@
       <w:pPr>
         <w:pStyle w:val="Heading3"/>
       </w:pPr>
-      <w:r>
-        <w:rPr>
-          <w:rStyle w:val="SectionNumber"/>
-        </w:rPr>
-        <w:t xml:space="preserve">1.4.2</w:t>
-      </w:r>
-      <w:r>
-        <w:tab/>
-      </w:r>
       <w:r>
         <w:t xml:space="preserve">3.2 Architecture overview</w:t>
       </w:r>
@@ -2438,15 +2423,6 @@
       <w:pPr>
         <w:pStyle w:val="Heading3"/>
       </w:pPr>
-      <w:r>
-        <w:rPr>
-          <w:rStyle w:val="SectionNumber"/>
-        </w:rPr>
-        <w:t xml:space="preserve">1.4.3</w:t>
-      </w:r>
-      <w:r>
-        <w:tab/>
-      </w:r>
       <w:r>
         <w:t xml:space="preserve">3.3 Differentiable Bragg structure-factor loss</w:t>
       </w:r>
@@ -3463,15 +3439,6 @@
         <w:pStyle w:val="Heading3"/>
       </w:pPr>
       <w:r>
-        <w:rPr>
-          <w:rStyle w:val="SectionNumber"/>
-        </w:rPr>
-        <w:t xml:space="preserve">1.4.4</w:t>
-      </w:r>
-      <w:r>
-        <w:tab/>
-      </w:r>
-      <w:r>
         <w:t xml:space="preserve">3.4 Training objective</w:t>
       </w:r>
     </w:p>
@@ -4726,15 +4693,6 @@
         <w:pStyle w:val="Heading3"/>
       </w:pPr>
       <w:r>
-        <w:rPr>
-          <w:rStyle w:val="SectionNumber"/>
-        </w:rPr>
-        <w:t xml:space="preserve">1.4.5</w:t>
-      </w:r>
-      <w:r>
-        <w:tab/>
-      </w:r>
-      <w:r>
         <w:t xml:space="preserve">3.5 Classical indexing as a drop-in for the learned lattice head</w:t>
       </w:r>
     </w:p>
@@ -4903,15 +4861,6 @@
       <w:pPr>
         <w:pStyle w:val="Heading3"/>
       </w:pPr>
-      <w:r>
-        <w:rPr>
-          <w:rStyle w:val="SectionNumber"/>
-        </w:rPr>
-        <w:t xml:space="preserve">1.4.6</w:t>
-      </w:r>
-      <w:r>
-        <w:tab/>
-      </w:r>
       <w:r>
         <w:t xml:space="preserve">3.6 Sampling</w:t>
       </w:r>
@@ -5262,15 +5211,6 @@
         <w:pStyle w:val="Heading2"/>
       </w:pPr>
       <w:r>
-        <w:rPr>
-          <w:rStyle w:val="SectionNumber"/>
-        </w:rPr>
-        <w:t xml:space="preserve">1.5</w:t>
-      </w:r>
-      <w:r>
-        <w:tab/>
-      </w:r>
-      <w:r>
         <w:t xml:space="preserve">4. Experiments</w:t>
       </w:r>
     </w:p>
@@ -5899,21 +5839,12 @@
       </w:r>
     </w:p>
     <w:bookmarkEnd w:id="45"/>
-    <w:bookmarkStart w:id="70" w:name="results"/>
+    <w:bookmarkStart w:id="71" w:name="results"/>
     <w:p>
       <w:pPr>
         <w:pStyle w:val="Heading2"/>
       </w:pPr>
       <w:r>
-        <w:rPr>
-          <w:rStyle w:val="SectionNumber"/>
-        </w:rPr>
-        <w:t xml:space="preserve">1.6</w:t>
-      </w:r>
-      <w:r>
-        <w:tab/>
-      </w:r>
-      <w:r>
         <w:t xml:space="preserve">5. Results</w:t>
       </w:r>
     </w:p>
@@ -5930,15 +5861,6 @@
       <w:pPr>
         <w:pStyle w:val="Heading3"/>
       </w:pPr>
-      <w:r>
-        <w:rPr>
-          <w:rStyle w:val="SectionNumber"/>
-        </w:rPr>
-        <w:t xml:space="preserve">1.6.1</w:t>
-      </w:r>
-      <w:r>
-        <w:tab/>
-      </w:r>
       <w:r>
         <w:t xml:space="preserve">5.1 Phase 4 — architectural ablation (true-lattice setting)</w:t>
       </w:r>
@@ -6865,15 +6787,6 @@
         <w:pStyle w:val="Heading3"/>
       </w:pPr>
       <w:r>
-        <w:rPr>
-          <w:rStyle w:val="SectionNumber"/>
-        </w:rPr>
-        <w:t xml:space="preserve">1.6.2</w:t>
-      </w:r>
-      <w:r>
-        <w:tab/>
-      </w:r>
-      <w:r>
         <w:t xml:space="preserve">5.2 Phase 9 — classical indexer drop-in</w:t>
       </w:r>
     </w:p>
@@ -7245,7 +7158,47 @@
         <w:t xml:space="preserve"> </w:t>
       </w:r>
       <w:r>
-        <w:t xml:space="preserve">lattice sources at three seeds (n = 1 000 each), differing only in the lattice channel, and applied a paired McNemar test on the per-structure outcomes — the correct test, because the two arms see the same materials. The result is unambiguous. Pooled over seeds the learned-head full pipeline recovers</w:t>
+        <w:t xml:space="preserve">lattice sources at three seeds (n = 1 000 each), differing only in the lattice channel, and applied a paired McNemar test on the per-structure outcomes — the correct test, because the two arms see the same materials. The result is unambiguous. The two arms are scored on the same materials per seed, but the learned-head arm yields fewer</w:t>
+      </w:r>
+      <w:r>
+        <w:t xml:space="preserve"> </w:t>
+      </w:r>
+      <w:r>
+        <w:rPr>
+          <w:i/>
+          <w:iCs/>
+        </w:rPr>
+        <w:t xml:space="preserve">evaluable</w:t>
+      </w:r>
+      <w:r>
+        <w:t xml:space="preserve"> </w:t>
+      </w:r>
+      <w:r>
+        <w:t xml:space="preserve">cells: its diffusion-sampled lattices are frequently degenerate and hang</w:t>
+      </w:r>
+      <w:r>
+        <w:t xml:space="preserve"> </w:t>
+      </w:r>
+      <w:r>
+        <w:rPr>
+          <w:rStyle w:val="VerbatimChar"/>
+        </w:rPr>
+        <w:t xml:space="preserve">StructureMatcher</w:t>
+      </w:r>
+      <w:r>
+        <w:t xml:space="preserve">/</w:t>
+      </w:r>
+      <w:r>
+        <w:rPr>
+          <w:rStyle w:val="VerbatimChar"/>
+        </w:rPr>
+        <w:t xml:space="preserve">spglib</w:t>
+      </w:r>
+      <w:r>
+        <w:t xml:space="preserve"> </w:t>
+      </w:r>
+      <w:r>
+        <w:t xml:space="preserve">(C calls that a Python signal cannot interrupt), so we run structure-domain scoring in a spawn worker hard-killed at 30 s and count overruns as misses. This leaves</w:t>
       </w:r>
       <w:r>
         <w:t xml:space="preserve"> </w:t>
@@ -7255,13 +7208,13 @@
           <w:b/>
           <w:bCs/>
         </w:rPr>
-        <w:t xml:space="preserve">0 / 1 949</w:t>
-      </w:r>
-      <w:r>
-        <w:t xml:space="preserve"> </w:t>
-      </w:r>
-      <w:r>
-        <w:t xml:space="preserve">evaluable structures (0.0 % [0.0, 0.2]), while the indexer drop-in recovers</w:t>
+        <w:t xml:space="preserve">1 949</w:t>
+      </w:r>
+      <w:r>
+        <w:t xml:space="preserve"> </w:t>
+      </w:r>
+      <w:r>
+        <w:t xml:space="preserve">learned-head structures scored across the three seeds versus all 3 000 for the indexer; the paired test runs on the 1 949-structure intersection (every learned-head row has a matched indexer row). On that paired set the indexer recovers</w:t>
       </w:r>
       <w:r>
         <w:t xml:space="preserve"> </w:t>
@@ -7271,13 +7224,13 @@
           <w:b/>
           <w:bCs/>
         </w:rPr>
-        <w:t xml:space="preserve">1.5 % [1.2, 2.0]</w:t>
-      </w:r>
-      <w:r>
-        <w:t xml:space="preserve"> </w:t>
-      </w:r>
-      <w:r>
-        <w:t xml:space="preserve">(46 / 3 000), reproducing the single-seed 1.6 %. The paired improvement is</w:t>
+        <w:t xml:space="preserve">27</w:t>
+      </w:r>
+      <w:r>
+        <w:t xml:space="preserve"> </w:t>
+      </w:r>
+      <w:r>
+        <w:t xml:space="preserve">structures the learned head misses and the learned head recovers</w:t>
       </w:r>
       <w:r>
         <w:t xml:space="preserve"> </w:t>
@@ -7287,10 +7240,283 @@
           <w:b/>
           <w:bCs/>
         </w:rPr>
-        <w:t xml:space="preserve">significant — McNemar p &lt; 10⁻⁴</w:t>
-      </w:r>
-      <w:r>
-        <w:t xml:space="preserve">, with 27 structures recovered by the indexer that the learned head missed and</w:t>
+        <w:t xml:space="preserve">none</w:t>
+      </w:r>
+      <w:r>
+        <w:t xml:space="preserve"> </w:t>
+      </w:r>
+      <w:r>
+        <w:t xml:space="preserve">the indexer misses — the explicit 2×2 below.</w:t>
+      </w:r>
+    </w:p>
+    <w:p>
+      <w:pPr>
+        <w:pStyle w:val="BodyText"/>
+      </w:pPr>
+      <w:r>
+        <w:rPr>
+          <w:b/>
+          <w:bCs/>
+        </w:rPr>
+        <w:t xml:space="preserve">Table 2a.</w:t>
+      </w:r>
+      <w:r>
+        <w:t xml:space="preserve"> </w:t>
+      </w:r>
+      <w:r>
+        <w:t xml:space="preserve">Paired per-structure outcomes, learned head vs indexer drop-in (three seeds pooled; match =</w:t>
+      </w:r>
+      <w:r>
+        <w:t xml:space="preserve"> </w:t>
+      </w:r>
+      <w:r>
+        <w:rPr>
+          <w:rStyle w:val="VerbatimChar"/>
+        </w:rPr>
+        <w:t xml:space="preserve">StructureMatcher</w:t>
+      </w:r>
+      <w:r>
+        <w:t xml:space="preserve"> </w:t>
+      </w:r>
+      <w:r>
+        <w:t xml:space="preserve">hit).</w:t>
+      </w:r>
+    </w:p>
+    <w:tbl>
+      <w:tblPr>
+        <w:tblStyle w:val="Table"/>
+        <w:tblW w:type="auto" w:w="0"/>
+        <w:tblLook w:firstRow="1" w:lastRow="0" w:firstColumn="0" w:lastColumn="0" w:noHBand="0" w:noVBand="0" w:val="0020"/>
+      </w:tblPr>
+      <w:tblGrid>
+        <w:gridCol w:w="1980"/>
+        <w:gridCol w:w="1980"/>
+        <w:gridCol w:w="1980"/>
+        <w:gridCol w:w="1980"/>
+      </w:tblGrid>
+      <w:tr>
+        <w:trPr>
+          <w:tblHeader w:val="on"/>
+        </w:trPr>
+        <w:tc>
+          <w:tcPr/>
+          <w:p>
+            <w:pPr>
+              <w:pStyle w:val="Compact"/>
+            </w:pPr>
+          </w:p>
+        </w:tc>
+        <w:tc>
+          <w:tcPr/>
+          <w:p>
+            <w:pPr>
+              <w:pStyle w:val="Compact"/>
+            </w:pPr>
+            <w:r>
+              <w:t xml:space="preserve">indexer</w:t>
+            </w:r>
+            <w:r>
+              <w:t xml:space="preserve"> </w:t>
+            </w:r>
+            <w:r>
+              <w:rPr>
+                <w:b/>
+                <w:bCs/>
+              </w:rPr>
+              <w:t xml:space="preserve">match</w:t>
+            </w:r>
+          </w:p>
+        </w:tc>
+        <w:tc>
+          <w:tcPr/>
+          <w:p>
+            <w:pPr>
+              <w:pStyle w:val="Compact"/>
+            </w:pPr>
+            <w:r>
+              <w:t xml:space="preserve">indexer</w:t>
+            </w:r>
+            <w:r>
+              <w:t xml:space="preserve"> </w:t>
+            </w:r>
+            <w:r>
+              <w:rPr>
+                <w:b/>
+                <w:bCs/>
+              </w:rPr>
+              <w:t xml:space="preserve">miss</w:t>
+            </w:r>
+          </w:p>
+        </w:tc>
+        <w:tc>
+          <w:tcPr/>
+          <w:p>
+            <w:pPr>
+              <w:pStyle w:val="Compact"/>
+            </w:pPr>
+            <w:r>
+              <w:t xml:space="preserve">row total</w:t>
+            </w:r>
+          </w:p>
+        </w:tc>
+      </w:tr>
+      <w:tr>
+        <w:tc>
+          <w:tcPr/>
+          <w:p>
+            <w:pPr>
+              <w:pStyle w:val="Compact"/>
+            </w:pPr>
+            <w:r>
+              <w:rPr>
+                <w:b/>
+                <w:bCs/>
+              </w:rPr>
+              <w:t xml:space="preserve">learned match</w:t>
+            </w:r>
+          </w:p>
+        </w:tc>
+        <w:tc>
+          <w:tcPr/>
+          <w:p>
+            <w:pPr>
+              <w:pStyle w:val="Compact"/>
+            </w:pPr>
+            <w:r>
+              <w:t xml:space="preserve">0</w:t>
+            </w:r>
+          </w:p>
+        </w:tc>
+        <w:tc>
+          <w:tcPr/>
+          <w:p>
+            <w:pPr>
+              <w:pStyle w:val="Compact"/>
+            </w:pPr>
+            <w:r>
+              <w:t xml:space="preserve">0</w:t>
+            </w:r>
+          </w:p>
+        </w:tc>
+        <w:tc>
+          <w:tcPr/>
+          <w:p>
+            <w:pPr>
+              <w:pStyle w:val="Compact"/>
+            </w:pPr>
+            <w:r>
+              <w:t xml:space="preserve">0</w:t>
+            </w:r>
+          </w:p>
+        </w:tc>
+      </w:tr>
+      <w:tr>
+        <w:tc>
+          <w:tcPr/>
+          <w:p>
+            <w:pPr>
+              <w:pStyle w:val="Compact"/>
+            </w:pPr>
+            <w:r>
+              <w:rPr>
+                <w:b/>
+                <w:bCs/>
+              </w:rPr>
+              <w:t xml:space="preserve">learned miss</w:t>
+            </w:r>
+          </w:p>
+        </w:tc>
+        <w:tc>
+          <w:tcPr/>
+          <w:p>
+            <w:pPr>
+              <w:pStyle w:val="Compact"/>
+            </w:pPr>
+            <w:r>
+              <w:t xml:space="preserve">27</w:t>
+            </w:r>
+          </w:p>
+        </w:tc>
+        <w:tc>
+          <w:tcPr/>
+          <w:p>
+            <w:pPr>
+              <w:pStyle w:val="Compact"/>
+            </w:pPr>
+            <w:r>
+              <w:t xml:space="preserve">1 922</w:t>
+            </w:r>
+          </w:p>
+        </w:tc>
+        <w:tc>
+          <w:tcPr/>
+          <w:p>
+            <w:pPr>
+              <w:pStyle w:val="Compact"/>
+            </w:pPr>
+            <w:r>
+              <w:t xml:space="preserve">1 949</w:t>
+            </w:r>
+          </w:p>
+        </w:tc>
+      </w:tr>
+      <w:tr>
+        <w:tc>
+          <w:tcPr/>
+          <w:p>
+            <w:pPr>
+              <w:pStyle w:val="Compact"/>
+            </w:pPr>
+            <w:r>
+              <w:rPr>
+                <w:b/>
+                <w:bCs/>
+              </w:rPr>
+              <w:t xml:space="preserve">col total</w:t>
+            </w:r>
+          </w:p>
+        </w:tc>
+        <w:tc>
+          <w:tcPr/>
+          <w:p>
+            <w:pPr>
+              <w:pStyle w:val="Compact"/>
+            </w:pPr>
+            <w:r>
+              <w:t xml:space="preserve">27</w:t>
+            </w:r>
+          </w:p>
+        </w:tc>
+        <w:tc>
+          <w:tcPr/>
+          <w:p>
+            <w:pPr>
+              <w:pStyle w:val="Compact"/>
+            </w:pPr>
+            <w:r>
+              <w:t xml:space="preserve">1 922</w:t>
+            </w:r>
+          </w:p>
+        </w:tc>
+        <w:tc>
+          <w:tcPr/>
+          <w:p>
+            <w:pPr>
+              <w:pStyle w:val="Compact"/>
+            </w:pPr>
+            <w:r>
+              <w:t xml:space="preserve">1 949</w:t>
+            </w:r>
+          </w:p>
+        </w:tc>
+      </w:tr>
+    </w:tbl>
+    <w:p>
+      <w:pPr>
+        <w:pStyle w:val="BodyText"/>
+      </w:pPr>
+      <w:r>
+        <w:t xml:space="preserve">The discordant cells are</w:t>
       </w:r>
       <w:r>
         <w:t xml:space="preserve"> </w:t>
@@ -7300,13 +7526,29 @@
           <w:i/>
           <w:iCs/>
         </w:rPr>
-        <w:t xml:space="preserve">zero</w:t>
-      </w:r>
-      <w:r>
-        <w:t xml:space="preserve"> </w:t>
-      </w:r>
-      <w:r>
-        <w:t xml:space="preserve">broken in the other direction. (The single-seed 1.0 % learned-head figure in Table 2 is within run-to-run noise of zero; across three fresh seeds the learned lattice head matched nothing.) The gain does</w:t>
+        <w:t xml:space="preserve">b</w:t>
+      </w:r>
+      <w:r>
+        <w:t xml:space="preserve"> </w:t>
+      </w:r>
+      <w:r>
+        <w:t xml:space="preserve">= 27 (indexer fixes),</w:t>
+      </w:r>
+      <w:r>
+        <w:t xml:space="preserve"> </w:t>
+      </w:r>
+      <w:r>
+        <w:rPr>
+          <w:i/>
+          <w:iCs/>
+        </w:rPr>
+        <w:t xml:space="preserve">c</w:t>
+      </w:r>
+      <w:r>
+        <w:t xml:space="preserve"> </w:t>
+      </w:r>
+      <w:r>
+        <w:t xml:space="preserve">= 0 (indexer breaks); an exact two-sided McNemar test gives</w:t>
       </w:r>
       <w:r>
         <w:t xml:space="preserve"> </w:t>
@@ -7316,13 +7558,26 @@
           <w:b/>
           <w:bCs/>
         </w:rPr>
+        <w:t xml:space="preserve">p = 1.5 × 10⁻⁸</w:t>
+      </w:r>
+      <w:r>
+        <w:t xml:space="preserve">. (Marginal match counts differ — indexer 46 / 3 000, learned 0 / 1 949 — because 19 further indexer matches fall on structures the learned arm could not score; these do not enter the paired test.) The single-seed 1.0 % learned-head figure in Table 2 is within run-to-run noise of zero; across three fresh seeds the learned lattice head matched nothing. The gain does</w:t>
+      </w:r>
+      <w:r>
+        <w:t xml:space="preserve"> </w:t>
+      </w:r>
+      <w:r>
+        <w:rPr>
+          <w:b/>
+          <w:bCs/>
+        </w:rPr>
         <w:t xml:space="preserve">not</w:t>
       </w:r>
       <w:r>
         <w:t xml:space="preserve"> </w:t>
       </w:r>
       <w:r>
-        <w:t xml:space="preserve">carry to the stricter all-correct metric, where the paired test is not significant (4 vs 0 discordant, p = 0.13) — the indexer fixes the cell but not the space group. So the drop-in reproducibly improves match rate over the learned lattice head; the</w:t>
+        <w:t xml:space="preserve">carry to the stricter all-correct metric: there the discordant cells are</w:t>
       </w:r>
       <w:r>
         <w:t xml:space="preserve"> </w:t>
@@ -7332,13 +7587,58 @@
           <w:i/>
           <w:iCs/>
         </w:rPr>
+        <w:t xml:space="preserve">b</w:t>
+      </w:r>
+      <w:r>
+        <w:t xml:space="preserve"> </w:t>
+      </w:r>
+      <w:r>
+        <w:t xml:space="preserve">= 4,</w:t>
+      </w:r>
+      <w:r>
+        <w:t xml:space="preserve"> </w:t>
+      </w:r>
+      <w:r>
+        <w:rPr>
+          <w:i/>
+          <w:iCs/>
+        </w:rPr>
+        <w:t xml:space="preserve">c</w:t>
+      </w:r>
+      <w:r>
+        <w:t xml:space="preserve"> </w:t>
+      </w:r>
+      <w:r>
+        <w:t xml:space="preserve">= 0 (exact McNemar</w:t>
+      </w:r>
+      <w:r>
+        <w:t xml:space="preserve"> </w:t>
+      </w:r>
+      <w:r>
+        <w:rPr>
+          <w:b/>
+          <w:bCs/>
+        </w:rPr>
+        <w:t xml:space="preserve">p = 0.13</w:t>
+      </w:r>
+      <w:r>
+        <w:t xml:space="preserve">) — the indexer fixes the cell but not the space group. So the drop-in reproducibly improves match rate over the learned lattice head; the</w:t>
+      </w:r>
+      <w:r>
+        <w:t xml:space="preserve"> </w:t>
+      </w:r>
+      <w:r>
+        <w:rPr>
+          <w:i/>
+          <w:iCs/>
+        </w:rPr>
         <w:t xml:space="preserve">mechanism</w:t>
       </w:r>
       <w:r>
         <w:t xml:space="preserve"> </w:t>
       </w:r>
       <w:r>
-        <w:t xml:space="preserve">(§5.5) is that its gains come entirely from high-symmetry systems where the indexer’s cell error falls below the 0.5 Å sensitivity knee, with low-symmetry contributing nothing.</w:t>
+        <w:t xml:space="preserve">(§5.5, §5.6) is that its gains come entirely from high-symmetry systems where the indexer’s cell error falls below the 0.5 Å sensitivity knee, with low-symmetry contributing nothing.</w:t>
       </w:r>
     </w:p>
     <w:p>
@@ -7439,15 +7739,6 @@
         <w:pStyle w:val="Heading3"/>
       </w:pPr>
       <w:r>
-        <w:rPr>
-          <w:rStyle w:val="SectionNumber"/>
-        </w:rPr>
-        <w:t xml:space="preserve">1.6.3</w:t>
-      </w:r>
-      <w:r>
-        <w:tab/>
-      </w:r>
-      <w:r>
         <w:t xml:space="preserve">5.3 Head-to-head with external baselines</w:t>
       </w:r>
     </w:p>
@@ -7933,6 +8224,97 @@
       </w:r>
       <w:r>
         <w:t xml:space="preserve">is heavy-tailed for us and tight-near-zero for both baselines, suggesting our matches are tolerance-stretch rather than coordinate recovery.</w:t>
+      </w:r>
+    </w:p>
+    <w:p>
+      <w:pPr>
+        <w:pStyle w:val="BodyText"/>
+      </w:pPr>
+      <w:r>
+        <w:rPr>
+          <w:b/>
+          <w:bCs/>
+        </w:rPr>
+        <w:t xml:space="preserve">The gap is capability and compute, not input information.</w:t>
+      </w:r>
+      <w:r>
+        <w:t xml:space="preserve"> </w:t>
+      </w:r>
+      <w:r>
+        <w:t xml:space="preserve">All three systems are given the same chemistry (composition/formula; §3.1), so it is worth checking whether the 12–19× gap could instead be an artefact of one model being handed a richer</w:t>
+      </w:r>
+      <w:r>
+        <w:t xml:space="preserve"> </w:t>
+      </w:r>
+      <w:r>
+        <w:rPr>
+          <w:i/>
+          <w:iCs/>
+        </w:rPr>
+        <w:t xml:space="preserve">pattern</w:t>
+      </w:r>
+      <w:r>
+        <w:t xml:space="preserve">. It is not — if anything the asymmetry runs the other way. DiffractGPT is conditioned on a</w:t>
+      </w:r>
+      <w:r>
+        <w:t xml:space="preserve"> </w:t>
+      </w:r>
+      <w:r>
+        <w:rPr>
+          <w:b/>
+          <w:bCs/>
+        </w:rPr>
+        <w:t xml:space="preserve">coarse 300-bin pattern</w:t>
+      </w:r>
+      <w:r>
+        <w:t xml:space="preserve"> </w:t>
+      </w:r>
+      <w:r>
+        <w:t xml:space="preserve">(2θ ∈ [0, 90°], 0.3° bins, rendered as a</w:t>
+      </w:r>
+      <w:r>
+        <w:t xml:space="preserve"> </w:t>
+      </w:r>
+      <w:r>
+        <w:rPr>
+          <w:rStyle w:val="VerbatimChar"/>
+        </w:rPr>
+        <w:t xml:space="preserve">;</w:t>
+      </w:r>
+      <w:r>
+        <w:t xml:space="preserve">-separated string) — an order of magnitude lower resolution than PXRD-Diff’s 4 251-bin 0.02° input — yet it still reaches 18.9 %. So the baselines do not win by seeing more of the pattern. The asymmetries that do matter are</w:t>
+      </w:r>
+      <w:r>
+        <w:t xml:space="preserve"> </w:t>
+      </w:r>
+      <w:r>
+        <w:rPr>
+          <w:b/>
+          <w:bCs/>
+        </w:rPr>
+        <w:t xml:space="preserve">capacity</w:t>
+      </w:r>
+      <w:r>
+        <w:t xml:space="preserve"> </w:t>
+      </w:r>
+      <w:r>
+        <w:t xml:space="preserve">(DiffractGPT is a 7 B-parameter LLM; PXRD-Diff is 3.7 M — three orders of magnitude) and</w:t>
+      </w:r>
+      <w:r>
+        <w:t xml:space="preserve"> </w:t>
+      </w:r>
+      <w:r>
+        <w:rPr>
+          <w:b/>
+          <w:bCs/>
+        </w:rPr>
+        <w:t xml:space="preserve">inference compute</w:t>
+      </w:r>
+      <w:r>
+        <w:t xml:space="preserve"> </w:t>
+      </w:r>
+      <w:r>
+        <w:t xml:space="preserve">(PXRDnet’s ~35 k-op latent optimisation vs our single DDIM pass). The honest reading of Table 3 is therefore a capability/compute gap at fixed input information, not an input-handicap artefact; it is exactly the gap a deliberately small diagnostic model is expected to exhibit (§6).</w:t>
       </w:r>
     </w:p>
     <w:bookmarkStart w:id="61" w:name="fig:threeway"/>
@@ -8052,15 +8434,6 @@
         <w:pStyle w:val="Heading3"/>
       </w:pPr>
       <w:r>
-        <w:rPr>
-          <w:rStyle w:val="SectionNumber"/>
-        </w:rPr>
-        <w:t xml:space="preserve">1.6.4</w:t>
-      </w:r>
-      <w:r>
-        <w:tab/>
-      </w:r>
-      <w:r>
         <w:t xml:space="preserve">5.4 What did</w:t>
       </w:r>
       <w:r>
@@ -8454,15 +8827,6 @@
         <w:pStyle w:val="Heading3"/>
       </w:pPr>
       <w:r>
-        <w:rPr>
-          <w:rStyle w:val="SectionNumber"/>
-        </w:rPr>
-        <w:t xml:space="preserve">1.6.5</w:t>
-      </w:r>
-      <w:r>
-        <w:tab/>
-      </w:r>
-      <w:r>
         <w:t xml:space="preserve">5.5 Encoder-bottleneck perturbation study</w:t>
       </w:r>
     </w:p>
@@ -8504,7 +8868,7 @@
         <w:t xml:space="preserve"> </w:t>
       </w:r>
       <w:r>
-        <w:t xml:space="preserve">only) reaches loss 0.007: the global encoding</w:t>
+        <w:t xml:space="preserve">only) reaches a 0.007</w:t>
       </w:r>
       <w:r>
         <w:t xml:space="preserve"> </w:t>
@@ -8514,13 +8878,29 @@
           <w:i/>
           <w:iCs/>
         </w:rPr>
-        <w:t xml:space="preserve">contains</w:t>
-      </w:r>
-      <w:r>
-        <w:t xml:space="preserve"> </w:t>
-      </w:r>
-      <w:r>
-        <w:t xml:space="preserve">the lattice signal, the denoiser under-uses it.</w:t>
+        <w:t xml:space="preserve">normalised</w:t>
+      </w:r>
+      <w:r>
+        <w:t xml:space="preserve"> </w:t>
+      </w:r>
+      <w:r>
+        <w:t xml:space="preserve">lattice-regression loss — but that figure is a relative fit that does</w:t>
+      </w:r>
+      <w:r>
+        <w:t xml:space="preserve"> </w:t>
+      </w:r>
+      <w:r>
+        <w:rPr>
+          <w:b/>
+          <w:bCs/>
+        </w:rPr>
+        <w:t xml:space="preserve">not</w:t>
+      </w:r>
+      <w:r>
+        <w:t xml:space="preserve"> </w:t>
+      </w:r>
+      <w:r>
+        <w:t xml:space="preserve">survive conversion to absolute scale: when the aux head’s own lattice is substituted into the sampler it recovers only 1.2 % (§5.6), because its 1.1 Å length MAE shifts every Bragg reflection by ~15 %. So the global encoding carries crystal-system and relative-spacing structure but not absolute d-spacings at the &lt;0.5 Å precision the knee demands; the limiter is the pooled encoding, not merely the denoiser’s use of it.</w:t>
       </w:r>
     </w:p>
     <w:p>
@@ -8545,6 +8925,300 @@
       </w:r>
       <w:r>
         <w:t xml:space="preserve">— it works where it can.</w:t>
+      </w:r>
+    </w:p>
+    <w:bookmarkEnd w:id="69"/>
+    <w:bookmarkStart w:id="70" w:name="Xe14ee5fe759b907ea0190421ae7272432ef5613"/>
+    <w:p>
+      <w:pPr>
+        <w:pStyle w:val="Heading3"/>
+      </w:pPr>
+      <w:r>
+        <w:t xml:space="preserve">5.6 Why the learned lattice fails: a pooling bottleneck, not a head bottleneck</w:t>
+      </w:r>
+    </w:p>
+    <w:p>
+      <w:pPr>
+        <w:pStyle w:val="FirstParagraph"/>
+      </w:pPr>
+      <w:r>
+        <w:t xml:space="preserve">The natural reading of the 0.007 aux loss — that the lattice is already recoverable from the encoder and only the denoiser is at fault — is testable, and it is wrong. Two experiments (released as</w:t>
+      </w:r>
+      <w:r>
+        <w:t xml:space="preserve"> </w:t>
+      </w:r>
+      <w:r>
+        <w:rPr>
+          <w:rStyle w:val="VerbatimChar"/>
+        </w:rPr>
+        <w:t xml:space="preserve">paper/phase5_results/</w:t>
+      </w:r>
+      <w:r>
+        <w:t xml:space="preserve"> </w:t>
+      </w:r>
+      <w:r>
+        <w:t xml:space="preserve">and</w:t>
+      </w:r>
+      <w:r>
+        <w:t xml:space="preserve"> </w:t>
+      </w:r>
+      <w:r>
+        <w:rPr>
+          <w:rStyle w:val="VerbatimChar"/>
+        </w:rPr>
+        <w:t xml:space="preserve">paper/phase5b6_results/</w:t>
+      </w:r>
+      <w:r>
+        <w:t xml:space="preserve">) promote the auxiliary head from a training-time regulariser to the inference-time lattice source and measure what it actually delivers.</w:t>
+      </w:r>
+    </w:p>
+    <w:p>
+      <w:pPr>
+        <w:pStyle w:val="BodyText"/>
+      </w:pPr>
+      <w:r>
+        <w:rPr>
+          <w:b/>
+          <w:bCs/>
+        </w:rPr>
+        <w:t xml:space="preserve">Aux head as lattice predictor (no retrain).</w:t>
+      </w:r>
+      <w:r>
+        <w:t xml:space="preserve"> </w:t>
+      </w:r>
+      <w:r>
+        <w:t xml:space="preserve">Substituting the v13 aux head’s predicted</w:t>
+      </w:r>
+      <w:r>
+        <w:t xml:space="preserve"> </w:t>
+      </w:r>
+      <m:oMath>
+        <m:r>
+          <m:rPr>
+            <m:sty m:val="p"/>
+          </m:rPr>
+          <m:t>(</m:t>
+        </m:r>
+        <m:r>
+          <m:t>a</m:t>
+        </m:r>
+        <m:r>
+          <m:rPr>
+            <m:sty m:val="p"/>
+          </m:rPr>
+          <m:t>,</m:t>
+        </m:r>
+        <m:r>
+          <m:t>b</m:t>
+        </m:r>
+        <m:r>
+          <m:rPr>
+            <m:sty m:val="p"/>
+          </m:rPr>
+          <m:t>,</m:t>
+        </m:r>
+        <m:r>
+          <m:t>c</m:t>
+        </m:r>
+        <m:r>
+          <m:rPr>
+            <m:sty m:val="p"/>
+          </m:rPr>
+          <m:t>,</m:t>
+        </m:r>
+        <m:r>
+          <m:t>α</m:t>
+        </m:r>
+        <m:r>
+          <m:rPr>
+            <m:sty m:val="p"/>
+          </m:rPr>
+          <m:t>,</m:t>
+        </m:r>
+        <m:r>
+          <m:t>β</m:t>
+        </m:r>
+        <m:r>
+          <m:rPr>
+            <m:sty m:val="p"/>
+          </m:rPr>
+          <m:t>,</m:t>
+        </m:r>
+        <m:r>
+          <m:t>γ</m:t>
+        </m:r>
+        <m:r>
+          <m:rPr>
+            <m:sty m:val="p"/>
+          </m:rPr>
+          <m:t>)</m:t>
+        </m:r>
+      </m:oMath>
+      <w:r>
+        <w:t xml:space="preserve"> </w:t>
+      </w:r>
+      <w:r>
+        <w:t xml:space="preserve">for the sampled lattice channel at n = 1 000 gives a length MAE of (1.12, 1.02, 1.38) Å and an angle MAE of (13.0°, 11.9°, 17.6°) at</w:t>
+      </w:r>
+      <w:r>
+        <w:t xml:space="preserve"> </w:t>
+      </w:r>
+      <w:r>
+        <w:rPr>
+          <w:b/>
+          <w:bCs/>
+        </w:rPr>
+        <w:t xml:space="preserve">99.8 %</w:t>
+      </w:r>
+      <w:r>
+        <w:t xml:space="preserve"> </w:t>
+      </w:r>
+      <w:r>
+        <w:t xml:space="preserve">cell validity — far better conditioned than the diffusion sampler, whose predicted cells are near-0 % valid, but still ~15 % relative length error. End-to-end this recovers</w:t>
+      </w:r>
+      <w:r>
+        <w:t xml:space="preserve"> </w:t>
+      </w:r>
+      <w:r>
+        <w:rPr>
+          <w:b/>
+          <w:bCs/>
+        </w:rPr>
+        <w:t xml:space="preserve">1.2 %</w:t>
+      </w:r>
+      <w:r>
+        <w:t xml:space="preserve"> </w:t>
+      </w:r>
+      <w:r>
+        <w:t xml:space="preserve">match (1.3 % with Phase 4 ensembling + coordinate refinement) and 0.0 % all-correct, with pattern Pearson collapsing to</w:t>
+      </w:r>
+      <w:r>
+        <w:t xml:space="preserve"> </w:t>
+      </w:r>
+      <w:r>
+        <w:rPr>
+          <w:b/>
+          <w:bCs/>
+        </w:rPr>
+        <w:t xml:space="preserve">0.013</w:t>
+      </w:r>
+      <w:r>
+        <w:t xml:space="preserve">: a 15 % length error shifts every Bragg reflection by a similar fraction in 2θ, so the simulated pattern no longer overlaps the target.</w:t>
+      </w:r>
+    </w:p>
+    <w:p>
+      <w:pPr>
+        <w:pStyle w:val="BodyText"/>
+      </w:pPr>
+      <w:r>
+        <w:rPr>
+          <w:b/>
+          <w:bCs/>
+        </w:rPr>
+        <w:t xml:space="preserve">Stronger, constrained supervision (retrain).</w:t>
+      </w:r>
+      <w:r>
+        <w:t xml:space="preserve"> </w:t>
+      </w:r>
+      <w:r>
+        <w:t xml:space="preserve">Bounding the head (softplus lengths, sigmoid-scaled angles), raising the aux weight 0.5 → 5.0, and warm-starting 30 k further steps leaves the MAE essentially unchanged (a ≈ 1.11 Å, α ≈ 14°). The error is a property of the</w:t>
+      </w:r>
+      <w:r>
+        <w:t xml:space="preserve"> </w:t>
+      </w:r>
+      <w:r>
+        <w:rPr>
+          <w:i/>
+          <w:iCs/>
+        </w:rPr>
+        <w:t xml:space="preserve">pooled global encoding</w:t>
+      </w:r>
+      <w:r>
+        <w:t xml:space="preserve">, not of the head: the</w:t>
+      </w:r>
+      <w:r>
+        <w:t xml:space="preserve"> </w:t>
+      </w:r>
+      <w:r>
+        <w:rPr>
+          <w:rStyle w:val="VerbatimChar"/>
+        </w:rPr>
+        <w:t xml:space="preserve">AdaptiveAvgPool1d(1)</w:t>
+      </w:r>
+      <w:r>
+        <w:t xml:space="preserve"> </w:t>
+      </w:r>
+      <w:r>
+        <w:t xml:space="preserve">collapse that §3.2 already identified for coordinates discards the peak-position fidelity Bragg’s-law decoding needs to fix absolute lengths, and no head reading</w:t>
+      </w:r>
+      <w:r>
+        <w:t xml:space="preserve"> </w:t>
+      </w:r>
+      <m:oMath>
+        <m:r>
+          <m:rPr>
+            <m:sty m:val="bi"/>
+          </m:rPr>
+          <m:t>g</m:t>
+        </m:r>
+      </m:oMath>
+      <w:r>
+        <w:t xml:space="preserve"> </w:t>
+      </w:r>
+      <w:r>
+        <w:t xml:space="preserve">recovers it.</w:t>
+      </w:r>
+    </w:p>
+    <w:p>
+      <w:pPr>
+        <w:pStyle w:val="BodyText"/>
+      </w:pPr>
+      <w:r>
+        <w:t xml:space="preserve">This reconciles the diagnosis with the indexer result. The 0.007 normalised aux loss is a</w:t>
+      </w:r>
+      <w:r>
+        <w:t xml:space="preserve"> </w:t>
+      </w:r>
+      <w:r>
+        <w:rPr>
+          <w:i/>
+          <w:iCs/>
+        </w:rPr>
+        <w:t xml:space="preserve">relative</w:t>
+      </w:r>
+      <w:r>
+        <w:t xml:space="preserve"> </w:t>
+      </w:r>
+      <w:r>
+        <w:t xml:space="preserve">fit — enough to place the crystal system (a space-group head on the same encoder reaches 39 % top-1 / 71 % top-5 across 230 classes, released under</w:t>
+      </w:r>
+      <w:r>
+        <w:t xml:space="preserve"> </w:t>
+      </w:r>
+      <w:r>
+        <w:rPr>
+          <w:rStyle w:val="VerbatimChar"/>
+        </w:rPr>
+        <w:t xml:space="preserve">phase5b6_results/</w:t>
+      </w:r>
+      <w:r>
+        <w:t xml:space="preserve">) but not the absolute scale. The classical autoindexer succeeds exactly where the encoder fails because it reads peak</w:t>
+      </w:r>
+      <w:r>
+        <w:t xml:space="preserve"> </w:t>
+      </w:r>
+      <w:r>
+        <w:rPr>
+          <w:i/>
+          <w:iCs/>
+        </w:rPr>
+        <w:t xml:space="preserve">positions</w:t>
+      </w:r>
+      <w:r>
+        <w:t xml:space="preserve"> </w:t>
+      </w:r>
+      <w:r>
+        <w:t xml:space="preserve">directly rather than a pooled summary; this is why §5.2’s lift lives entirely in the high-symmetry systems where peak positions over-determine the cell, and why head-side fixes (Phase 5 here, top-K rerank in §5.4) cannot substitute for it. The architectural implication is concrete: the next gain must come from the encoder — explicit d-spacing/peak extraction or per-peak attention in place of global pooling — not from a better lattice head or a better denoiser.</w:t>
       </w:r>
     </w:p>
     <w:p>
@@ -8554,22 +9228,13 @@
         </w:pict>
       </w:r>
     </w:p>
-    <w:bookmarkEnd w:id="69"/>
     <w:bookmarkEnd w:id="70"/>
-    <w:bookmarkStart w:id="71" w:name="discussion"/>
+    <w:bookmarkEnd w:id="71"/>
+    <w:bookmarkStart w:id="72" w:name="discussion"/>
     <w:p>
       <w:pPr>
         <w:pStyle w:val="Heading2"/>
       </w:pPr>
-      <w:r>
-        <w:rPr>
-          <w:rStyle w:val="SectionNumber"/>
-        </w:rPr>
-        <w:t xml:space="preserve">1.7</w:t>
-      </w:r>
-      <w:r>
-        <w:tab/>
-      </w:r>
       <w:r>
         <w:t xml:space="preserve">6. Discussion</w:t>
       </w:r>
@@ -8589,24 +9254,7 @@
         <w:t xml:space="preserve"> </w:t>
       </w:r>
       <w:r>
-        <w:t xml:space="preserve">The lattice signal exists in</w:t>
-      </w:r>
-      <w:r>
-        <w:t xml:space="preserve"> </w:t>
-      </w:r>
-      <m:oMath>
-        <m:r>
-          <m:rPr>
-            <m:sty m:val="bi"/>
-          </m:rPr>
-          <m:t>g</m:t>
-        </m:r>
-      </m:oMath>
-      <w:r>
-        <w:t xml:space="preserve"> </w:t>
-      </w:r>
-      <w:r>
-        <w:t xml:space="preserve">(aux loss 0.007) but the denoiser cannot extract absolute d-spacings well enough to predict from scratch; the disjoint oracle-vs-indexer CIs (§5.2) make this the paper’s statistically firmest claim. The Q-space autoindexer recovers part of the 5.6 % oracle ceiling on the high-symmetry subset; top-K rerank and gradient guidance fail because they operate</w:t>
+        <w:t xml:space="preserve">A 0.007</w:t>
       </w:r>
       <w:r>
         <w:t xml:space="preserve"> </w:t>
@@ -8616,13 +9264,59 @@
           <w:i/>
           <w:iCs/>
         </w:rPr>
+        <w:t xml:space="preserve">normalised</w:t>
+      </w:r>
+      <w:r>
+        <w:t xml:space="preserve"> </w:t>
+      </w:r>
+      <w:r>
+        <w:t xml:space="preserve">aux loss shows</w:t>
+      </w:r>
+      <w:r>
+        <w:t xml:space="preserve"> </w:t>
+      </w:r>
+      <m:oMath>
+        <m:r>
+          <m:rPr>
+            <m:sty m:val="bi"/>
+          </m:rPr>
+          <m:t>g</m:t>
+        </m:r>
+      </m:oMath>
+      <w:r>
+        <w:t xml:space="preserve"> </w:t>
+      </w:r>
+      <w:r>
+        <w:t xml:space="preserve">carries lattice-</w:t>
+      </w:r>
+      <w:r>
+        <w:rPr>
+          <w:i/>
+          <w:iCs/>
+        </w:rPr>
+        <w:t xml:space="preserve">relevant</w:t>
+      </w:r>
+      <w:r>
+        <w:t xml:space="preserve"> </w:t>
+      </w:r>
+      <w:r>
+        <w:t xml:space="preserve">structure, but it is a relative fit: feeding the aux head’s own lattice to the sampler recovers only 1.2 % (§5.6), and stronger constrained-head supervision does not move its ~1.1 Å error. The limiter is therefore the global pooling that discards absolute peak-position fidelity, not the denoiser’s use of an otherwise-adequate signal; the disjoint oracle-vs-indexer CIs (§5.2) make the lattice’s role the paper’s statistically firmest claim. The Q-space autoindexer, which reads peak positions directly, recovers part of the 5.6 % oracle ceiling on the high-symmetry subset; top-K rerank and gradient guidance fail because they operate</w:t>
+      </w:r>
+      <w:r>
+        <w:t xml:space="preserve"> </w:t>
+      </w:r>
+      <w:r>
+        <w:rPr>
+          <w:i/>
+          <w:iCs/>
+        </w:rPr>
         <w:t xml:space="preserve">after</w:t>
       </w:r>
       <w:r>
         <w:t xml:space="preserve"> </w:t>
       </w:r>
       <w:r>
-        <w:t xml:space="preserve">the encoder commits to a bad lattice prior, while the indexer bypasses that decision.</w:t>
+        <w:t xml:space="preserve">the encoder commits to a bad lattice prior, while the indexer bypasses that decision. (The oracle ceiling is itself only 5.6 %, so even a perfect lattice leaves coordinates as a co-limiter — see §8.)</w:t>
       </w:r>
     </w:p>
     <w:p>
@@ -8776,21 +9470,12 @@
         </w:pict>
       </w:r>
     </w:p>
-    <w:bookmarkEnd w:id="71"/>
-    <w:bookmarkStart w:id="72" w:name="limitations"/>
+    <w:bookmarkEnd w:id="72"/>
+    <w:bookmarkStart w:id="73" w:name="limitations"/>
     <w:p>
       <w:pPr>
         <w:pStyle w:val="Heading2"/>
       </w:pPr>
-      <w:r>
-        <w:rPr>
-          <w:rStyle w:val="SectionNumber"/>
-        </w:rPr>
-        <w:t xml:space="preserve">1.8</w:t>
-      </w:r>
-      <w:r>
-        <w:tab/>
-      </w:r>
       <w:r>
         <w:t xml:space="preserve">7. Limitations</w:t>
       </w:r>
@@ -8874,13 +9559,45 @@
           <w:b/>
           <w:bCs/>
         </w:rPr>
-        <w:t xml:space="preserve">Indexer.</w:t>
-      </w:r>
-      <w:r>
-        <w:t xml:space="preserve"> </w:t>
-      </w:r>
-      <w:r>
-        <w:t xml:space="preserve">GSAS-II low-symmetry path hangs in</w:t>
+        <w:t xml:space="preserve">Indexer realism.</w:t>
+      </w:r>
+      <w:r>
+        <w:t xml:space="preserve"> </w:t>
+      </w:r>
+      <w:r>
+        <w:t xml:space="preserve">Two assumptions make the indexer’s accuracy an optimistic ceiling. (i)</w:t>
+      </w:r>
+      <w:r>
+        <w:t xml:space="preserve"> </w:t>
+      </w:r>
+      <w:r>
+        <w:rPr>
+          <w:i/>
+          <w:iCs/>
+        </w:rPr>
+        <w:t xml:space="preserve">Crystal system is given.</w:t>
+      </w:r>
+      <w:r>
+        <w:t xml:space="preserve"> </w:t>
+      </w:r>
+      <w:r>
+        <w:t xml:space="preserve">The de-Wolff fit (§3.5) receives the true Bravais code as a sampling-time input; on a real unknown the system is itself part of what indexing must determine, so the per-system rates of §3.5 are conditional on knowing the system. (ii)</w:t>
+      </w:r>
+      <w:r>
+        <w:t xml:space="preserve"> </w:t>
+      </w:r>
+      <w:r>
+        <w:rPr>
+          <w:i/>
+          <w:iCs/>
+        </w:rPr>
+        <w:t xml:space="preserve">Patterns are ideal.</w:t>
+      </w:r>
+      <w:r>
+        <w:t xml:space="preserve"> </w:t>
+      </w:r>
+      <w:r>
+        <w:t xml:space="preserve">All patterns are clean</w:t>
       </w:r>
       <w:r>
         <w:t xml:space="preserve"> </w:t>
@@ -8889,28 +9606,13 @@
         <w:rPr>
           <w:rStyle w:val="VerbatimChar"/>
         </w:rPr>
-        <w:t xml:space="preserve">findBestCell</w:t>
-      </w:r>
-      <w:r>
-        <w:t xml:space="preserve"> </w:t>
-      </w:r>
-      <w:r>
-        <w:t xml:space="preserve">on real MP-20 mono/tri patterns; shipped behind</w:t>
-      </w:r>
-      <w:r>
-        <w:t xml:space="preserve"> </w:t>
-      </w:r>
-      <w:r>
-        <w:rPr>
-          <w:rStyle w:val="VerbatimChar"/>
-        </w:rPr>
-        <w:t xml:space="preserve">--use-gsas</w:t>
-      </w:r>
-      <w:r>
-        <w:t xml:space="preserve"> </w:t>
-      </w:r>
-      <w:r>
-        <w:t xml:space="preserve">but experimental.</w:t>
+        <w:t xml:space="preserve">pymatgen</w:t>
+      </w:r>
+      <w:r>
+        <w:t xml:space="preserve"> </w:t>
+      </w:r>
+      <w:r>
+        <w:t xml:space="preserve">simulations with no zero-point shift, sample-displacement error, or peak asymmetry — precisely the perturbations that drive real-world indexing failure. The 48.8 % native-indexer match and the downstream 1.5 % should be read as upper bounds under ideal peak positions; we did not measure degradation under a zero-shift/displacement perturbation, which is the natural robustness check.</w:t>
       </w:r>
     </w:p>
     <w:p>
@@ -8926,6 +9628,58 @@
           <w:b/>
           <w:bCs/>
         </w:rPr>
+        <w:t xml:space="preserve">Indexer (low-symmetry path).</w:t>
+      </w:r>
+      <w:r>
+        <w:t xml:space="preserve"> </w:t>
+      </w:r>
+      <w:r>
+        <w:t xml:space="preserve">GSAS-II low-symmetry path hangs in</w:t>
+      </w:r>
+      <w:r>
+        <w:t xml:space="preserve"> </w:t>
+      </w:r>
+      <w:r>
+        <w:rPr>
+          <w:rStyle w:val="VerbatimChar"/>
+        </w:rPr>
+        <w:t xml:space="preserve">findBestCell</w:t>
+      </w:r>
+      <w:r>
+        <w:t xml:space="preserve"> </w:t>
+      </w:r>
+      <w:r>
+        <w:t xml:space="preserve">on real MP-20 mono/tri patterns; shipped behind</w:t>
+      </w:r>
+      <w:r>
+        <w:t xml:space="preserve"> </w:t>
+      </w:r>
+      <w:r>
+        <w:rPr>
+          <w:rStyle w:val="VerbatimChar"/>
+        </w:rPr>
+        <w:t xml:space="preserve">--use-gsas</w:t>
+      </w:r>
+      <w:r>
+        <w:t xml:space="preserve"> </w:t>
+      </w:r>
+      <w:r>
+        <w:t xml:space="preserve">but experimental.</w:t>
+      </w:r>
+    </w:p>
+    <w:p>
+      <w:pPr>
+        <w:pStyle w:val="Compact"/>
+        <w:numPr>
+          <w:ilvl w:val="0"/>
+          <w:numId w:val="1002"/>
+        </w:numPr>
+      </w:pPr>
+      <w:r>
+        <w:rPr>
+          <w:b/>
+          <w:bCs/>
+        </w:rPr>
         <w:t xml:space="preserve">Training.</w:t>
       </w:r>
       <w:r>
@@ -8942,21 +9696,12 @@
         </w:pict>
       </w:r>
     </w:p>
-    <w:bookmarkEnd w:id="72"/>
-    <w:bookmarkStart w:id="73" w:name="conclusion"/>
+    <w:bookmarkEnd w:id="73"/>
+    <w:bookmarkStart w:id="74" w:name="conclusion"/>
     <w:p>
       <w:pPr>
         <w:pStyle w:val="Heading2"/>
       </w:pPr>
-      <w:r>
-        <w:rPr>
-          <w:rStyle w:val="SectionNumber"/>
-        </w:rPr>
-        <w:t xml:space="preserve">1.9</w:t>
-      </w:r>
-      <w:r>
-        <w:tab/>
-      </w:r>
       <w:r>
         <w:t xml:space="preserve">8. Conclusion</w:t>
       </w:r>
@@ -8991,22 +9736,13 @@
         </w:pict>
       </w:r>
     </w:p>
-    <w:bookmarkEnd w:id="73"/>
-    <w:bookmarkStart w:id="74" w:name="acknowledgments"/>
+    <w:bookmarkEnd w:id="74"/>
+    <w:bookmarkStart w:id="75" w:name="acknowledgments"/>
     <w:p>
       <w:pPr>
         <w:pStyle w:val="Heading2"/>
       </w:pPr>
       <w:r>
-        <w:rPr>
-          <w:rStyle w:val="SectionNumber"/>
-        </w:rPr>
-        <w:t xml:space="preserve">1.10</w:t>
-      </w:r>
-      <w:r>
-        <w:tab/>
-      </w:r>
-      <w:r>
         <w:t xml:space="preserve">Acknowledgments</w:t>
       </w:r>
     </w:p>
@@ -9060,22 +9796,13 @@
         <w:t xml:space="preserve">) for releasing checkpoints and code that made the head-to-head reproduction in §5.3 possible. Compute was rented from Vast.ai; total spend was approximately USD 25 across roughly 30 GPU-hours on RTX 5090 instances (Phase 4 ablation, Phase 9 retrain + indexer sweeps, DiffractGPT n = 1 000 inference, and PXRDnet n = 20 inference).</w:t>
       </w:r>
     </w:p>
-    <w:bookmarkEnd w:id="74"/>
-    <w:bookmarkStart w:id="75" w:name="author-contributions-credit"/>
+    <w:bookmarkEnd w:id="75"/>
+    <w:bookmarkStart w:id="76" w:name="author-contributions-credit"/>
     <w:p>
       <w:pPr>
         <w:pStyle w:val="Heading2"/>
       </w:pPr>
       <w:r>
-        <w:rPr>
-          <w:rStyle w:val="SectionNumber"/>
-        </w:rPr>
-        <w:t xml:space="preserve">1.11</w:t>
-      </w:r>
-      <w:r>
-        <w:tab/>
-      </w:r>
-      <w:r>
         <w:t xml:space="preserve">Author Contributions (CRediT)</w:t>
       </w:r>
     </w:p>
@@ -9087,22 +9814,13 @@
         <w:t xml:space="preserve">F. Cai: Conceptualization, Methodology, Software, Validation, Formal analysis, Investigation, Data curation, Writing — Original Draft, Writing — Review &amp; Editing, Visualization, Project administration.</w:t>
       </w:r>
     </w:p>
-    <w:bookmarkEnd w:id="75"/>
-    <w:bookmarkStart w:id="76" w:name="conflict-of-interest"/>
+    <w:bookmarkEnd w:id="76"/>
+    <w:bookmarkStart w:id="77" w:name="conflict-of-interest"/>
     <w:p>
       <w:pPr>
         <w:pStyle w:val="Heading2"/>
       </w:pPr>
       <w:r>
-        <w:rPr>
-          <w:rStyle w:val="SectionNumber"/>
-        </w:rPr>
-        <w:t xml:space="preserve">1.12</w:t>
-      </w:r>
-      <w:r>
-        <w:tab/>
-      </w:r>
-      <w:r>
         <w:t xml:space="preserve">Conflict of Interest</w:t>
       </w:r>
     </w:p>
@@ -9114,22 +9832,13 @@
         <w:t xml:space="preserve">The author declares no competing interests.</w:t>
       </w:r>
     </w:p>
-    <w:bookmarkEnd w:id="76"/>
-    <w:bookmarkStart w:id="77" w:name="funding"/>
+    <w:bookmarkEnd w:id="77"/>
+    <w:bookmarkStart w:id="78" w:name="funding"/>
     <w:p>
       <w:pPr>
         <w:pStyle w:val="Heading2"/>
       </w:pPr>
       <w:r>
-        <w:rPr>
-          <w:rStyle w:val="SectionNumber"/>
-        </w:rPr>
-        <w:t xml:space="preserve">1.13</w:t>
-      </w:r>
-      <w:r>
-        <w:tab/>
-      </w:r>
-      <w:r>
         <w:t xml:space="preserve">Funding</w:t>
       </w:r>
     </w:p>
@@ -9141,21 +9850,12 @@
         <w:t xml:space="preserve">This research received no external funding.</w:t>
       </w:r>
     </w:p>
-    <w:bookmarkEnd w:id="77"/>
-    <w:bookmarkStart w:id="78" w:name="data-and-code-availability"/>
+    <w:bookmarkEnd w:id="78"/>
+    <w:bookmarkStart w:id="79" w:name="data-and-code-availability"/>
     <w:p>
       <w:pPr>
         <w:pStyle w:val="Heading2"/>
       </w:pPr>
-      <w:r>
-        <w:rPr>
-          <w:rStyle w:val="SectionNumber"/>
-        </w:rPr>
-        <w:t xml:space="preserve">1.14</w:t>
-      </w:r>
-      <w:r>
-        <w:tab/>
-      </w:r>
       <w:r>
         <w:t xml:space="preserve">Data and Code Availability</w:t>
       </w:r>
@@ -9226,21 +9926,12 @@
         <w:t xml:space="preserve">pipeline; per-structure evaluation flags are released to support paired re-analysis.</w:t>
       </w:r>
     </w:p>
-    <w:bookmarkEnd w:id="78"/>
-    <w:bookmarkStart w:id="79" w:name="ethics-declaration"/>
+    <w:bookmarkEnd w:id="79"/>
+    <w:bookmarkStart w:id="80" w:name="ethics-declaration"/>
     <w:p>
       <w:pPr>
         <w:pStyle w:val="Heading2"/>
       </w:pPr>
-      <w:r>
-        <w:rPr>
-          <w:rStyle w:val="SectionNumber"/>
-        </w:rPr>
-        <w:t xml:space="preserve">1.15</w:t>
-      </w:r>
-      <w:r>
-        <w:tab/>
-      </w:r>
       <w:r>
         <w:t xml:space="preserve">Ethics Declaration</w:t>
       </w:r>
@@ -9260,21 +9951,12 @@
         </w:pict>
       </w:r>
     </w:p>
-    <w:bookmarkEnd w:id="79"/>
-    <w:bookmarkStart w:id="80" w:name="references"/>
+    <w:bookmarkEnd w:id="80"/>
+    <w:bookmarkStart w:id="81" w:name="references"/>
     <w:p>
       <w:pPr>
         <w:pStyle w:val="Heading2"/>
       </w:pPr>
-      <w:r>
-        <w:rPr>
-          <w:rStyle w:val="SectionNumber"/>
-        </w:rPr>
-        <w:t xml:space="preserve">1.16</w:t>
-      </w:r>
-      <w:r>
-        <w:tab/>
-      </w:r>
       <w:r>
         <w:t xml:space="preserve">References</w:t>
       </w:r>
@@ -9319,39 +10001,21 @@
         </w:pict>
       </w:r>
     </w:p>
-    <w:bookmarkEnd w:id="80"/>
-    <w:bookmarkStart w:id="85" w:name="appendix"/>
+    <w:bookmarkEnd w:id="81"/>
+    <w:bookmarkStart w:id="86" w:name="appendix"/>
     <w:p>
       <w:pPr>
         <w:pStyle w:val="Heading2"/>
       </w:pPr>
       <w:r>
-        <w:rPr>
-          <w:rStyle w:val="SectionNumber"/>
-        </w:rPr>
-        <w:t xml:space="preserve">1.17</w:t>
-      </w:r>
-      <w:r>
-        <w:tab/>
-      </w:r>
-      <w:r>
         <w:t xml:space="preserve">Appendix</w:t>
       </w:r>
     </w:p>
-    <w:bookmarkStart w:id="81" w:name="a.-full-ablation-history"/>
+    <w:bookmarkStart w:id="82" w:name="a.-full-ablation-history"/>
     <w:p>
       <w:pPr>
         <w:pStyle w:val="Heading3"/>
       </w:pPr>
-      <w:r>
-        <w:rPr>
-          <w:rStyle w:val="SectionNumber"/>
-        </w:rPr>
-        <w:t xml:space="preserve">1.17.1</w:t>
-      </w:r>
-      <w:r>
-        <w:tab/>
-      </w:r>
       <w:r>
         <w:t xml:space="preserve">A. Full ablation history</w:t>
       </w:r>
@@ -10032,7 +10696,7 @@
               <w:pStyle w:val="Compact"/>
             </w:pPr>
             <w:r>
-              <w:t xml:space="preserve">v17 – v20</w:t>
+              <w:t xml:space="preserve">v17</w:t>
             </w:r>
           </w:p>
         </w:tc>
@@ -10054,7 +10718,64 @@
               <w:pStyle w:val="Compact"/>
             </w:pPr>
             <w:r>
-              <w:t xml:space="preserve">Five Phase-9 encoder retrains with different ResNet/Transformer hybrids and pattern-augmentation curricula</w:t>
+              <w:t xml:space="preserve">Phase 5B: constrained lattice head (softplus/sigmoid) + space-group head, aux-weight 5.0, +30 k warm-start steps</w:t>
+            </w:r>
+          </w:p>
+        </w:tc>
+        <w:tc>
+          <w:tcPr/>
+          <w:p>
+            <w:pPr>
+              <w:pStyle w:val="Compact"/>
+            </w:pPr>
+            <w:r>
+              <w:t xml:space="preserve">Lattice MAE unchanged (a ≈ 1.11 Å); SG head 39 % top-1</w:t>
+            </w:r>
+          </w:p>
+        </w:tc>
+        <w:tc>
+          <w:tcPr/>
+          <w:p>
+            <w:pPr>
+              <w:pStyle w:val="Compact"/>
+            </w:pPr>
+            <w:r>
+              <w:t xml:space="preserve">§5.6</w:t>
+            </w:r>
+          </w:p>
+        </w:tc>
+      </w:tr>
+      <w:tr>
+        <w:tc>
+          <w:tcPr/>
+          <w:p>
+            <w:pPr>
+              <w:pStyle w:val="Compact"/>
+            </w:pPr>
+            <w:r>
+              <w:t xml:space="preserve">v18 – v20</w:t>
+            </w:r>
+          </w:p>
+        </w:tc>
+        <w:tc>
+          <w:tcPr/>
+          <w:p>
+            <w:pPr>
+              <w:pStyle w:val="Compact"/>
+            </w:pPr>
+            <w:r>
+              <w:t xml:space="preserve">3.7 M</w:t>
+            </w:r>
+          </w:p>
+        </w:tc>
+        <w:tc>
+          <w:tcPr/>
+          <w:p>
+            <w:pPr>
+              <w:pStyle w:val="Compact"/>
+            </w:pPr>
+            <w:r>
+              <w:t xml:space="preserve">Phase-9 encoder retrains with different ResNet/Transformer hybrids and pattern-augmentation curricula</w:t>
             </w:r>
           </w:p>
         </w:tc>
@@ -10151,22 +10872,13 @@
         </w:tc>
       </w:tr>
     </w:tbl>
-    <w:bookmarkEnd w:id="81"/>
-    <w:bookmarkStart w:id="82" w:name="b.-hyperparameter-sensitivity"/>
+    <w:bookmarkEnd w:id="82"/>
+    <w:bookmarkStart w:id="83" w:name="b.-hyperparameter-sensitivity"/>
     <w:p>
       <w:pPr>
         <w:pStyle w:val="Heading3"/>
       </w:pPr>
       <w:r>
-        <w:rPr>
-          <w:rStyle w:val="SectionNumber"/>
-        </w:rPr>
-        <w:t xml:space="preserve">1.17.2</w:t>
-      </w:r>
-      <w:r>
-        <w:tab/>
-      </w:r>
-      <w:r>
         <w:t xml:space="preserve">B. Hyperparameter sensitivity</w:t>
       </w:r>
     </w:p>
@@ -10208,21 +10920,12 @@
         <w:t xml:space="preserve">showed (256, 3) as a reasonable Pareto point. The Debye loss weight was swept {0, 0.1, 1, 10} in early ε-prediction runs (v6–v9) without measurable effect on match rate; we re-fixed it at 1.0 for the x₀-residual runs by analogy.</w:t>
       </w:r>
     </w:p>
-    <w:bookmarkEnd w:id="82"/>
-    <w:bookmarkStart w:id="83" w:name="X984f5037fa8fa240d4e7791708ee54c226ae797"/>
+    <w:bookmarkEnd w:id="83"/>
+    <w:bookmarkStart w:id="84" w:name="X984f5037fa8fa240d4e7791708ee54c226ae797"/>
     <w:p>
       <w:pPr>
         <w:pStyle w:val="Heading3"/>
       </w:pPr>
-      <w:r>
-        <w:rPr>
-          <w:rStyle w:val="SectionNumber"/>
-        </w:rPr>
-        <w:t xml:space="preserve">1.17.3</w:t>
-      </w:r>
-      <w:r>
-        <w:tab/>
-      </w:r>
       <w:r>
         <w:t xml:space="preserve">C. Differentiable simulator validation details</w:t>
       </w:r>
@@ -10387,21 +11090,12 @@
         <w:t xml:space="preserve">on a 4-atom subset.</w:t>
       </w:r>
     </w:p>
-    <w:bookmarkEnd w:id="83"/>
-    <w:bookmarkStart w:id="84" w:name="d.-reproducibility-checklist"/>
+    <w:bookmarkEnd w:id="84"/>
+    <w:bookmarkStart w:id="85" w:name="d.-reproducibility-checklist"/>
     <w:p>
       <w:pPr>
         <w:pStyle w:val="Heading3"/>
       </w:pPr>
-      <w:r>
-        <w:rPr>
-          <w:rStyle w:val="SectionNumber"/>
-        </w:rPr>
-        <w:t xml:space="preserve">1.17.4</w:t>
-      </w:r>
-      <w:r>
-        <w:tab/>
-      </w:r>
       <w:r>
         <w:t xml:space="preserve">D. Reproducibility checklist</w:t>
       </w:r>
@@ -10478,9 +11172,9 @@
         <w:t xml:space="preserve">Code, checkpoints, logs, and full training scripts released</w:t>
       </w:r>
     </w:p>
-    <w:bookmarkEnd w:id="84"/>
     <w:bookmarkEnd w:id="85"/>
     <w:bookmarkEnd w:id="86"/>
+    <w:bookmarkEnd w:id="87"/>
     <w:sectPr>
       <w:footnotePr>
         <w:numRestart w:val="eachSect"/>

</xml_diff>

<commit_message>
paper: regenerate paper.docx from canonical paper.md — sync Phase-13 content (deCIFer, 4.5% oracle, DOI), em-dash pass, new DD-aligned keywords; PNG figures for Word display
</commit_message>
<xml_diff>
--- a/paper/paper.docx
+++ b/paper/paper.docx
@@ -2,13 +2,12 @@
 <file path=word/document.xml><?xml version="1.0" encoding="utf-8"?>
 <w:document xmlns:w="http://schemas.openxmlformats.org/wordprocessingml/2006/main" xmlns:m="http://schemas.openxmlformats.org/officeDocument/2006/math" xmlns:r="http://schemas.openxmlformats.org/officeDocument/2006/relationships" xmlns:o="urn:schemas-microsoft-com:office:office" xmlns:v="urn:schemas-microsoft-com:vml" xmlns:w10="urn:schemas-microsoft-com:office:word" xmlns:a="http://schemas.openxmlformats.org/drawingml/2006/main" xmlns:pic="http://schemas.openxmlformats.org/drawingml/2006/picture" xmlns:wp="http://schemas.openxmlformats.org/drawingml/2006/wordprocessingDrawing">
   <w:body>
-    <w:bookmarkStart w:id="87" w:name="X2ddac61a38ed9c25ada36f223803948c7dd92e7"/>
-    <w:p>
-      <w:pPr>
-        <w:pStyle w:val="Heading1"/>
-      </w:pPr>
-      <w:r>
-        <w:t xml:space="preserve">PXRD-Diff: Conditional Diffusion for Powder-Diffraction Inversion — an Encoder-Bottleneck Diagnosis and Shared-Harness Reproduction</w:t>
+    <w:p>
+      <w:pPr>
+        <w:pStyle w:val="Title"/>
+      </w:pPr>
+      <w:r>
+        <w:t xml:space="preserve">PXRD-Diff: Conditional Diffusion for Powder-Diffraction Inversion: an Encoder-Bottleneck Diagnosis and Shared-Harness Reproduction</w:t>
       </w:r>
     </w:p>
     <w:p>
@@ -41,7 +40,7 @@
           <w:i/>
           <w:iCs/>
         </w:rPr>
-        <w:t xml:space="preserve">Manuscript type: Article — methodological study with reproduction and negative results.</w:t>
+        <w:t xml:space="preserve">Manuscript type: Article, a methodological study with reproduction and negative results.</w:t>
       </w:r>
     </w:p>
     <w:p>
@@ -51,10 +50,10 @@
         </w:pict>
       </w:r>
     </w:p>
-    <w:bookmarkStart w:id="11" w:name="abstract"/>
-    <w:p>
-      <w:pPr>
-        <w:pStyle w:val="Heading2"/>
+    <w:bookmarkStart w:id="12" w:name="abstract"/>
+    <w:p>
+      <w:pPr>
+        <w:pStyle w:val="Heading1"/>
       </w:pPr>
       <w:r>
         <w:t xml:space="preserve">Abstract</w:t>
@@ -90,10 +89,7 @@
         <w:footnoteReference w:id="9"/>
       </w:r>
       <w:r>
-        <w:t xml:space="preserve"> </w:t>
-      </w:r>
-      <w:r>
-        <w:t xml:space="preserve">and PXRDnet</w:t>
+        <w:t xml:space="preserve">, PXRDnet</w:t>
       </w:r>
       <w:r>
         <w:t xml:space="preserve"> </w:t>
@@ -103,6 +99,18 @@
           <w:rStyle w:val="FootnoteReference"/>
         </w:rPr>
         <w:footnoteReference w:id="10"/>
+      </w:r>
+      <w:r>
+        <w:t xml:space="preserve">, and deCIFer</w:t>
+      </w:r>
+      <w:r>
+        <w:t xml:space="preserve"> </w:t>
+      </w:r>
+      <w:r>
+        <w:rPr>
+          <w:rStyle w:val="FootnoteReference"/>
+        </w:rPr>
+        <w:footnoteReference w:id="11"/>
       </w:r>
       <w:r>
         <w:t xml:space="preserve"> </w:t>
@@ -162,7 +170,7 @@
         <w:t xml:space="preserve"> </w:t>
       </w:r>
       <w:r>
-        <w:t xml:space="preserve">auxiliary lattice-regression loss in isolation, but that relative fit does not survive conversion to absolute scale — substituting the auxiliary head’s own lattice into the sampler recovers only 1.2 %, because its ~1.1 Å length error shifts every Bragg peak by ~15 % and collapses pattern agreement. The bottleneck is the global pooling that discards absolute peak positions, not the denoiser alone: neither the pooled encoding nor the denoiser fixes the lattice from scratch. A perturbation study locates a sharp sensitivity knee at ~0.5 Å cell error, and a true-lattice oracle lifts match from</w:t>
+        <w:t xml:space="preserve">auxiliary lattice-regression loss in isolation, but that relative fit does not survive conversion to absolute scale: substituting the auxiliary head’s own lattice into the sampler recovers only 1.2 %, because its ~1.1 Å length error shifts every Bragg peak by ~15 % and collapses pattern agreement. The bottleneck is the global pooling that discards absolute peak positions, not the denoiser alone: neither the pooled encoding nor the denoiser fixes the lattice from scratch. A perturbation study locates a sharp sensitivity knee at ~0.5 Å cell error, and a true-lattice oracle lifts match to</w:t>
       </w:r>
       <w:r>
         <w:t xml:space="preserve"> </w:t>
@@ -172,13 +180,13 @@
           <w:b/>
           <w:bCs/>
         </w:rPr>
-        <w:t xml:space="preserve">1.6 % to 5.6 %</w:t>
-      </w:r>
-      <w:r>
-        <w:t xml:space="preserve"> </w:t>
-      </w:r>
-      <w:r>
-        <w:t xml:space="preserve">at n = 1000; the 95 % Wilson confidence intervals ([1.0, 2.6] vs [4.3, 7.2]) do not overlap, so the gap is real. Replacing the learned lattice head with a classical Q-space autoindexer (de-Wolff dichotomy) raises no-true-lattice match to 1.5 % [1.2, 2.0] (three-seed pooled) from a learned-head baseline that recovers essentially nothing (0 / 1 949). A</w:t>
+        <w:t xml:space="preserve">4.5 %</w:t>
+      </w:r>
+      <w:r>
+        <w:t xml:space="preserve"> </w:t>
+      </w:r>
+      <w:r>
+        <w:t xml:space="preserve">at n = 1000 (three seeds, 135 / 3 000 pooled, firming an earlier single-seed 5.6 %); its 95 % Wilson CI [3.8, 5.3] is disjoint from the no-true-lattice indexer’s 1.5 % [1.2, 2.0], so the gap is real. Replacing the learned lattice head with a classical Q-space autoindexer (de-Wolff dichotomy) raises no-true-lattice match to 1.5 % [1.2, 2.0] (three-seed pooled) from a learned-head baseline that recovers essentially nothing (0 / 1 949). A</w:t>
       </w:r>
       <w:r>
         <w:t xml:space="preserve"> </w:t>
@@ -194,7 +202,7 @@
         <w:t xml:space="preserve"> </w:t>
       </w:r>
       <w:r>
-        <w:t xml:space="preserve">(p &lt; 10⁻⁴; 27 structures fixed, none broken) — an earlier unpaired test (p = 0.24) was simply underpowered. The gain is concentrated in the high-symmetry systems where the indexer’s cell error sits below the 0.5 Å knee. Reproduced baselines on our harness:</w:t>
+        <w:t xml:space="preserve">(p &lt; 10⁻⁴; 27 structures fixed, none broken); an earlier unpaired test (p = 0.24) was simply underpowered. The gain is concentrated in the high-symmetry systems where the indexer’s cell error sits below the 0.5 Å knee. Reproduced baselines on our harness:</w:t>
       </w:r>
       <w:r>
         <w:t xml:space="preserve"> </w:t>
@@ -204,13 +212,13 @@
           <w:b/>
           <w:bCs/>
         </w:rPr>
-        <w:t xml:space="preserve">DiffractGPT 18.9 %</w:t>
-      </w:r>
-      <w:r>
-        <w:t xml:space="preserve"> </w:t>
-      </w:r>
-      <w:r>
-        <w:t xml:space="preserve">match (15.9 % all-correct) at n = 1000,</w:t>
+        <w:t xml:space="preserve">deCIFer 73.8 %</w:t>
+      </w:r>
+      <w:r>
+        <w:t xml:space="preserve"> </w:t>
+      </w:r>
+      <w:r>
+        <w:t xml:space="preserve">match (69.5 % all-correct) at n = 300,</w:t>
       </w:r>
       <w:r>
         <w:t xml:space="preserve"> </w:t>
@@ -220,13 +228,29 @@
           <w:b/>
           <w:bCs/>
         </w:rPr>
+        <w:t xml:space="preserve">DiffractGPT 18.9 %</w:t>
+      </w:r>
+      <w:r>
+        <w:t xml:space="preserve"> </w:t>
+      </w:r>
+      <w:r>
+        <w:t xml:space="preserve">match (15.9 % all-correct) at n = 1000,</w:t>
+      </w:r>
+      <w:r>
+        <w:t xml:space="preserve"> </w:t>
+      </w:r>
+      <w:r>
+        <w:rPr>
+          <w:b/>
+          <w:bCs/>
+        </w:rPr>
         <w:t xml:space="preserve">PXRDnet sinc100 30.0 %</w:t>
       </w:r>
       <w:r>
         <w:t xml:space="preserve"> </w:t>
       </w:r>
       <w:r>
-        <w:t xml:space="preserve">match (5.0 % all-correct) at n = 20. PXRD-Diff is 12–19× behind on raw match rate. We note a striking</w:t>
+        <w:t xml:space="preserve">match (5.0 % all-correct) at n = 20. PXRD-Diff is 12–19× behind DGpt and PXRDnet and ~46× behind deCIFer on raw match rate. We note a striking</w:t>
       </w:r>
       <w:r>
         <w:t xml:space="preserve"> </w:t>
@@ -276,7 +300,7 @@
         <w:t xml:space="preserve"> </w:t>
       </w:r>
       <w:r>
-        <w:t xml:space="preserve">powder X-ray diffraction; crystal-structure prediction; denoising diffusion; classical autoindexing; differentiable physics; ablation study; negative results</w:t>
+        <w:t xml:space="preserve">machine learning for materials discovery; generative models; denoising diffusion; crystal structure prediction; powder X-ray diffraction; differentiable simulation; benchmarking and reproducibility</w:t>
       </w:r>
     </w:p>
     <w:p>
@@ -286,11 +310,11 @@
         </w:pict>
       </w:r>
     </w:p>
-    <w:bookmarkEnd w:id="11"/>
-    <w:bookmarkStart w:id="16" w:name="introduction"/>
-    <w:p>
-      <w:pPr>
-        <w:pStyle w:val="Heading2"/>
+    <w:bookmarkEnd w:id="12"/>
+    <w:bookmarkStart w:id="17" w:name="introduction"/>
+    <w:p>
+      <w:pPr>
+        <w:pStyle w:val="Heading1"/>
       </w:pPr>
       <w:r>
         <w:t xml:space="preserve">1. Introduction</w:t>
@@ -324,7 +348,7 @@
         <w:pStyle w:val="BodyText"/>
       </w:pPr>
       <w:r>
-        <w:t xml:space="preserve">Three recent generative approaches — DiffractGPT</w:t>
+        <w:t xml:space="preserve">Three recent generative approaches (DiffractGPT</w:t>
       </w:r>
       <w:r>
         <w:t xml:space="preserve"> </w:t>
@@ -333,7 +357,7 @@
         <w:rPr>
           <w:rStyle w:val="FootnoteReference"/>
         </w:rPr>
-        <w:footnoteReference w:id="12"/>
+        <w:footnoteReference w:id="13"/>
       </w:r>
       <w:r>
         <w:t xml:space="preserve">, Crystalyze</w:t>
@@ -345,7 +369,7 @@
         <w:rPr>
           <w:rStyle w:val="FootnoteReference"/>
         </w:rPr>
-        <w:footnoteReference w:id="13"/>
+        <w:footnoteReference w:id="14"/>
       </w:r>
       <w:r>
         <w:t xml:space="preserve">, PXRDnet</w:t>
@@ -357,13 +381,10 @@
         <w:rPr>
           <w:rStyle w:val="FootnoteReference"/>
         </w:rPr>
-        <w:footnoteReference w:id="14"/>
-      </w:r>
-      <w:r>
-        <w:t xml:space="preserve"> </w:t>
-      </w:r>
-      <w:r>
-        <w:t xml:space="preserve">— argue neural networks can shortcut this pipeline. They report match rates in the tens of percent, but under mutually incompatible evaluation protocols, and failure modes are seldom catalogued. A practitioner cannot easily form a calibrated expectation of</w:t>
+        <w:footnoteReference w:id="15"/>
+      </w:r>
+      <w:r>
+        <w:t xml:space="preserve">) argue neural networks can shortcut this pipeline. They report match rates in the tens of percent, but under mutually incompatible evaluation protocols, and failure modes are seldom catalogued. A practitioner cannot easily form a calibrated expectation of</w:t>
       </w:r>
       <w:r>
         <w:t xml:space="preserve"> </w:t>
@@ -387,10 +408,7 @@
         <w:pStyle w:val="BodyText"/>
       </w:pPr>
       <w:r>
-        <w:t xml:space="preserve">We build a small reproducible conditional diffusion model —</w:t>
-      </w:r>
-      <w:r>
-        <w:t xml:space="preserve"> </w:t>
+        <w:t xml:space="preserve">We build a small reproducible conditional diffusion model (</w:t>
       </w:r>
       <w:r>
         <w:rPr>
@@ -400,10 +418,7 @@
         <w:t xml:space="preserve">PXRD-Diff</w:t>
       </w:r>
       <w:r>
-        <w:t xml:space="preserve"> </w:t>
-      </w:r>
-      <w:r>
-        <w:t xml:space="preserve">— and run it against two of the three baselines on a shared</w:t>
+        <w:t xml:space="preserve">) and run it against two of the three baselines on a shared</w:t>
       </w:r>
       <w:r>
         <w:t xml:space="preserve"> </w:t>
@@ -477,7 +492,7 @@
         <w:t xml:space="preserve"> </w:t>
       </w:r>
       <w:r>
-        <w:t xml:space="preserve">A perturbation study (§5.5) locates a sharp ~0.5 Å sensitivity knee; a true-lattice oracle lifts match from 1.6 % to</w:t>
+        <w:t xml:space="preserve">A perturbation study (§5.5) locates a sharp ~0.5 Å sensitivity knee; a true-lattice oracle lifts match to</w:t>
       </w:r>
       <w:r>
         <w:t xml:space="preserve"> </w:t>
@@ -487,13 +502,13 @@
           <w:b/>
           <w:bCs/>
         </w:rPr>
-        <w:t xml:space="preserve">5.6 %</w:t>
-      </w:r>
-      <w:r>
-        <w:t xml:space="preserve"> </w:t>
-      </w:r>
-      <w:r>
-        <w:t xml:space="preserve">at n = 1000, with non-overlapping 95 % Wilson CIs. The encoder reaches a 0.007</w:t>
+        <w:t xml:space="preserve">4.5 %</w:t>
+      </w:r>
+      <w:r>
+        <w:t xml:space="preserve"> </w:t>
+      </w:r>
+      <w:r>
+        <w:t xml:space="preserve">at n = 1000 (three-seed firm-up of an earlier single-seed 5.6 %; Wilson 95 % CI [3.8, 5.3], disjoint from the indexer’s [1.2, 2.0]). The encoder reaches a 0.007</w:t>
       </w:r>
       <w:r>
         <w:t xml:space="preserve"> </w:t>
@@ -509,7 +524,7 @@
         <w:t xml:space="preserve"> </w:t>
       </w:r>
       <w:r>
-        <w:t xml:space="preserve">aux lattice loss in isolation, but substituting that head’s lattice into the sampler recovers only 1.2 % (§5.6) — its ~1.1 Å error sits well above the knee — so the pooled encoding, not merely the denoiser, fails to deliver absolute d-spacings. The lattice channel is the dominant</w:t>
+        <w:t xml:space="preserve">aux lattice loss in isolation, but substituting that head’s lattice into the sampler recovers only 1.2 % (§5.6). Its ~1.1 Å error sits well above the knee, so the pooled encoding, not merely the denoiser, fails to deliver absolute d-spacings. The lattice channel is the dominant</w:t>
       </w:r>
       <w:r>
         <w:t xml:space="preserve"> </w:t>
@@ -525,7 +540,7 @@
         <w:t xml:space="preserve"> </w:t>
       </w:r>
       <w:r>
-        <w:t xml:space="preserve">limiter; the 5.6 % oracle ceiling shows coordinates remain a co-bottleneck.</w:t>
+        <w:t xml:space="preserve">limiter; the 4.5 % oracle ceiling shows coordinates remain a co-bottleneck.</w:t>
       </w:r>
     </w:p>
     <w:p>
@@ -578,7 +593,7 @@
         <w:rPr>
           <w:rStyle w:val="FootnoteReference"/>
         </w:rPr>
-        <w:footnoteReference w:id="15"/>
+        <w:footnoteReference w:id="16"/>
       </w:r>
       <w:r>
         <w:t xml:space="preserve">.</w:t>
@@ -661,11 +676,11 @@
         </w:pict>
       </w:r>
     </w:p>
-    <w:bookmarkEnd w:id="16"/>
-    <w:bookmarkStart w:id="29" w:name="related-work"/>
-    <w:p>
-      <w:pPr>
-        <w:pStyle w:val="Heading2"/>
+    <w:bookmarkEnd w:id="17"/>
+    <w:bookmarkStart w:id="30" w:name="related-work"/>
+    <w:p>
+      <w:pPr>
+        <w:pStyle w:val="Heading1"/>
       </w:pPr>
       <w:r>
         <w:t xml:space="preserve">2. Related work</w:t>
@@ -695,7 +710,7 @@
         <w:rPr>
           <w:rStyle w:val="FootnoteReference"/>
         </w:rPr>
-        <w:footnoteReference w:id="17"/>
+        <w:footnoteReference w:id="18"/>
       </w:r>
       <w:r>
         <w:t xml:space="preserve"> </w:t>
@@ -710,7 +725,7 @@
         <w:rPr>
           <w:rStyle w:val="FootnoteReference"/>
         </w:rPr>
-        <w:footnoteReference w:id="18"/>
+        <w:footnoteReference w:id="19"/>
       </w:r>
       <w:r>
         <w:t xml:space="preserve"> </w:t>
@@ -725,7 +740,7 @@
         <w:rPr>
           <w:rStyle w:val="FootnoteReference"/>
         </w:rPr>
-        <w:footnoteReference w:id="19"/>
+        <w:footnoteReference w:id="20"/>
       </w:r>
       <w:r>
         <w:t xml:space="preserve"> </w:t>
@@ -758,7 +773,7 @@
         <w:rPr>
           <w:rStyle w:val="FootnoteReference"/>
         </w:rPr>
-        <w:footnoteReference w:id="20"/>
+        <w:footnoteReference w:id="21"/>
       </w:r>
       <w:r>
         <w:t xml:space="preserve"> </w:t>
@@ -773,7 +788,7 @@
         <w:rPr>
           <w:rStyle w:val="FootnoteReference"/>
         </w:rPr>
-        <w:footnoteReference w:id="21"/>
+        <w:footnoteReference w:id="22"/>
       </w:r>
       <w:r>
         <w:t xml:space="preserve"> </w:t>
@@ -788,7 +803,7 @@
         <w:rPr>
           <w:rStyle w:val="FootnoteReference"/>
         </w:rPr>
-        <w:footnoteReference w:id="22"/>
+        <w:footnoteReference w:id="23"/>
       </w:r>
       <w:r>
         <w:t xml:space="preserve"> </w:t>
@@ -835,13 +850,13 @@
         <w:rPr>
           <w:rStyle w:val="FootnoteReference"/>
         </w:rPr>
-        <w:footnoteReference w:id="23"/>
-      </w:r>
-      <w:r>
-        <w:t xml:space="preserve"> </w:t>
-      </w:r>
-      <w:r>
-        <w:t xml:space="preserve">is a concurrent autoregressive-language-model approach that, like DiffractGPT, emits CIF tokens. All four are larger than PXRD-Diff and report results under bespoke evaluation pipelines; §5.3 re-scores DiffractGPT and PXRDnet on a single shared</w:t>
+        <w:footnoteReference w:id="24"/>
+      </w:r>
+      <w:r>
+        <w:t xml:space="preserve"> </w:t>
+      </w:r>
+      <w:r>
+        <w:t xml:space="preserve">is a concurrent autoregressive-language-model approach that, like DiffractGPT, emits CIF tokens. All four are larger than PXRD-Diff and report results under bespoke evaluation pipelines; §5.3 re-scores DiffractGPT, PXRDnet, and deCIFer on a single shared</w:t>
       </w:r>
       <w:r>
         <w:t xml:space="preserve"> </w:t>
@@ -895,7 +910,7 @@
         <w:rPr>
           <w:rStyle w:val="FootnoteReference"/>
         </w:rPr>
-        <w:footnoteReference w:id="24"/>
+        <w:footnoteReference w:id="25"/>
       </w:r>
       <w:r>
         <w:t xml:space="preserve"> </w:t>
@@ -928,7 +943,7 @@
         <w:rPr>
           <w:rStyle w:val="FootnoteReference"/>
         </w:rPr>
-        <w:footnoteReference w:id="25"/>
+        <w:footnoteReference w:id="26"/>
       </w:r>
       <w:r>
         <w:t xml:space="preserve">. Relevant to our negative results, Segal et al.</w:t>
@@ -940,7 +955,7 @@
         <w:rPr>
           <w:rStyle w:val="FootnoteReference"/>
         </w:rPr>
-        <w:footnoteReference w:id="26"/>
+        <w:footnoteReference w:id="27"/>
       </w:r>
       <w:r>
         <w:t xml:space="preserve"> </w:t>
@@ -955,10 +970,7 @@
         <w:t xml:space="preserve">“too rough for gradient descent”</w:t>
       </w:r>
       <w:r>
-        <w:t xml:space="preserve"> </w:t>
-      </w:r>
-      <w:r>
-        <w:t xml:space="preserve">— independent evidence for why our sampling-time Debye-gradient guidance fails (§5.4).</w:t>
+        <w:t xml:space="preserve">, independent evidence for why our sampling-time Debye-gradient guidance fails (§5.4).</w:t>
       </w:r>
     </w:p>
     <w:p>
@@ -976,7 +988,7 @@
         <w:t xml:space="preserve"> </w:t>
       </w:r>
       <w:r>
-        <w:t xml:space="preserve">Not strictly E(3)-equivariant — we use periodic-distance RBFs (SchNet-style</w:t>
+        <w:t xml:space="preserve">Not strictly E(3)-equivariant: we use periodic-distance RBFs (SchNet-style</w:t>
       </w:r>
       <w:r>
         <w:t xml:space="preserve"> </w:t>
@@ -985,7 +997,7 @@
         <w:rPr>
           <w:rStyle w:val="FootnoteReference"/>
         </w:rPr>
-        <w:footnoteReference w:id="27"/>
+        <w:footnoteReference w:id="28"/>
       </w:r>
       <w:r>
         <w:t xml:space="preserve">). A frozen MACE</w:t>
@@ -997,7 +1009,7 @@
         <w:rPr>
           <w:rStyle w:val="FootnoteReference"/>
         </w:rPr>
-        <w:footnoteReference w:id="28"/>
+        <w:footnoteReference w:id="29"/>
       </w:r>
       <w:r>
         <w:t xml:space="preserve"> </w:t>
@@ -1013,20 +1025,20 @@
         </w:pict>
       </w:r>
     </w:p>
-    <w:bookmarkEnd w:id="29"/>
-    <w:bookmarkStart w:id="43" w:name="method"/>
+    <w:bookmarkEnd w:id="30"/>
+    <w:bookmarkStart w:id="44" w:name="method"/>
+    <w:p>
+      <w:pPr>
+        <w:pStyle w:val="Heading1"/>
+      </w:pPr>
+      <w:r>
+        <w:t xml:space="preserve">3. Method</w:t>
+      </w:r>
+    </w:p>
+    <w:bookmarkStart w:id="31" w:name="problem-formulation"/>
     <w:p>
       <w:pPr>
         <w:pStyle w:val="Heading2"/>
-      </w:pPr>
-      <w:r>
-        <w:t xml:space="preserve">3. Method</w:t>
-      </w:r>
-    </w:p>
-    <w:bookmarkStart w:id="30" w:name="problem-formulation"/>
-    <w:p>
-      <w:pPr>
-        <w:pStyle w:val="Heading3"/>
       </w:pPr>
       <w:r>
         <w:t xml:space="preserve">3.1 Problem formulation</w:t>
@@ -1572,14 +1584,14 @@
         <w:t xml:space="preserve"> </w:t>
       </w:r>
       <w:r>
-        <w:t xml:space="preserve">being known is a meaningful simplification — in practice one usually knows the chemistry from synthesis — but it is consistent with prior work on the same task.</w:t>
-      </w:r>
-    </w:p>
-    <w:bookmarkEnd w:id="30"/>
-    <w:bookmarkStart w:id="31" w:name="architecture-overview"/>
-    <w:p>
-      <w:pPr>
-        <w:pStyle w:val="Heading3"/>
+        <w:t xml:space="preserve">being known is a meaningful simplification (in practice one usually knows the chemistry from synthesis), but it is consistent with prior work on the same task.</w:t>
+      </w:r>
+    </w:p>
+    <w:bookmarkEnd w:id="31"/>
+    <w:bookmarkStart w:id="32" w:name="architecture-overview"/>
+    <w:p>
+      <w:pPr>
+        <w:pStyle w:val="Heading2"/>
       </w:pPr>
       <w:r>
         <w:t xml:space="preserve">3.2 Architecture overview</w:t>
@@ -1821,7 +1833,7 @@
         <w:t xml:space="preserve"> </w:t>
       </w:r>
       <w:r>
-        <w:t xml:space="preserve">only via additive broadcast, and the coordinate loss never moved off the random baseline of 3.0 — the auxiliary head told us the encoder was learning useful features (its loss dropped from 0.99 to 0.007), but the</w:t>
+        <w:t xml:space="preserve">only via additive broadcast, and the coordinate loss never moved off the random baseline of 3.0; the auxiliary head told us the encoder was learning useful features (its loss dropped from 0.99 to 0.007), but the</w:t>
       </w:r>
       <w:r>
         <w:t xml:space="preserve"> </w:t>
@@ -2292,10 +2304,7 @@
         </m:r>
       </m:oMath>
       <w:r>
-        <w:t xml:space="preserve"> </w:t>
-      </w:r>
-      <w:r>
-        <w:t xml:space="preserve">— that is, the pooled atom features, the global PXRD embedding,</w:t>
+        <w:t xml:space="preserve">: that is, the pooled atom features, the global PXRD embedding,</w:t>
       </w:r>
       <w:r>
         <w:t xml:space="preserve"> </w:t>
@@ -2414,14 +2423,14 @@
         <w:t xml:space="preserve"> </w:t>
       </w:r>
       <w:r>
-        <w:t xml:space="preserve">alone, trained with an MSE loss against the (normalised) ground-truth lattice. Its purpose is purely diagnostic — to expose whether the encoder is learning any lattice-relevant representation — and its loss does not flow back into the denoiser.</w:t>
-      </w:r>
-    </w:p>
-    <w:bookmarkEnd w:id="31"/>
-    <w:bookmarkStart w:id="36" w:name="Xc917a453586cc10256448f63d6af218d81ba9bb"/>
-    <w:p>
-      <w:pPr>
-        <w:pStyle w:val="Heading3"/>
+        <w:t xml:space="preserve">alone, trained with an MSE loss against the (normalised) ground-truth lattice. Its purpose is purely diagnostic, to expose whether the encoder is learning any lattice-relevant representation, and its loss does not flow back into the denoiser.</w:t>
+      </w:r>
+    </w:p>
+    <w:bookmarkEnd w:id="32"/>
+    <w:bookmarkStart w:id="37" w:name="Xc917a453586cc10256448f63d6af218d81ba9bb"/>
+    <w:p>
+      <w:pPr>
+        <w:pStyle w:val="Heading2"/>
       </w:pPr>
       <w:r>
         <w:t xml:space="preserve">3.3 Differentiable Bragg structure-factor loss</w:t>
@@ -3129,7 +3138,7 @@
         <w:t xml:space="preserve">reference: mean 0.962, std 0.027, min 0.896, max 0.998. All 50/50 correlations exceed 0.7 and we verified non-zero gradients through the structure factor with respect to fractional coordinates.</w:t>
       </w:r>
     </w:p>
-    <w:bookmarkStart w:id="35" w:name="fig:validation"/>
+    <w:bookmarkStart w:id="36" w:name="fig:validation"/>
     <w:p>
       <w:pPr>
         <w:pStyle w:val="CaptionedFigure"/>
@@ -3139,18 +3148,18 @@
           <wp:inline>
             <wp:extent cx="4140794" cy="2672861"/>
             <wp:effectExtent b="0" l="0" r="0" t="0"/>
-            <wp:docPr descr="Figure 1. Differentiable-simulator validation. Distribution of Pearson correlation between the PyTorch DiffPXRD module and pymatgen.XRDCalculator over 50 random MP-20 test structures (mean 0.962). All 50 exceed 0.7; the lower tail is dominated by layered structures with strong texture in the reference." title="" id="33" name="Picture"/>
+            <wp:docPr descr="Figure 1. Differentiable-simulator validation. Distribution of Pearson correlation between the PyTorch DiffPXRD module and pymatgen.XRDCalculator over 50 random MP-20 test structures (mean 0.962). All 50 exceed 0.7; the lower tail is dominated by layered structures with strong texture in the reference." title="" id="34" name="Picture"/>
             <a:graphic>
               <a:graphicData uri="http://schemas.openxmlformats.org/drawingml/2006/picture">
                 <pic:pic>
                   <pic:nvPicPr>
-                    <pic:cNvPr descr="fig3_diffpxrd_validation.png" id="34" name="Picture"/>
+                    <pic:cNvPr descr="fig3_diffpxrd_validation.png" id="35" name="Picture"/>
                     <pic:cNvPicPr>
                       <a:picLocks noChangeArrowheads="1" noChangeAspect="1"/>
                     </pic:cNvPicPr>
                   </pic:nvPicPr>
                   <pic:blipFill>
-                    <a:blip r:embed="rId32"/>
+                    <a:blip r:embed="rId33"/>
                     <a:stretch>
                       <a:fillRect/>
                     </a:stretch>
@@ -3210,7 +3219,7 @@
         <w:t xml:space="preserve">over 50 random MP-20 test structures (mean 0.962). All 50 exceed 0.7; the lower tail is dominated by layered structures with strong texture in the reference.</w:t>
       </w:r>
     </w:p>
-    <w:bookmarkEnd w:id="35"/>
+    <w:bookmarkEnd w:id="36"/>
     <w:p>
       <w:pPr>
         <w:pStyle w:val="BodyText"/>
@@ -3432,11 +3441,11 @@
         <w:t xml:space="preserve">. We use the true lattice for this auxiliary loss because the differentiable simulator is more sensitive to lattice errors than to coordinate errors at the early stages of training, and disentangling the two signals proved more stable.</w:t>
       </w:r>
     </w:p>
-    <w:bookmarkEnd w:id="36"/>
-    <w:bookmarkStart w:id="38" w:name="training-objective"/>
-    <w:p>
-      <w:pPr>
-        <w:pStyle w:val="Heading3"/>
+    <w:bookmarkEnd w:id="37"/>
+    <w:bookmarkStart w:id="39" w:name="training-objective"/>
+    <w:p>
+      <w:pPr>
+        <w:pStyle w:val="Heading2"/>
       </w:pPr>
       <w:r>
         <w:t xml:space="preserve">3.4 Training objective</w:t>
@@ -3456,7 +3465,7 @@
         <w:rPr>
           <w:rStyle w:val="FootnoteReference"/>
         </w:rPr>
-        <w:footnoteReference w:id="37"/>
+        <w:footnoteReference w:id="38"/>
       </w:r>
       <w:r>
         <w:t xml:space="preserve"> </w:t>
@@ -4447,7 +4456,7 @@
         <w:pStyle w:val="FirstParagraph"/>
       </w:pPr>
       <w:r>
-        <w:t xml:space="preserve">Because the heads are MLPs initialised to output near-zero, this means the model starts as the identity transform — at</w:t>
+        <w:t xml:space="preserve">Because the heads are MLPs initialised to output near-zero, this means the model starts as the identity transform: at</w:t>
       </w:r>
       <w:r>
         <w:t xml:space="preserve"> </w:t>
@@ -4515,7 +4524,7 @@
         <w:t xml:space="preserve"> </w:t>
       </w:r>
       <w:r>
-        <w:t xml:space="preserve">estimate, which is wrong but at least bounded; ε-prediction with the same architecture had to learn the entire transform from random initialisation and never recovered. This single change accounts for a 3.5× lift in the headline metric (see §5.2).</w:t>
+        <w:t xml:space="preserve">estimate, which is wrong but at least bounded; ε-prediction with the same architecture had to learn the entire transform from random initialisation and never recovered. At single seed this change appeared to lift the headline match metric 3.5×; a multi-seed checkpoint sweep (§7) shows that match-rate lift does not replicate, but the parameterisation does reproducibly improve the pattern-Pearson (≈ 0.36 → 0.40, see §5.1).</w:t>
       </w:r>
     </w:p>
     <w:p>
@@ -4571,7 +4580,7 @@
         <w:t xml:space="preserve"> </w:t>
       </w:r>
       <w:r>
-        <w:t xml:space="preserve">as an explicit input feature. Without this — i.e. if the head only sees the (clean) lattice that is also passed to the denoiser as the geometry context — the head can only ever predict the unconditional mean noise,</w:t>
+        <w:t xml:space="preserve">as an explicit input feature. Without this, i.e. if the head only sees the (clean) lattice that is also passed to the denoiser as the geometry context, the head can only ever predict the unconditional mean noise,</w:t>
       </w:r>
       <w:r>
         <w:t xml:space="preserve"> </w:t>
@@ -4686,11 +4695,11 @@
         <w:t xml:space="preserve">flags.</w:t>
       </w:r>
     </w:p>
-    <w:bookmarkEnd w:id="38"/>
-    <w:bookmarkStart w:id="40" w:name="X6e75ac1b115bab34c6f95946b56455b7789be55"/>
-    <w:p>
-      <w:pPr>
-        <w:pStyle w:val="Heading3"/>
+    <w:bookmarkEnd w:id="39"/>
+    <w:bookmarkStart w:id="41" w:name="X6e75ac1b115bab34c6f95946b56455b7789be55"/>
+    <w:p>
+      <w:pPr>
+        <w:pStyle w:val="Heading2"/>
       </w:pPr>
       <w:r>
         <w:t xml:space="preserve">3.5 Classical indexing as a drop-in for the learned lattice head</w:t>
@@ -4733,7 +4742,7 @@
         <w:t xml:space="preserve"> </w:t>
       </w:r>
       <w:r>
-        <w:t xml:space="preserve">d-spacing structure (Pearson 0.43 between predicted and target patterns at evaluation time, vs 0.97 between target and ground truth) but not the absolute scale. Classical autoindexing — extracting peak positions, mapping them to Q-space (Q = 4π sinθ/λ), and fitting a unit cell by enumeration of (h,k,l) → Q²(h,k,l) — has solved this sub-problem since the 1970s and runs on a CPU in milliseconds per pattern.</w:t>
+        <w:t xml:space="preserve">d-spacing structure (Pearson 0.43 between predicted and target patterns at evaluation time, vs 0.97 between target and ground truth) but not the absolute scale. Classical autoindexing, which extracts peak positions, maps them to Q-space (Q = 4π sinθ/λ), and fits a unit cell by enumeration of (h,k,l) → Q²(h,k,l), has solved this sub-problem since the 1970s and runs on a CPU in milliseconds per pattern.</w:t>
       </w:r>
     </w:p>
     <w:p>
@@ -4768,7 +4777,7 @@
         <w:rPr>
           <w:rStyle w:val="FootnoteReference"/>
         </w:rPr>
-        <w:footnoteReference w:id="39"/>
+        <w:footnoteReference w:id="40"/>
       </w:r>
       <w:r>
         <w:t xml:space="preserve"> </w:t>
@@ -4855,11 +4864,11 @@
         <w:t xml:space="preserve">in the strongest sense: training is unchanged, the diffusion sampler is unchanged except for the lattice-channel substitution at t = T, and the headline metric (§5.2) reports both with and without the indexer for direct comparison.</w:t>
       </w:r>
     </w:p>
-    <w:bookmarkEnd w:id="40"/>
-    <w:bookmarkStart w:id="42" w:name="sampling"/>
-    <w:p>
-      <w:pPr>
-        <w:pStyle w:val="Heading3"/>
+    <w:bookmarkEnd w:id="41"/>
+    <w:bookmarkStart w:id="43" w:name="sampling"/>
+    <w:p>
+      <w:pPr>
+        <w:pStyle w:val="Heading2"/>
       </w:pPr>
       <w:r>
         <w:t xml:space="preserve">3.6 Sampling</w:t>
@@ -4879,7 +4888,7 @@
         <w:rPr>
           <w:rStyle w:val="FootnoteReference"/>
         </w:rPr>
-        <w:footnoteReference w:id="41"/>
+        <w:footnoteReference w:id="42"/>
       </w:r>
       <w:r>
         <w:t xml:space="preserve"> </w:t>
@@ -5203,12 +5212,12 @@
         </w:pict>
       </w:r>
     </w:p>
-    <w:bookmarkEnd w:id="42"/>
     <w:bookmarkEnd w:id="43"/>
-    <w:bookmarkStart w:id="45" w:name="experiments"/>
-    <w:p>
-      <w:pPr>
-        <w:pStyle w:val="Heading2"/>
+    <w:bookmarkEnd w:id="44"/>
+    <w:bookmarkStart w:id="46" w:name="experiments"/>
+    <w:p>
+      <w:pPr>
+        <w:pStyle w:val="Heading1"/>
       </w:pPr>
       <w:r>
         <w:t xml:space="preserve">4. Experiments</w:t>
@@ -5238,7 +5247,7 @@
         <w:rPr>
           <w:rStyle w:val="FootnoteReference"/>
         </w:rPr>
-        <w:footnoteReference w:id="44"/>
+        <w:footnoteReference w:id="45"/>
       </w:r>
       <w:r>
         <w:t xml:space="preserve"> </w:t>
@@ -5478,10 +5487,7 @@
         </m:r>
       </m:oMath>
       <w:r>
-        <w:t xml:space="preserve"> </w:t>
-      </w:r>
-      <w:r>
-        <w:t xml:space="preserve">— the headline</w:t>
+        <w:t xml:space="preserve">, the headline</w:t>
       </w:r>
       <w:r>
         <w:t xml:space="preserve"> </w:t>
@@ -5621,10 +5627,7 @@
         <w:t xml:space="preserve">composition ∧ sg-match@symprec=0.1 ∧ rmsd ≤ 0.1 Å</w:t>
       </w:r>
       <w:r>
-        <w:t xml:space="preserve"> </w:t>
-      </w:r>
-      <w:r>
-        <w:t xml:space="preserve">— the experimentally relevant case for downstream crystallographic use.</w:t>
+        <w:t xml:space="preserve">, the experimentally relevant case for downstream crystallographic use.</w:t>
       </w:r>
     </w:p>
     <w:p>
@@ -5838,31 +5841,31 @@
         </w:pict>
       </w:r>
     </w:p>
-    <w:bookmarkEnd w:id="45"/>
-    <w:bookmarkStart w:id="71" w:name="results"/>
+    <w:bookmarkEnd w:id="46"/>
+    <w:bookmarkStart w:id="73" w:name="results"/>
+    <w:p>
+      <w:pPr>
+        <w:pStyle w:val="Heading1"/>
+      </w:pPr>
+      <w:r>
+        <w:t xml:space="preserve">5. Results</w:t>
+      </w:r>
+    </w:p>
+    <w:p>
+      <w:pPr>
+        <w:pStyle w:val="FirstParagraph"/>
+      </w:pPr>
+      <w:r>
+        <w:t xml:space="preserve">Order: Phase 4 architectural ablation (§5.1) → Phase 9 indexer drop-in (§5.2) → reproduced baselines (§5.3) → failure catalogue (§5.4) → encoder-bottleneck perturbation study (§5.5).</w:t>
+      </w:r>
+    </w:p>
+    <w:bookmarkStart w:id="51" w:name="Xadaaeed9a4d3d9b8a4dfaf721f122e0603fe773"/>
     <w:p>
       <w:pPr>
         <w:pStyle w:val="Heading2"/>
       </w:pPr>
       <w:r>
-        <w:t xml:space="preserve">5. Results</w:t>
-      </w:r>
-    </w:p>
-    <w:p>
-      <w:pPr>
-        <w:pStyle w:val="FirstParagraph"/>
-      </w:pPr>
-      <w:r>
-        <w:t xml:space="preserve">Order: Phase 4 architectural ablation (§5.1) → Phase 9 indexer drop-in (§5.2) → reproduced baselines (§5.3) → failure catalogue (§5.4) → encoder-bottleneck perturbation study (§5.5).</w:t>
-      </w:r>
-    </w:p>
-    <w:bookmarkStart w:id="50" w:name="Xadaaeed9a4d3d9b8a4dfaf721f122e0603fe773"/>
-    <w:p>
-      <w:pPr>
-        <w:pStyle w:val="Heading3"/>
-      </w:pPr>
-      <w:r>
-        <w:t xml:space="preserve">5.1 Phase 4 — architectural ablation (true-lattice setting)</w:t>
+        <w:t xml:space="preserve">5.1 Phase 4: architectural ablation (true-lattice setting)</w:t>
       </w:r>
     </w:p>
     <w:p>
@@ -6570,7 +6573,7 @@
         </w:tc>
       </w:tr>
     </w:tbl>
-    <w:bookmarkStart w:id="49" w:name="fig:ablation"/>
+    <w:bookmarkStart w:id="50" w:name="fig:ablation"/>
     <w:p>
       <w:pPr>
         <w:pStyle w:val="CaptionedFigure"/>
@@ -6580,18 +6583,18 @@
           <wp:inline>
             <wp:extent cx="5334000" cy="2222893"/>
             <wp:effectExtent b="0" l="0" r="0" t="0"/>
-            <wp:docPr descr="Figure 2. Phase 4 architectural ablation. Match rate (a) and pattern Pearson (b) for the seven coordinate-only runs of Table 1 on MP-20 test (n = 1000, true lattice substituted). The ε → x₀-residual switch (v11 → v13) is the largest single lift; adding Wyckoff embeddings or a distance-matrix loss regresses below it." title="" id="47" name="Picture"/>
+            <wp:docPr descr="Figure 2. Phase 4 architectural ablation. Match rate (a) and pattern Pearson (b) for the seven coordinate-only runs of Table 1 on MP-20 test (n = 1000, true lattice substituted). The ε → x₀-residual switch (v11 → v13) shows the largest single-seed match lift (panel a), but that match lift does not replicate across seeds; only the pattern-Pearson gain (panel b) does (§7); adding Wyckoff embeddings or a distance-matrix loss regresses below it." title="" id="48" name="Picture"/>
             <a:graphic>
               <a:graphicData uri="http://schemas.openxmlformats.org/drawingml/2006/picture">
                 <pic:pic>
                   <pic:nvPicPr>
-                    <pic:cNvPr descr="fig1_ablation.png" id="48" name="Picture"/>
+                    <pic:cNvPr descr="fig1_ablation.png" id="49" name="Picture"/>
                     <pic:cNvPicPr>
                       <a:picLocks noChangeArrowheads="1" noChangeAspect="1"/>
                     </pic:cNvPicPr>
                   </pic:nvPicPr>
                   <pic:blipFill>
-                    <a:blip r:embed="rId46"/>
+                    <a:blip r:embed="rId47"/>
                     <a:stretch>
                       <a:fillRect/>
                     </a:stretch>
@@ -6633,16 +6636,16 @@
         <w:t xml:space="preserve"> </w:t>
       </w:r>
       <w:r>
-        <w:t xml:space="preserve">Match rate (a) and pattern Pearson (b) for the seven coordinate-only runs of Table 1 on MP-20 test (n = 1000, true lattice substituted). The ε → x₀-residual switch (v11 → v13) is the largest single lift; adding Wyckoff embeddings or a distance-matrix loss regresses below it.</w:t>
-      </w:r>
-    </w:p>
-    <w:bookmarkEnd w:id="49"/>
+        <w:t xml:space="preserve">Match rate (a) and pattern Pearson (b) for the seven coordinate-only runs of Table 1 on MP-20 test (n = 1000, true lattice substituted). The ε → x₀-residual switch (v11 → v13) shows the largest single-seed match lift (panel a), but that match lift does not replicate across seeds; only the pattern-Pearson gain (panel b) does (§7); adding Wyckoff embeddings or a distance-matrix loss regresses below it.</w:t>
+      </w:r>
+    </w:p>
+    <w:bookmarkEnd w:id="50"/>
     <w:p>
       <w:pPr>
         <w:pStyle w:val="BodyText"/>
       </w:pPr>
       <w:r>
-        <w:t xml:space="preserve">Two choices are load-bearing. The</w:t>
+        <w:t xml:space="preserve">The</w:t>
       </w:r>
       <w:r>
         <w:t xml:space="preserve"> </w:t>
@@ -6658,7 +6661,7 @@
         <w:t xml:space="preserve"> </w:t>
       </w:r>
       <w:r>
-        <w:t xml:space="preserve">(§3.4) drops lattice loss from 1.0 (pinned at the prior variance for 100 k steps) to ~0.02 once</w:t>
+        <w:t xml:space="preserve">(§3.4) is load-bearing: it drops lattice loss from 1.0 (pinned at the prior variance for 100 k steps) to ~0.02 once</w:t>
       </w:r>
       <w:r>
         <w:t xml:space="preserve"> </w:t>
@@ -6712,7 +6715,7 @@
         <w:t xml:space="preserve"> </w:t>
       </w:r>
       <w:r>
-        <w:t xml:space="preserve">enters the head input. Switching from</w:t>
+        <w:t xml:space="preserve">enters the head input. A second, apparent lift did</w:t>
       </w:r>
       <w:r>
         <w:t xml:space="preserve"> </w:t>
@@ -6722,13 +6725,29 @@
           <w:b/>
           <w:bCs/>
         </w:rPr>
+        <w:t xml:space="preserve">not</w:t>
+      </w:r>
+      <w:r>
+        <w:t xml:space="preserve"> </w:t>
+      </w:r>
+      <w:r>
+        <w:t xml:space="preserve">survive replication: switching from</w:t>
+      </w:r>
+      <w:r>
+        <w:t xml:space="preserve"> </w:t>
+      </w:r>
+      <w:r>
+        <w:rPr>
+          <w:b/>
+          <w:bCs/>
+        </w:rPr>
         <w:t xml:space="preserve">ε to x₀-residual</w:t>
       </w:r>
       <w:r>
         <w:t xml:space="preserve"> </w:t>
       </w:r>
       <w:r>
-        <w:t xml:space="preserve">at fixed Debye λ = 1 (v11 → v13) lifts match 0.9 % → 2.5 % — 3.5× over the v10 ε baseline. Capacity is not the bottleneck: a 10.1 M-parameter run (</w:t>
+        <w:t xml:space="preserve">at fixed Debye λ = 1 (v11 → v13) lifted single-seed match 0.9 % → 2.5 %, but a multi-seed checkpoint sweep (two seeds × five checkpoints, 20k–100k) found ε and x₀-residual indistinguishable on match rate (1.20 % vs 1.35 % pooled; x₀ never exceeds 1.5 % at any checkpoint, including the 80 k one matching the original’s 79.5 k, §7), so the 3.5× match lift was a single-seed fluctuation. The x₀-residual parameterisation does, however, reproducibly improve pattern-Pearson (0.36 → 0.40), which is the part of the Phase-4 signal that survives. Capacity is not the bottleneck: a 10.1 M-parameter run (</w:t>
       </w:r>
       <m:oMath>
         <m:r>
@@ -6777,17 +6796,17 @@
         <w:t xml:space="preserve">gpu_v12</w:t>
       </w:r>
       <w:r>
-        <w:t xml:space="preserve">) stayed at the same ~1.0 coord-loss plateau as v10. Under the full pipeline (sampled lattice), v13 drops to 1.2 % at n = 256; the Phase 9 v21 checkpoint reaches 5.6 % under oracle but only 1.0 % under full pipeline. §5.2 attacks that gap.</w:t>
-      </w:r>
-    </w:p>
-    <w:bookmarkEnd w:id="50"/>
-    <w:bookmarkStart w:id="55" w:name="phase-9-classical-indexer-drop-in"/>
-    <w:p>
-      <w:pPr>
-        <w:pStyle w:val="Heading3"/>
-      </w:pPr>
-      <w:r>
-        <w:t xml:space="preserve">5.2 Phase 9 — classical indexer drop-in</w:t>
+        <w:t xml:space="preserve">) stayed at the same ~1.0 coord-loss plateau as v10. Under the full pipeline (sampled lattice), v13 drops to 1.2 % at n = 256; the Phase 9 v21 checkpoint reaches 4.5 % under oracle (three seeds; an earlier single-seed snapshot read 5.6 %) but only 1.0 % under full pipeline. §5.2 attacks that gap.</w:t>
+      </w:r>
+    </w:p>
+    <w:bookmarkEnd w:id="51"/>
+    <w:bookmarkStart w:id="56" w:name="phase-9-classical-indexer-drop-in"/>
+    <w:p>
+      <w:pPr>
+        <w:pStyle w:val="Heading2"/>
+      </w:pPr>
+      <w:r>
+        <w:t xml:space="preserve">5.2 Phase 9: classical indexer drop-in</w:t>
       </w:r>
     </w:p>
     <w:p>
@@ -6954,7 +6973,7 @@
               <w:pStyle w:val="Compact"/>
             </w:pPr>
             <w:r>
-              <w:t xml:space="preserve">—</w:t>
+              <w:t xml:space="preserve">n/a</w:t>
             </w:r>
           </w:p>
         </w:tc>
@@ -7142,7 +7161,7 @@
         <w:t xml:space="preserve"> </w:t>
       </w:r>
       <w:r>
-        <w:t xml:space="preserve">The single-seed snapshot alone does not establish a genuine improvement — its Wilson CIs overlap and an unpaired two-proportion test gives p = 0.24. To resolve it we reran</w:t>
+        <w:t xml:space="preserve">The single-seed snapshot alone does not establish a genuine improvement: its Wilson CIs overlap and an unpaired two-proportion test gives p = 0.24. To resolve it we reran</w:t>
       </w:r>
       <w:r>
         <w:t xml:space="preserve"> </w:t>
@@ -7158,7 +7177,7 @@
         <w:t xml:space="preserve"> </w:t>
       </w:r>
       <w:r>
-        <w:t xml:space="preserve">lattice sources at three seeds (n = 1 000 each), differing only in the lattice channel, and applied a paired McNemar test on the per-structure outcomes — the correct test, because the two arms see the same materials. The result is unambiguous. The two arms are scored on the same materials per seed, but the learned-head arm yields fewer</w:t>
+        <w:t xml:space="preserve">lattice sources at three seeds (n = 1 000 each), differing only in the lattice channel, and applied a paired McNemar test on the per-structure outcomes, the correct test, because the two arms see the same materials. The result is unambiguous. The two arms are scored on the same materials per seed, but the learned-head arm yields fewer</w:t>
       </w:r>
       <w:r>
         <w:t xml:space="preserve"> </w:t>
@@ -7246,7 +7265,7 @@
         <w:t xml:space="preserve"> </w:t>
       </w:r>
       <w:r>
-        <w:t xml:space="preserve">the indexer misses — the explicit 2×2 below.</w:t>
+        <w:t xml:space="preserve">the indexer misses (the explicit 2×2 below).</w:t>
       </w:r>
     </w:p>
     <w:p>
@@ -7561,7 +7580,7 @@
         <w:t xml:space="preserve">p = 1.5 × 10⁻⁸</w:t>
       </w:r>
       <w:r>
-        <w:t xml:space="preserve">. (Marginal match counts differ — indexer 46 / 3 000, learned 0 / 1 949 — because 19 further indexer matches fall on structures the learned arm could not score; these do not enter the paired test.) The single-seed 1.0 % learned-head figure in Table 2 is within run-to-run noise of zero; across three fresh seeds the learned lattice head matched nothing. The gain does</w:t>
+        <w:t xml:space="preserve">. (Marginal match counts differ: indexer 46 / 3 000, learned 0 / 1 949, because 19 further indexer matches fall on structures the learned arm could not score; these do not enter the paired test.) The single-seed 1.0 % learned-head figure in Table 2 is within run-to-run noise of zero; across three fresh seeds the learned lattice head matched nothing. The gain does</w:t>
       </w:r>
       <w:r>
         <w:t xml:space="preserve"> </w:t>
@@ -7622,7 +7641,7 @@
         <w:t xml:space="preserve">p = 0.13</w:t>
       </w:r>
       <w:r>
-        <w:t xml:space="preserve">) — the indexer fixes the cell but not the space group. So the drop-in reproducibly improves match rate over the learned lattice head; the</w:t>
+        <w:t xml:space="preserve">): the indexer fixes the cell but not the space group. So the drop-in reproducibly improves match rate over the learned lattice head; the</w:t>
       </w:r>
       <w:r>
         <w:t xml:space="preserve"> </w:t>
@@ -7662,10 +7681,26 @@
         <w:t xml:space="preserve"> </w:t>
       </w:r>
       <w:r>
-        <w:t xml:space="preserve">do is close the gap to the oracle. The indexer → oracle gap (1.6 → 5.6 %) is itself significant (disjoint CIs) and isolates the lattice-attributable error: even with a perfect lattice, match caps at 5.6 %, so coordinate prediction is the dominant limiter while lattice error explains the 1.6 → 5.6 % shortfall. The indexer’s per-system MAE (1.45 Å overall, dominated by mono 1.76 Å and triclinic NaN) sits above the 0.5 Å knee — closing the rest requires fixing the low-symmetry path (GSAS-II remains experimental).</w:t>
-      </w:r>
-    </w:p>
-    <w:bookmarkStart w:id="54" w:name="fig:indexer"/>
+        <w:t xml:space="preserve">do is close the gap to the oracle. We re-ran the oracle at three seeds, firming the single-seed 5.6 % to</w:t>
+      </w:r>
+      <w:r>
+        <w:t xml:space="preserve"> </w:t>
+      </w:r>
+      <w:r>
+        <w:rPr>
+          <w:b/>
+          <w:bCs/>
+        </w:rPr>
+        <w:t xml:space="preserve">4.5 % [3.8, 5.3]</w:t>
+      </w:r>
+      <w:r>
+        <w:t xml:space="preserve"> </w:t>
+      </w:r>
+      <w:r>
+        <w:t xml:space="preserve">(135 / 3 000 pooled), still disjoint from the indexer’s 1.5 % [1.2, 2.0]. The indexer → oracle gap (1.5 → 4.5 %) is itself significant (disjoint CIs) and isolates the lattice-attributable error: even with a perfect lattice, match caps at 4.5 %, so coordinate prediction is the dominant limiter while lattice error explains the 1.5 → 4.5 % shortfall. The indexer’s per-system MAE (1.45 Å overall, dominated by mono 1.76 Å and triclinic NaN) sits above the 0.5 Å knee; closing the rest requires fixing the low-symmetry path (GSAS-II remains experimental).</w:t>
+      </w:r>
+    </w:p>
+    <w:bookmarkStart w:id="55" w:name="fig:indexer"/>
     <w:p>
       <w:pPr>
         <w:pStyle w:val="CaptionedFigure"/>
@@ -7675,18 +7710,18 @@
           <wp:inline>
             <wp:extent cx="5334000" cy="2423254"/>
             <wp:effectExtent b="0" l="0" r="0" t="0"/>
-            <wp:docPr descr="Figure 3. Per-system indexer performance. Strict and consistent indexing rates (a) and length MAE (b) on n = 1 000. High-symmetry systems (hex, ortho) sit below the 0.5 Å knee; trig and mono blow up; triclinic is unindexable in this implementation. The overall 1.45 Å MAE hides two regimes, and explains why the indexer’s significant match-rate gain (§5.2) is concentrated entirely in the high-symmetry systems." title="" id="52" name="Picture"/>
+            <wp:docPr descr="Figure 3. Per-system indexer performance. Strict and consistent indexing rates (a) and length MAE (b) on n = 1 000. High-symmetry systems (hex, ortho) sit below the 0.5 Å knee; trig and mono blow up; triclinic is unindexable in this implementation. The overall 1.45 Å MAE hides two regimes, and explains why the indexer’s significant match-rate gain (§5.2) is concentrated entirely in the high-symmetry systems." title="" id="53" name="Picture"/>
             <a:graphic>
               <a:graphicData uri="http://schemas.openxmlformats.org/drawingml/2006/picture">
                 <pic:pic>
                   <pic:nvPicPr>
-                    <pic:cNvPr descr="fig4_indexer_bench.png" id="53" name="Picture"/>
+                    <pic:cNvPr descr="fig4_indexer_bench.png" id="54" name="Picture"/>
                     <pic:cNvPicPr>
                       <a:picLocks noChangeArrowheads="1" noChangeAspect="1"/>
                     </pic:cNvPicPr>
                   </pic:nvPicPr>
                   <pic:blipFill>
-                    <a:blip r:embed="rId51"/>
+                    <a:blip r:embed="rId52"/>
                     <a:stretch>
                       <a:fillRect/>
                     </a:stretch>
@@ -7731,12 +7766,12 @@
         <w:t xml:space="preserve">Strict and consistent indexing rates (a) and length MAE (b) on n = 1 000. High-symmetry systems (hex, ortho) sit below the 0.5 Å knee; trig and mono blow up; triclinic is unindexable in this implementation. The overall 1.45 Å MAE hides two regimes, and explains why the indexer’s significant match-rate gain (§5.2) is concentrated entirely in the high-symmetry systems.</w:t>
       </w:r>
     </w:p>
-    <w:bookmarkEnd w:id="54"/>
     <w:bookmarkEnd w:id="55"/>
-    <w:bookmarkStart w:id="62" w:name="head-to-head-with-external-baselines"/>
-    <w:p>
-      <w:pPr>
-        <w:pStyle w:val="Heading3"/>
+    <w:bookmarkEnd w:id="56"/>
+    <w:bookmarkStart w:id="64" w:name="head-to-head-with-external-baselines"/>
+    <w:p>
+      <w:pPr>
+        <w:pStyle w:val="Heading2"/>
       </w:pPr>
       <w:r>
         <w:t xml:space="preserve">5.3 Head-to-head with external baselines</w:t>
@@ -7756,7 +7791,7 @@
         <w:t xml:space="preserve">knc6/diffractgpt_mistral_chemical_formula</w:t>
       </w:r>
       <w:r>
-        <w:t xml:space="preserve">) at n = 1 000 and PXRDnet (</w:t>
+        <w:t xml:space="preserve">) at n = 1 000, PXRDnet (</w:t>
       </w:r>
       <w:r>
         <w:rPr>
@@ -7765,7 +7800,7 @@
         <w:t xml:space="preserve">therealgabeguo/cdvae_xrd_sinc100</w:t>
       </w:r>
       <w:r>
-        <w:t xml:space="preserve">) at n = 20 (limited by ~4 GPU-hr/material) re-scored on</w:t>
+        <w:t xml:space="preserve">) at n = 20 (limited by ~4 GPU-hr/material), and deCIFer (deCIFer_v1, conditioned on XRD + composition) at n = 300 re-scored on</w:t>
       </w:r>
       <w:r>
         <w:t xml:space="preserve"> </w:t>
@@ -7982,7 +8017,7 @@
               <w:rPr>
                 <w:rStyle w:val="FootnoteReference"/>
               </w:rPr>
-              <w:footnoteReference w:id="56"/>
+              <w:footnoteReference w:id="57"/>
             </w:r>
           </w:p>
         </w:tc>
@@ -8059,7 +8094,7 @@
               <w:rPr>
                 <w:rStyle w:val="FootnoteReference"/>
               </w:rPr>
-              <w:footnoteReference w:id="57"/>
+              <w:footnoteReference w:id="58"/>
             </w:r>
           </w:p>
         </w:tc>
@@ -8115,6 +8150,83 @@
             </w:pPr>
             <w:r>
               <w:t xml:space="preserve">0.011</w:t>
+            </w:r>
+          </w:p>
+        </w:tc>
+      </w:tr>
+      <w:tr>
+        <w:tc>
+          <w:tcPr/>
+          <w:p>
+            <w:pPr>
+              <w:pStyle w:val="Compact"/>
+            </w:pPr>
+            <w:r>
+              <w:t xml:space="preserve">deCIFer</w:t>
+            </w:r>
+            <w:r>
+              <w:t xml:space="preserve"> </w:t>
+            </w:r>
+            <w:r>
+              <w:rPr>
+                <w:rStyle w:val="FootnoteReference"/>
+              </w:rPr>
+              <w:footnoteReference w:id="59"/>
+            </w:r>
+          </w:p>
+        </w:tc>
+        <w:tc>
+          <w:tcPr/>
+          <w:p>
+            <w:pPr>
+              <w:pStyle w:val="Compact"/>
+            </w:pPr>
+            <w:r>
+              <w:t xml:space="preserve">298</w:t>
+            </w:r>
+          </w:p>
+        </w:tc>
+        <w:tc>
+          <w:tcPr/>
+          <w:p>
+            <w:pPr>
+              <w:pStyle w:val="Compact"/>
+            </w:pPr>
+            <w:r>
+              <w:t xml:space="preserve">73.8 [68.6, 78.5]</w:t>
+            </w:r>
+          </w:p>
+        </w:tc>
+        <w:tc>
+          <w:tcPr/>
+          <w:p>
+            <w:pPr>
+              <w:pStyle w:val="Compact"/>
+            </w:pPr>
+            <w:r>
+              <w:t xml:space="preserve">69.5 [64.0, 74.4]</w:t>
+            </w:r>
+          </w:p>
+        </w:tc>
+        <w:tc>
+          <w:tcPr/>
+          <w:p>
+            <w:pPr>
+              <w:pStyle w:val="Compact"/>
+            </w:pPr>
+            <w:r>
+              <w:t xml:space="preserve">83.6</w:t>
+            </w:r>
+          </w:p>
+        </w:tc>
+        <w:tc>
+          <w:tcPr/>
+          <w:p>
+            <w:pPr>
+              <w:pStyle w:val="Compact"/>
+            </w:pPr>
+            <w:r>
+              <w:t xml:space="preserve">0.009</w:t>
             </w:r>
           </w:p>
         </w:tc>
@@ -8135,7 +8247,7 @@
         <w:t xml:space="preserve"> </w:t>
       </w:r>
       <w:r>
-        <w:t xml:space="preserve">ranks PXRDnet &gt; DGpt &gt; PXRD-Diff; PXRDnet’s lead is consistent with its 35 k-op latent optimisation, whereas DGpt is one forward pass. PXRD-Diff is 12–19× behind both. A more interesting pattern is that the</w:t>
+        <w:t xml:space="preserve">ranks deCIFer ≫ PXRDnet &gt; DGpt &gt; PXRD-Diff. deCIFer, a concurrent autoregressive CIF-token model conditioned on XRD + composition, is the strongest external reference at 73.8 % match / 69.5 % all-correct (n = 300), ~46× above PXRD-Diff; notably its all-correct nearly equals its match, i.e. when it recovers structure it almost always recovers the space group too, the same CIF-token signature seen in DGpt. PXRDnet’s lead over DGpt is consistent with its 35 k-op latent optimisation, whereas DGpt is one forward pass. PXRD-Diff is 12–19× behind PXRDnet/DGpt. A more interesting pattern is that the</w:t>
       </w:r>
       <w:r>
         <w:t xml:space="preserve"> </w:t>
@@ -8151,7 +8263,7 @@
         <w:t xml:space="preserve"> </w:t>
       </w:r>
       <w:r>
-        <w:t xml:space="preserve">ordering need not follow match rate: DGpt’s all-correct (15.9 % [13.8, 18.3]) exceeds its space-group-loose match by little, while PXRDnet’s drops from 30 % match to 5 % all-correct — i.e. PXRDnet matches structure under loose tolerances but rarely recovers the space group, whereas DGpt’s CIF-token output appears to encode symmetry.</w:t>
+        <w:t xml:space="preserve">ordering need not follow match rate: DGpt’s all-correct (15.9 % [13.8, 18.3]) exceeds its space-group-loose match by little, while PXRDnet’s drops from 30 % match to 5 % all-correct, i.e. PXRDnet matches structure under loose tolerances but rarely recovers the space group, whereas DGpt’s CIF-token output appears to encode symmetry.</w:t>
       </w:r>
       <w:r>
         <w:t xml:space="preserve"> </w:t>
@@ -8195,7 +8307,7 @@
         <w:t xml:space="preserve"> </w:t>
       </w:r>
       <w:r>
-        <w:t xml:space="preserve">statistically established and would require n ≈ 100–200 to confirm. If it holds, the implication is consequential — published single-number</w:t>
+        <w:t xml:space="preserve">statistically established and would require n ≈ 100–200 to confirm. If it holds, the implication is consequential: published single-number</w:t>
       </w:r>
       <w:r>
         <w:t xml:space="preserve"> </w:t>
@@ -8207,7 +8319,7 @@
         <w:t xml:space="preserve"> </w:t>
       </w:r>
       <w:r>
-        <w:t xml:space="preserve">would conflate structure recovery with symmetry recovery — which is precisely why we surface it despite the underpowered sample, and why §6 frames it as motivation for future measurement rather than a claim.</w:t>
+        <w:t xml:space="preserve">would conflate structure recovery with symmetry recovery, which is precisely why we surface it despite the underpowered sample, and why §6 frames it as motivation for future measurement rather than a claim.</w:t>
       </w:r>
       <w:r>
         <w:t xml:space="preserve"> </w:t>
@@ -8254,7 +8366,7 @@
         <w:t xml:space="preserve">pattern</w:t>
       </w:r>
       <w:r>
-        <w:t xml:space="preserve">. It is not — if anything the asymmetry runs the other way. DiffractGPT is conditioned on a</w:t>
+        <w:t xml:space="preserve">. It is not; if anything the asymmetry runs the other way. DiffractGPT is conditioned on a</w:t>
       </w:r>
       <w:r>
         <w:t xml:space="preserve"> </w:t>
@@ -8282,7 +8394,7 @@
         <w:t xml:space="preserve">;</w:t>
       </w:r>
       <w:r>
-        <w:t xml:space="preserve">-separated string) — an order of magnitude lower resolution than PXRD-Diff’s 4 251-bin 0.02° input — yet it still reaches 18.9 %. So the baselines do not win by seeing more of the pattern. The asymmetries that do matter are</w:t>
+        <w:t xml:space="preserve">-separated string), an order of magnitude lower resolution than PXRD-Diff’s 4 251-bin 0.02° input, yet it still reaches 18.9 %. So the baselines do not win by seeing more of the pattern. The asymmetries that do matter are</w:t>
       </w:r>
       <w:r>
         <w:t xml:space="preserve"> </w:t>
@@ -8298,7 +8410,7 @@
         <w:t xml:space="preserve"> </w:t>
       </w:r>
       <w:r>
-        <w:t xml:space="preserve">(DiffractGPT is a 7 B-parameter LLM; PXRD-Diff is 3.7 M — three orders of magnitude) and</w:t>
+        <w:t xml:space="preserve">(DiffractGPT is a 7 B-parameter LLM; PXRD-Diff is 3.7 M, three orders of magnitude) and</w:t>
       </w:r>
       <w:r>
         <w:t xml:space="preserve"> </w:t>
@@ -8317,7 +8429,7 @@
         <w:t xml:space="preserve">(PXRDnet’s ~35 k-op latent optimisation vs our single DDIM pass). The honest reading of Table 3 is therefore a capability/compute gap at fixed input information, not an input-handicap artefact; it is exactly the gap a deliberately small diagnostic model is expected to exhibit (§6).</w:t>
       </w:r>
     </w:p>
-    <w:bookmarkStart w:id="61" w:name="fig:threeway"/>
+    <w:bookmarkStart w:id="63" w:name="fig:threeway"/>
     <w:p>
       <w:pPr>
         <w:pStyle w:val="CaptionedFigure"/>
@@ -8327,18 +8439,18 @@
           <wp:inline>
             <wp:extent cx="5334000" cy="2210273"/>
             <wp:effectExtent b="0" l="0" r="0" t="0"/>
-            <wp:docPr descr="Figure 4. Three-way headline comparison. Match rate, all-correct, and pattern-Pearson on the same MP-20 test materials scored through our StructureMatcher harness, with 95 % Wilson CIs. PXRD-Diff loses on match rate by 12–19× but wins on per-pattern Pearson. Note the wide PXRDnet (n = 20) intervals: the DGpt &gt; PXRDnet all-correct ordering is a hypothesis, not an established result (§5.3, §6)." title="" id="59" name="Picture"/>
+            <wp:docPr descr="Figure 4. Three-way headline comparison. Match rate, all-correct, and pattern-Pearson on the same MP-20 test materials scored through our StructureMatcher harness, with 95 % Wilson CIs. PXRD-Diff loses on match rate by 12–19× but wins on per-pattern Pearson. Note the wide PXRDnet (n = 20) intervals: the DGpt &gt; PXRDnet all-correct ordering is a hypothesis, not an established result (§5.3, §6)." title="" id="61" name="Picture"/>
             <a:graphic>
               <a:graphicData uri="http://schemas.openxmlformats.org/drawingml/2006/picture">
                 <pic:pic>
                   <pic:nvPicPr>
-                    <pic:cNvPr descr="fig5_threeway_headline.png" id="60" name="Picture"/>
+                    <pic:cNvPr descr="fig5_threeway_headline.png" id="62" name="Picture"/>
                     <pic:cNvPicPr>
                       <a:picLocks noChangeArrowheads="1" noChangeAspect="1"/>
                     </pic:cNvPicPr>
                   </pic:nvPicPr>
                   <pic:blipFill>
-                    <a:blip r:embed="rId58"/>
+                    <a:blip r:embed="rId60"/>
                     <a:stretch>
                       <a:fillRect/>
                     </a:stretch>
@@ -8408,7 +8520,7 @@
         <w:t xml:space="preserve">harness, with 95 % Wilson CIs. PXRD-Diff loses on match rate by 12–19× but wins on per-pattern Pearson. Note the wide PXRDnet (n = 20) intervals: the DGpt &gt; PXRDnet all-correct ordering is a hypothesis, not an established result (§5.3, §6).</w:t>
       </w:r>
     </w:p>
-    <w:bookmarkEnd w:id="61"/>
+    <w:bookmarkEnd w:id="63"/>
     <w:p>
       <w:pPr>
         <w:pStyle w:val="BodyText"/>
@@ -8424,14 +8536,14 @@
         <w:t xml:space="preserve"> </w:t>
       </w:r>
       <w:r>
-        <w:t xml:space="preserve">PXRDnet n = 20 has a 95 % Wilson CI of roughly ±20 pp on every rate; n = 200 would need ~33 days of RTX 5090 rental at ~4 GPU-hr/material. Patterns are simulated through each model’s own preprocessing (different bins, 2θ vs Q, broadening) — material_ids are identical, pattern inputs are not bit-identical; §7 bounds this.</w:t>
-      </w:r>
-    </w:p>
-    <w:bookmarkEnd w:id="62"/>
-    <w:bookmarkStart w:id="68" w:name="what-did-not-work"/>
-    <w:p>
-      <w:pPr>
-        <w:pStyle w:val="Heading3"/>
+        <w:t xml:space="preserve">PXRDnet n = 20 has a 95 % Wilson CI of roughly ±20 pp on every rate; n = 200 would need ~33 days of RTX 5090 rental at ~4 GPU-hr/material. Patterns are simulated through each model’s own preprocessing (different bins, 2θ vs Q, broadening): material_ids are identical, pattern inputs are not bit-identical; §7 bounds this.</w:t>
+      </w:r>
+    </w:p>
+    <w:bookmarkEnd w:id="64"/>
+    <w:bookmarkStart w:id="70" w:name="what-did-not-work"/>
+    <w:p>
+      <w:pPr>
+        <w:pStyle w:val="Heading2"/>
       </w:pPr>
       <w:r>
         <w:t xml:space="preserve">5.4 What did</w:t>
@@ -8627,7 +8739,7 @@
         <w:t xml:space="preserve"> </w:t>
       </w:r>
       <w:r>
-        <w:t xml:space="preserve">on n = 200: flat 1.0–2.5 % within noise, all-correct 0 % throughout. Sampling-time Debye gradient is too noisy to steer the trajectory — consistent with Segal et al.</w:t>
+        <w:t xml:space="preserve">on n = 200: flat 1.0–2.5 % within noise, all-correct 0 % throughout. Sampling-time Debye gradient is too noisy to steer the trajectory, consistent with Segal et al.</w:t>
       </w:r>
       <w:r>
         <w:t xml:space="preserve"> </w:t>
@@ -8636,7 +8748,7 @@
         <w:rPr>
           <w:rStyle w:val="FootnoteReference"/>
         </w:rPr>
-        <w:footnoteReference w:id="63"/>
+        <w:footnoteReference w:id="65"/>
       </w:r>
       <w:r>
         <w:t xml:space="preserve">, who show the powder-XRD similarity loss landscape is too non-convex for direct gradient descent.</w:t>
@@ -8681,7 +8793,7 @@
         <w:t xml:space="preserve">added to atom features. The embedding learns (5 404/6 912 entries non-zero) but match drops 2.5 % → 2.1 % and destabilises lattice prediction (lat loss ~0.6 vs ~0.02; Figure 5). We suspect inflated atom-feature norm shifts the lattice-pool input distribution.</w:t>
       </w:r>
     </w:p>
-    <w:bookmarkStart w:id="67" w:name="fig:training"/>
+    <w:bookmarkStart w:id="69" w:name="fig:training"/>
     <w:p>
       <w:pPr>
         <w:pStyle w:val="CaptionedFigure"/>
@@ -8691,18 +8803,18 @@
           <wp:inline>
             <wp:extent cx="5334000" cy="2277073"/>
             <wp:effectExtent b="0" l="0" r="0" t="0"/>
-            <wp:docPr descr="Figure 5. Wyckoff embedding destabilises lattice prediction. Lattice (a) and coordinate (b) training-loss curves for the distance-aux run (v16) vs the Wyckoff-embedding run (v15). Adding the Wyckoff embedding inflates the lattice loss by an order of magnitude (~0.6 vs ~0.02) while leaving the coordinate loss largely unchanged — the failure is localised to the lattice channel." title="" id="65" name="Picture"/>
+            <wp:docPr descr="Figure 5. Wyckoff embedding destabilises lattice prediction. Lattice (a) and coordinate (b) training-loss curves for the distance-aux run (v16) vs the Wyckoff-embedding run (v15). Adding the Wyckoff embedding inflates the lattice loss by an order of magnitude (~0.6 vs ~0.02) while leaving the coordinate loss largely unchanged; the failure is localised to the lattice channel." title="" id="67" name="Picture"/>
             <a:graphic>
               <a:graphicData uri="http://schemas.openxmlformats.org/drawingml/2006/picture">
                 <pic:pic>
                   <pic:nvPicPr>
-                    <pic:cNvPr descr="fig2_training_curves.png" id="66" name="Picture"/>
+                    <pic:cNvPr descr="fig2_training_curves.png" id="68" name="Picture"/>
                     <pic:cNvPicPr>
                       <a:picLocks noChangeArrowheads="1" noChangeAspect="1"/>
                     </pic:cNvPicPr>
                   </pic:nvPicPr>
                   <pic:blipFill>
-                    <a:blip r:embed="rId64"/>
+                    <a:blip r:embed="rId66"/>
                     <a:stretch>
                       <a:fillRect/>
                     </a:stretch>
@@ -8744,10 +8856,10 @@
         <w:t xml:space="preserve"> </w:t>
       </w:r>
       <w:r>
-        <w:t xml:space="preserve">Lattice (a) and coordinate (b) training-loss curves for the distance-aux run (v16) vs the Wyckoff-embedding run (v15). Adding the Wyckoff embedding inflates the lattice loss by an order of magnitude (~0.6 vs ~0.02) while leaving the coordinate loss largely unchanged — the failure is localised to the lattice channel.</w:t>
-      </w:r>
-    </w:p>
-    <w:bookmarkEnd w:id="67"/>
+        <w:t xml:space="preserve">Lattice (a) and coordinate (b) training-loss curves for the distance-aux run (v16) vs the Wyckoff-embedding run (v15). Adding the Wyckoff embedding inflates the lattice loss by an order of magnitude (~0.6 vs ~0.02) while leaving the coordinate loss largely unchanged; the failure is localised to the lattice channel.</w:t>
+      </w:r>
+    </w:p>
+    <w:bookmarkEnd w:id="69"/>
     <w:p>
       <w:pPr>
         <w:pStyle w:val="BodyText"/>
@@ -8820,11 +8932,11 @@
         <w:t xml:space="preserve">Wyckoff + distance loss together collapses to 0.8 %, below the bare ε baseline; the two interact destructively, no clean theoretical explanation.</w:t>
       </w:r>
     </w:p>
-    <w:bookmarkEnd w:id="68"/>
-    <w:bookmarkStart w:id="69" w:name="encoder-bottleneck-perturbation-study"/>
-    <w:p>
-      <w:pPr>
-        <w:pStyle w:val="Heading3"/>
+    <w:bookmarkEnd w:id="70"/>
+    <w:bookmarkStart w:id="71" w:name="encoder-bottleneck-perturbation-study"/>
+    <w:p>
+      <w:pPr>
+        <w:pStyle w:val="Heading2"/>
       </w:pPr>
       <w:r>
         <w:t xml:space="preserve">5.5 Encoder-bottleneck perturbation study</w:t>
@@ -8851,7 +8963,7 @@
         <w:t xml:space="preserve"> </w:t>
       </w:r>
       <w:r>
-        <w:t xml:space="preserve">coordinates plugged into the differentiable simulator hits 0.97 — the encoder + denoiser leaves ~0.5 of pattern-space agreement on the table. The aux head (sees</w:t>
+        <w:t xml:space="preserve">coordinates plugged into the differentiable simulator hits 0.97; the encoder + denoiser leaves ~0.5 of pattern-space agreement on the table. The aux head (sees</w:t>
       </w:r>
       <w:r>
         <w:t xml:space="preserve"> </w:t>
@@ -8884,7 +8996,7 @@
         <w:t xml:space="preserve"> </w:t>
       </w:r>
       <w:r>
-        <w:t xml:space="preserve">lattice-regression loss — but that figure is a relative fit that does</w:t>
+        <w:t xml:space="preserve">lattice-regression loss, but that figure is a relative fit that does</w:t>
       </w:r>
       <w:r>
         <w:t xml:space="preserve"> </w:t>
@@ -8921,17 +9033,14 @@
         <w:t xml:space="preserve">predictable</w:t>
       </w:r>
       <w:r>
-        <w:t xml:space="preserve"> </w:t>
-      </w:r>
-      <w:r>
-        <w:t xml:space="preserve">— it works where it can.</w:t>
-      </w:r>
-    </w:p>
-    <w:bookmarkEnd w:id="69"/>
-    <w:bookmarkStart w:id="70" w:name="Xe14ee5fe759b907ea0190421ae7272432ef5613"/>
-    <w:p>
-      <w:pPr>
-        <w:pStyle w:val="Heading3"/>
+        <w:t xml:space="preserve">: it works where it can.</w:t>
+      </w:r>
+    </w:p>
+    <w:bookmarkEnd w:id="71"/>
+    <w:bookmarkStart w:id="72" w:name="Xe14ee5fe759b907ea0190421ae7272432ef5613"/>
+    <w:p>
+      <w:pPr>
+        <w:pStyle w:val="Heading2"/>
       </w:pPr>
       <w:r>
         <w:t xml:space="preserve">5.6 Why the learned lattice fails: a pooling bottleneck, not a head bottleneck</w:t>
@@ -8942,7 +9051,7 @@
         <w:pStyle w:val="FirstParagraph"/>
       </w:pPr>
       <w:r>
-        <w:t xml:space="preserve">The natural reading of the 0.007 aux loss — that the lattice is already recoverable from the encoder and only the denoiser is at fault — is testable, and it is wrong. Two experiments (released as</w:t>
+        <w:t xml:space="preserve">The natural reading of the 0.007 aux loss, that the lattice is already recoverable from the encoder and only the denoiser is at fault, is testable, and it is wrong. Two experiments (released as</w:t>
       </w:r>
       <w:r>
         <w:t xml:space="preserve"> </w:t>
@@ -9074,7 +9183,7 @@
         <w:t xml:space="preserve"> </w:t>
       </w:r>
       <w:r>
-        <w:t xml:space="preserve">cell validity — far better conditioned than the diffusion sampler, whose predicted cells are near-0 % valid, but still ~15 % relative length error. End-to-end this recovers</w:t>
+        <w:t xml:space="preserve">cell validity, far better conditioned than the diffusion sampler, whose predicted cells are near-0 % valid, but still ~15 % relative length error. End-to-end this recovers</w:t>
       </w:r>
       <w:r>
         <w:t xml:space="preserve"> </w:t>
@@ -9190,7 +9299,7 @@
         <w:t xml:space="preserve"> </w:t>
       </w:r>
       <w:r>
-        <w:t xml:space="preserve">fit — enough to place the crystal system (a space-group head on the same encoder reaches 39 % top-1 / 71 % top-5 across 230 classes, released under</w:t>
+        <w:t xml:space="preserve">fit, enough to place the crystal system (a space-group head on the same encoder reaches 39 % top-1 / 71 % top-5 across 230 classes, released under</w:t>
       </w:r>
       <w:r>
         <w:t xml:space="preserve"> </w:t>
@@ -9218,7 +9327,7 @@
         <w:t xml:space="preserve"> </w:t>
       </w:r>
       <w:r>
-        <w:t xml:space="preserve">directly rather than a pooled summary; this is why §5.2’s lift lives entirely in the high-symmetry systems where peak positions over-determine the cell, and why head-side fixes (Phase 5 here, top-K rerank in §5.4) cannot substitute for it. The architectural implication is concrete: the next gain must come from the encoder — explicit d-spacing/peak extraction or per-peak attention in place of global pooling — not from a better lattice head or a better denoiser.</w:t>
+        <w:t xml:space="preserve">directly rather than a pooled summary; this is why §5.2’s lift lives entirely in the high-symmetry systems where peak positions over-determine the cell, and why head-side fixes (Phase 5 here, top-K rerank in §5.4) cannot substitute for it. The architectural implication is concrete: the next gain must come from the encoder (explicit d-spacing/peak extraction or per-peak attention in place of global pooling), not from a better lattice head or a better denoiser.</w:t>
       </w:r>
     </w:p>
     <w:p>
@@ -9228,12 +9337,12 @@
         </w:pict>
       </w:r>
     </w:p>
-    <w:bookmarkEnd w:id="70"/>
-    <w:bookmarkEnd w:id="71"/>
-    <w:bookmarkStart w:id="72" w:name="discussion"/>
-    <w:p>
-      <w:pPr>
-        <w:pStyle w:val="Heading2"/>
+    <w:bookmarkEnd w:id="72"/>
+    <w:bookmarkEnd w:id="73"/>
+    <w:bookmarkStart w:id="74" w:name="discussion"/>
+    <w:p>
+      <w:pPr>
+        <w:pStyle w:val="Heading1"/>
       </w:pPr>
       <w:r>
         <w:t xml:space="preserve">6. Discussion</w:t>
@@ -9300,7 +9409,7 @@
         <w:t xml:space="preserve"> </w:t>
       </w:r>
       <w:r>
-        <w:t xml:space="preserve">structure, but it is a relative fit: feeding the aux head’s own lattice to the sampler recovers only 1.2 % (§5.6), and stronger constrained-head supervision does not move its ~1.1 Å error. The limiter is therefore the global pooling that discards absolute peak-position fidelity, not the denoiser’s use of an otherwise-adequate signal; the disjoint oracle-vs-indexer CIs (§5.2) make the lattice’s role the paper’s statistically firmest claim. The Q-space autoindexer, which reads peak positions directly, recovers part of the 5.6 % oracle ceiling on the high-symmetry subset; top-K rerank and gradient guidance fail because they operate</w:t>
+        <w:t xml:space="preserve">structure, but it is a relative fit: feeding the aux head’s own lattice to the sampler recovers only 1.2 % (§5.6), and stronger constrained-head supervision does not move its ~1.1 Å error. The limiter is therefore the global pooling that discards absolute peak-position fidelity, not the denoiser’s use of an otherwise-adequate signal; the disjoint oracle-vs-indexer CIs (§5.2) make the lattice’s role the paper’s statistically firmest claim. The Q-space autoindexer, which reads peak positions directly, recovers part of the 4.5 % oracle ceiling on the high-symmetry subset; top-K rerank and gradient guidance fail because they operate</w:t>
       </w:r>
       <w:r>
         <w:t xml:space="preserve"> </w:t>
@@ -9316,7 +9425,7 @@
         <w:t xml:space="preserve"> </w:t>
       </w:r>
       <w:r>
-        <w:t xml:space="preserve">the encoder commits to a bad lattice prior, while the indexer bypasses that decision. (The oracle ceiling is itself only 5.6 %, so even a perfect lattice leaves coordinates as a co-limiter — see §8.)</w:t>
+        <w:t xml:space="preserve">the encoder commits to a bad lattice prior, while the indexer bypasses that decision. (The oracle ceiling is itself only 4.5 %, so even a perfect lattice leaves coordinates as a co-limiter; see §8.)</w:t>
       </w:r>
     </w:p>
     <w:p>
@@ -9361,10 +9470,7 @@
         <w:t xml:space="preserve">output</w:t>
       </w:r>
       <w:r>
-        <w:t xml:space="preserve"> </w:t>
-      </w:r>
-      <w:r>
-        <w:t xml:space="preserve">— predict an unordered set of orbits plus a Hungarian-style matcher.</w:t>
+        <w:t xml:space="preserve">: predict an unordered set of orbits plus a Hungarian-style matcher.</w:t>
       </w:r>
     </w:p>
     <w:p>
@@ -9414,7 +9520,7 @@
         <w:t xml:space="preserve"> </w:t>
       </w:r>
       <w:r>
-        <w:t xml:space="preserve">recovery — DGpt’s CIF-token output appears to encode space group in a way PXRDnet’s coordinate decode does not. We stress that the underlying numbers cannot yet support this: PXRDnet’s all-correct CI [0.9, 23.6] at n = 20 overlaps DGpt’s, so the ordering is unconfirmed. We raise it as a</w:t>
+        <w:t xml:space="preserve">recovery: DGpt’s CIF-token output appears to encode space group in a way PXRDnet’s coordinate decode does not. We stress that the underlying numbers cannot yet support this: PXRDnet’s all-correct CI [0.9, 23.6] at n = 20 overlaps DGpt’s, so the ordering is unconfirmed. We raise it as a</w:t>
       </w:r>
       <w:r>
         <w:t xml:space="preserve"> </w:t>
@@ -9460,7 +9566,7 @@
         <w:t xml:space="preserve"> </w:t>
       </w:r>
       <w:r>
-        <w:t xml:space="preserve">At 1.6 % we are 12–19× behind much larger systems, but small models make the encoder bottleneck visible (capacity hides it) and the indexer drop-in trivial to integrate (larger models would need architecture-level surgery). The recipe — encoder + Phase 4 fixes + Phase 9 indexer drop-in — is 3.7 M parameters and runs inference in seconds.</w:t>
+        <w:t xml:space="preserve">At 1.6 % we are 12–19× behind much larger systems, but small models make the encoder bottleneck visible (capacity hides it) and the indexer drop-in trivial to integrate (larger models would need architecture-level surgery). The recipe (encoder + Phase 4 fixes + Phase 9 indexer drop-in) is 3.7 M parameters and runs inference in seconds.</w:t>
       </w:r>
     </w:p>
     <w:p>
@@ -9470,11 +9576,11 @@
         </w:pict>
       </w:r>
     </w:p>
-    <w:bookmarkEnd w:id="72"/>
-    <w:bookmarkStart w:id="73" w:name="limitations"/>
-    <w:p>
-      <w:pPr>
-        <w:pStyle w:val="Heading2"/>
+    <w:bookmarkEnd w:id="74"/>
+    <w:bookmarkStart w:id="75" w:name="limitations"/>
+    <w:p>
+      <w:pPr>
+        <w:pStyle w:val="Heading1"/>
       </w:pPr>
       <w:r>
         <w:t xml:space="preserve">7. Limitations</w:t>
@@ -9499,7 +9605,7 @@
         <w:t xml:space="preserve"> </w:t>
       </w:r>
       <w:r>
-        <w:t xml:space="preserve">Composition given; simulated PXRD only (no instrument response, preferred orientation, asymmetry, background); MP-20 only — no larger cells, organics, or higher-Z.</w:t>
+        <w:t xml:space="preserve">Composition given; simulated PXRD only (no instrument response, preferred orientation, asymmetry, background); MP-20 only, with no larger cells, organics, or higher-Z.</w:t>
       </w:r>
     </w:p>
     <w:p>
@@ -9521,7 +9627,55 @@
         <w:t xml:space="preserve"> </w:t>
       </w:r>
       <w:r>
-        <w:t xml:space="preserve">The Phase 4 ablations are single-seed; their large effects (the 2.5–3.5× x₀-residual and lattice-input lifts) are robust to this, and the oracle-vs-indexer gap has disjoint CIs. The indexer-vs-learned-head comparison was rerun at three seeds and the lift confirmed significant by a paired McNemar test (p &lt; 10⁻⁴; §5.2) — superseding the earlier underpowered unpaired test (p = 0.24). We did not multi-seed the oracle or the Phase 4 ablation runs.</w:t>
+        <w:t xml:space="preserve">The Phase 4 ablations in Table 1 are single-seed. A multi-seed checkpoint sweep of the ε-vs-x₀-residual contrast (two seeds × five checkpoints, 20k–100k, true-lattice n = 1000) shows the reported 3.5×</w:t>
+      </w:r>
+      <w:r>
+        <w:t xml:space="preserve"> </w:t>
+      </w:r>
+      <w:r>
+        <w:rPr>
+          <w:i/>
+          <w:iCs/>
+        </w:rPr>
+        <w:t xml:space="preserve">match-rate</w:t>
+      </w:r>
+      <w:r>
+        <w:t xml:space="preserve"> </w:t>
+      </w:r>
+      <w:r>
+        <w:t xml:space="preserve">lift does</w:t>
+      </w:r>
+      <w:r>
+        <w:t xml:space="preserve"> </w:t>
+      </w:r>
+      <w:r>
+        <w:rPr>
+          <w:b/>
+          <w:bCs/>
+        </w:rPr>
+        <w:t xml:space="preserve">not</w:t>
+      </w:r>
+      <w:r>
+        <w:t xml:space="preserve"> </w:t>
+      </w:r>
+      <w:r>
+        <w:t xml:space="preserve">replicate: pooled match is 1.20 % (ε) vs 1.35 % (x₀-residual), and x₀ never exceeds 1.5 % at any checkpoint, including the 80 k checkpoint that matches the original v13’s 79.5 k, so the single-seed 2.51 % was a high draw, not a checkpoint-selection effect. We therefore demote the</w:t>
+      </w:r>
+      <w:r>
+        <w:t xml:space="preserve"> </w:t>
+      </w:r>
+      <w:r>
+        <w:rPr>
+          <w:i/>
+          <w:iCs/>
+        </w:rPr>
+        <w:t xml:space="preserve">match-rate</w:t>
+      </w:r>
+      <w:r>
+        <w:t xml:space="preserve"> </w:t>
+      </w:r>
+      <w:r>
+        <w:t xml:space="preserve">lift to a single-seed artifact. What does reproduce is the pattern-Pearson improvement (ε 0.359 vs x₀ 0.403, with disjoint ranges across both seeds), consistent with Table 1. The lattice-input fix remains load-bearing as a training-dynamics result (lattice loss 1.0 → 0.02), and the oracle-vs-indexer gap has disjoint CIs. The indexer-vs-learned-head comparison was rerun at three seeds and the lift confirmed significant by a paired McNemar test (p &lt; 10⁻⁴; §5.2), superseding the earlier underpowered unpaired test (p = 0.24). The oracle has since been multi-seeded: three seeds give 4.5 % [3.8, 5.3] pooled, firming the single-seed 5.6 %.</w:t>
       </w:r>
     </w:p>
     <w:p>
@@ -9543,7 +9697,7 @@
         <w:t xml:space="preserve"> </w:t>
       </w:r>
       <w:r>
-        <w:t xml:space="preserve">PXRDnet n = 20 has a 95 % Wilson CI of ≈ ±20 pp; the DGpt &gt; PXRDnet all-correct ordering (§5.3/§6) is therefore a hypothesis, not a result. n = 200 needs ~33 days RTX 5090. Crystalyze checkpoint download is inactive (verified 2026-06-01); cited but unreproduced. Patterns are not bit-identical across the three preprocessors (PXRD-Diff 4 251-bin 2θ, DGpt 300-bin 2θ, PXRDnet 4 096-bin Q with sinc² broadening) — structures match, patterns do not; we did not quantify the residual preprocessing effect on match rate, and a matched-vs-native re-scoring on a structure subset is the natural check.</w:t>
+        <w:t xml:space="preserve">PXRDnet n = 20 has a 95 % Wilson CI of ≈ ±20 pp; the DGpt &gt; PXRDnet all-correct ordering (§5.3/§6) is therefore a hypothesis, not a result. n = 200 needs ~33 days RTX 5090. Crystalyze checkpoint download is inactive (verified 2026-06-01); cited but unreproduced. Patterns are not bit-identical across the three preprocessors (PXRD-Diff 4 251-bin 2θ, DGpt 300-bin 2θ, PXRDnet 4 096-bin Q with sinc² broadening): structures match, patterns do not; we did not quantify the residual preprocessing effect on match rate, and a matched-vs-native re-scoring on a structure subset is the natural check.</w:t>
       </w:r>
     </w:p>
     <w:p>
@@ -9612,7 +9766,7 @@
         <w:t xml:space="preserve"> </w:t>
       </w:r>
       <w:r>
-        <w:t xml:space="preserve">simulations with no zero-point shift, sample-displacement error, or peak asymmetry — precisely the perturbations that drive real-world indexing failure. The 48.8 % native-indexer match and the downstream 1.5 % should be read as upper bounds under ideal peak positions; we did not measure degradation under a zero-shift/displacement perturbation, which is the natural robustness check.</w:t>
+        <w:t xml:space="preserve">simulations with no zero-point shift, sample-displacement error, or peak asymmetry, precisely the perturbations that drive real-world indexing failure. The 48.8 % native-indexer match and the downstream 1.5 % should be read as upper bounds under ideal peak positions. A zero-shift/displacement robustness sweep (n = 300) confirms the concern: the indexer’s length-MAE rises from 1.24 Å on clean patterns past the v20 learned head’s 1.37 Å once displacement or zero-shift exceeds ~0.10°, so the indexer’s advantage over the learned head holds only for well-calibrated input.</w:t>
       </w:r>
     </w:p>
     <w:p>
@@ -9696,11 +9850,11 @@
         </w:pict>
       </w:r>
     </w:p>
-    <w:bookmarkEnd w:id="73"/>
-    <w:bookmarkStart w:id="74" w:name="conclusion"/>
-    <w:p>
-      <w:pPr>
-        <w:pStyle w:val="Heading2"/>
+    <w:bookmarkEnd w:id="75"/>
+    <w:bookmarkStart w:id="76" w:name="conclusion"/>
+    <w:p>
+      <w:pPr>
+        <w:pStyle w:val="Heading1"/>
       </w:pPr>
       <w:r>
         <w:t xml:space="preserve">8. Conclusion</w:t>
@@ -9711,7 +9865,7 @@
         <w:pStyle w:val="FirstParagraph"/>
       </w:pPr>
       <w:r>
-        <w:t xml:space="preserve">A 3.7 M-parameter conditional diffusion model with a differentiable Bragg loss recovers 1.5 % [1.2, 2.0] of MP-20 test structures with a classical Q-space autoindexer supplying the lattice — a significant improvement over the learned lattice head, which recovers essentially nothing (three-seed paired McNemar p &lt; 10⁻⁴) — and 5.6 % [4.3, 7.2] under a true-lattice oracle. The oracle gap is significant and is the paper’s firmest result: even with a perfect lattice, coordinate prediction caps match at 5.6 %, while lattice error explains the rest of the shortfall to that ceiling. Reproduced on the same</w:t>
+        <w:t xml:space="preserve">A 3.7 M-parameter conditional diffusion model with a differentiable Bragg loss recovers 1.5 % [1.2, 2.0] of MP-20 test structures with a classical Q-space autoindexer supplying the lattice, a significant improvement over the learned lattice head, which recovers essentially nothing (three-seed paired McNemar p &lt; 10⁻⁴), and 4.5 % [3.8, 5.3] under a true-lattice oracle (three seeds, firming an earlier single-seed 5.6 %). The oracle gap is significant and is the paper’s firmest result: even with a perfect lattice, coordinate prediction caps match at 4.5 %, while lattice error explains the rest of the shortfall to that ceiling. Reproduced on the same</w:t>
       </w:r>
       <w:r>
         <w:t xml:space="preserve"> </w:t>
@@ -9726,7 +9880,7 @@
         <w:t xml:space="preserve"> </w:t>
       </w:r>
       <w:r>
-        <w:t xml:space="preserve">harness, DGpt reaches 18.9 % / 15.9 % and PXRDnet 30.0 % / 5.0 % (match / all-correct) — PXRD-Diff is 12–19× behind. The apparent divergence in their space-group recovery is a measurement hypothesis the n = 20 PXRDnet sample cannot yet confirm, but the shared harness now makes it testable. Two architectural fixes (lattice-input, x₀-residual) and one drop-in (classical autoindexer) are load-bearing; six other interventions are documented as failures. Code, checkpoints, all per-phase JSONs, both indexer paths, and the differentiable Bragg module are released.</w:t>
+        <w:t xml:space="preserve">harness, deCIFer reaches 73.8 % / 69.5 %, DGpt 18.9 % / 15.9 %, and PXRDnet 30.0 % / 5.0 % (match / all-correct); PXRD-Diff is 12–46× behind. The apparent divergence in their space-group recovery is a measurement hypothesis the n = 20 PXRDnet sample cannot yet confirm, but the shared harness now makes it testable. The lattice-input fix and the classical-autoindexer drop-in are load-bearing; the x₀-residual switch improves pattern-Pearson but its single-seed match-rate lift did not replicate (§7); the remaining interventions are documented as failures. Code, checkpoints, all per-phase JSONs, both indexer paths, and the differentiable Bragg module are released.</w:t>
       </w:r>
     </w:p>
     <w:p>
@@ -9736,11 +9890,11 @@
         </w:pict>
       </w:r>
     </w:p>
-    <w:bookmarkEnd w:id="74"/>
-    <w:bookmarkStart w:id="75" w:name="acknowledgments"/>
-    <w:p>
-      <w:pPr>
-        <w:pStyle w:val="Heading2"/>
+    <w:bookmarkEnd w:id="76"/>
+    <w:bookmarkStart w:id="77" w:name="acknowledgments"/>
+    <w:p>
+      <w:pPr>
+        <w:pStyle w:val="Heading1"/>
       </w:pPr>
       <w:r>
         <w:t xml:space="preserve">Acknowledgments</w:t>
@@ -9796,11 +9950,11 @@
         <w:t xml:space="preserve">) for releasing checkpoints and code that made the head-to-head reproduction in §5.3 possible. Compute was rented from Vast.ai; total spend was approximately USD 25 across roughly 30 GPU-hours on RTX 5090 instances (Phase 4 ablation, Phase 9 retrain + indexer sweeps, DiffractGPT n = 1 000 inference, and PXRDnet n = 20 inference).</w:t>
       </w:r>
     </w:p>
-    <w:bookmarkEnd w:id="75"/>
-    <w:bookmarkStart w:id="76" w:name="author-contributions-credit"/>
-    <w:p>
-      <w:pPr>
-        <w:pStyle w:val="Heading2"/>
+    <w:bookmarkEnd w:id="77"/>
+    <w:bookmarkStart w:id="78" w:name="author-contributions-credit"/>
+    <w:p>
+      <w:pPr>
+        <w:pStyle w:val="Heading1"/>
       </w:pPr>
       <w:r>
         <w:t xml:space="preserve">Author Contributions (CRediT)</w:t>
@@ -9811,14 +9965,14 @@
         <w:pStyle w:val="FirstParagraph"/>
       </w:pPr>
       <w:r>
-        <w:t xml:space="preserve">F. Cai: Conceptualization, Methodology, Software, Validation, Formal analysis, Investigation, Data curation, Writing — Original Draft, Writing — Review &amp; Editing, Visualization, Project administration.</w:t>
-      </w:r>
-    </w:p>
-    <w:bookmarkEnd w:id="76"/>
-    <w:bookmarkStart w:id="77" w:name="conflict-of-interest"/>
-    <w:p>
-      <w:pPr>
-        <w:pStyle w:val="Heading2"/>
+        <w:t xml:space="preserve">F. Cai: Conceptualization, Methodology, Software, Validation, Formal analysis, Investigation, Data curation, Writing – Original Draft, Writing – Review &amp; Editing, Visualization, Project administration.</w:t>
+      </w:r>
+    </w:p>
+    <w:bookmarkEnd w:id="78"/>
+    <w:bookmarkStart w:id="79" w:name="conflict-of-interest"/>
+    <w:p>
+      <w:pPr>
+        <w:pStyle w:val="Heading1"/>
       </w:pPr>
       <w:r>
         <w:t xml:space="preserve">Conflict of Interest</w:t>
@@ -9832,11 +9986,11 @@
         <w:t xml:space="preserve">The author declares no competing interests.</w:t>
       </w:r>
     </w:p>
-    <w:bookmarkEnd w:id="77"/>
-    <w:bookmarkStart w:id="78" w:name="funding"/>
-    <w:p>
-      <w:pPr>
-        <w:pStyle w:val="Heading2"/>
+    <w:bookmarkEnd w:id="79"/>
+    <w:bookmarkStart w:id="80" w:name="funding"/>
+    <w:p>
+      <w:pPr>
+        <w:pStyle w:val="Heading1"/>
       </w:pPr>
       <w:r>
         <w:t xml:space="preserve">Funding</w:t>
@@ -9850,11 +10004,11 @@
         <w:t xml:space="preserve">This research received no external funding.</w:t>
       </w:r>
     </w:p>
-    <w:bookmarkEnd w:id="78"/>
-    <w:bookmarkStart w:id="79" w:name="data-and-code-availability"/>
-    <w:p>
-      <w:pPr>
-        <w:pStyle w:val="Heading2"/>
+    <w:bookmarkEnd w:id="80"/>
+    <w:bookmarkStart w:id="81" w:name="data-and-code-availability"/>
+    <w:p>
+      <w:pPr>
+        <w:pStyle w:val="Heading1"/>
       </w:pPr>
       <w:r>
         <w:t xml:space="preserve">Data and Code Availability</w:t>
@@ -9880,20 +10034,7 @@
         <w:t xml:space="preserve"> </w:t>
       </w:r>
       <w:r>
-        <w:t xml:space="preserve">and archived at Zenodo (DOI: 10.5281/zenodo.XXXXXXX —</w:t>
-      </w:r>
-      <w:r>
-        <w:t xml:space="preserve"> </w:t>
-      </w:r>
-      <w:r>
-        <w:rPr>
-          <w:i/>
-          <w:iCs/>
-        </w:rPr>
-        <w:t xml:space="preserve">to be minted at submission</w:t>
-      </w:r>
-      <w:r>
-        <w:t xml:space="preserve">). The MP-20 dataset is publicly available via the CDVAE benchmark. All experiments reproduce from a single</w:t>
+        <w:t xml:space="preserve">and archived at Zenodo (DOI: 10.5281/zenodo.20738994). The MP-20 dataset is publicly available via the CDVAE benchmark. All experiments reproduce from a single</w:t>
       </w:r>
       <w:r>
         <w:t xml:space="preserve"> </w:t>
@@ -9926,11 +10067,11 @@
         <w:t xml:space="preserve">pipeline; per-structure evaluation flags are released to support paired re-analysis.</w:t>
       </w:r>
     </w:p>
-    <w:bookmarkEnd w:id="79"/>
-    <w:bookmarkStart w:id="80" w:name="ethics-declaration"/>
-    <w:p>
-      <w:pPr>
-        <w:pStyle w:val="Heading2"/>
+    <w:bookmarkEnd w:id="81"/>
+    <w:bookmarkStart w:id="82" w:name="ethics-declaration"/>
+    <w:p>
+      <w:pPr>
+        <w:pStyle w:val="Heading1"/>
       </w:pPr>
       <w:r>
         <w:t xml:space="preserve">Ethics Declaration</w:t>
@@ -9951,11 +10092,11 @@
         </w:pict>
       </w:r>
     </w:p>
-    <w:bookmarkEnd w:id="80"/>
-    <w:bookmarkStart w:id="81" w:name="references"/>
-    <w:p>
-      <w:pPr>
-        <w:pStyle w:val="Heading2"/>
+    <w:bookmarkEnd w:id="82"/>
+    <w:bookmarkStart w:id="83" w:name="references"/>
+    <w:p>
+      <w:pPr>
+        <w:pStyle w:val="Heading1"/>
       </w:pPr>
       <w:r>
         <w:t xml:space="preserve">References</w:t>
@@ -10001,20 +10142,20 @@
         </w:pict>
       </w:r>
     </w:p>
-    <w:bookmarkEnd w:id="81"/>
-    <w:bookmarkStart w:id="86" w:name="appendix"/>
+    <w:bookmarkEnd w:id="83"/>
+    <w:bookmarkStart w:id="88" w:name="appendix"/>
+    <w:p>
+      <w:pPr>
+        <w:pStyle w:val="Heading1"/>
+      </w:pPr>
+      <w:r>
+        <w:t xml:space="preserve">Appendix</w:t>
+      </w:r>
+    </w:p>
+    <w:bookmarkStart w:id="84" w:name="a.-full-ablation-history"/>
     <w:p>
       <w:pPr>
         <w:pStyle w:val="Heading2"/>
-      </w:pPr>
-      <w:r>
-        <w:t xml:space="preserve">Appendix</w:t>
-      </w:r>
-    </w:p>
-    <w:bookmarkStart w:id="82" w:name="a.-full-ablation-history"/>
-    <w:p>
-      <w:pPr>
-        <w:pStyle w:val="Heading3"/>
       </w:pPr>
       <w:r>
         <w:t xml:space="preserve">A. Full ablation history</w:t>
@@ -10855,7 +10996,7 @@
                 <w:b/>
                 <w:bCs/>
               </w:rPr>
-              <w:t xml:space="preserve">1.6 % match (no-true-lat, indexer); 5.6 % (true-lat oracle)</w:t>
+              <w:t xml:space="preserve">1.6 % match (no-true-lat, indexer); 4.5 % (true-lat oracle, 3-seed)</w:t>
             </w:r>
           </w:p>
         </w:tc>
@@ -10872,11 +11013,11 @@
         </w:tc>
       </w:tr>
     </w:tbl>
-    <w:bookmarkEnd w:id="82"/>
-    <w:bookmarkStart w:id="83" w:name="b.-hyperparameter-sensitivity"/>
-    <w:p>
-      <w:pPr>
-        <w:pStyle w:val="Heading3"/>
+    <w:bookmarkEnd w:id="84"/>
+    <w:bookmarkStart w:id="85" w:name="b.-hyperparameter-sensitivity"/>
+    <w:p>
+      <w:pPr>
+        <w:pStyle w:val="Heading2"/>
       </w:pPr>
       <w:r>
         <w:t xml:space="preserve">B. Hyperparameter sensitivity</w:t>
@@ -10920,11 +11061,11 @@
         <w:t xml:space="preserve">showed (256, 3) as a reasonable Pareto point. The Debye loss weight was swept {0, 0.1, 1, 10} in early ε-prediction runs (v6–v9) without measurable effect on match rate; we re-fixed it at 1.0 for the x₀-residual runs by analogy.</w:t>
       </w:r>
     </w:p>
-    <w:bookmarkEnd w:id="83"/>
-    <w:bookmarkStart w:id="84" w:name="X984f5037fa8fa240d4e7791708ee54c226ae797"/>
-    <w:p>
-      <w:pPr>
-        <w:pStyle w:val="Heading3"/>
+    <w:bookmarkEnd w:id="85"/>
+    <w:bookmarkStart w:id="86" w:name="X984f5037fa8fa240d4e7791708ee54c226ae797"/>
+    <w:p>
+      <w:pPr>
+        <w:pStyle w:val="Heading2"/>
       </w:pPr>
       <w:r>
         <w:t xml:space="preserve">C. Differentiable simulator validation details</w:t>
@@ -11090,11 +11231,11 @@
         <w:t xml:space="preserve">on a 4-atom subset.</w:t>
       </w:r>
     </w:p>
-    <w:bookmarkEnd w:id="84"/>
-    <w:bookmarkStart w:id="85" w:name="d.-reproducibility-checklist"/>
-    <w:p>
-      <w:pPr>
-        <w:pStyle w:val="Heading3"/>
+    <w:bookmarkEnd w:id="86"/>
+    <w:bookmarkStart w:id="87" w:name="d.-reproducibility-checklist"/>
+    <w:p>
+      <w:pPr>
+        <w:pStyle w:val="Heading2"/>
       </w:pPr>
       <w:r>
         <w:t xml:space="preserve">D. Reproducibility checklist</w:t>
@@ -11172,9 +11313,8 @@
         <w:t xml:space="preserve">Code, checkpoints, logs, and full training scripts released</w:t>
       </w:r>
     </w:p>
-    <w:bookmarkEnd w:id="85"/>
-    <w:bookmarkEnd w:id="86"/>
     <w:bookmarkEnd w:id="87"/>
+    <w:bookmarkEnd w:id="88"/>
     <w:sectPr>
       <w:footnotePr>
         <w:numRestart w:val="eachSect"/>
@@ -11322,7 +11462,7 @@
       </w:r>
     </w:p>
   </w:footnote>
-  <w:footnote w:id="12">
+  <w:footnote w:id="11">
     <w:p>
       <w:pPr>
         <w:pStyle w:val="FootnoteText"/>
@@ -11337,7 +11477,7 @@
         <w:t xml:space="preserve"> </w:t>
       </w:r>
       <w:r>
-        <w:t xml:space="preserve">Choudhary, K. (2025). DiffractGPT: Atomic Structure Determination from X-ray Diffraction Patterns using a Generative Pretrained Transformer.</w:t>
+        <w:t xml:space="preserve">Johansen, F. L., Friis-Jensen, U., Dam, E. B., Jensen, K. M. Ø., Mercado, R., &amp; Selvan, R. (2025). deCIFer: Crystal Structure Prediction from Powder Diffraction Data using Autoregressive Language Models.</w:t>
       </w:r>
       <w:r>
         <w:t xml:space="preserve"> </w:t>
@@ -11347,37 +11487,13 @@
           <w:i/>
           <w:iCs/>
         </w:rPr>
-        <w:t xml:space="preserve">The Journal of Physical Chemistry Letters</w:t>
-      </w:r>
-      <w:r>
-        <w:t xml:space="preserve">, 16(8), 2110–2119. DOI: 10.1021/acs.jpclett.4c03137. Reproduced from HF checkpoint</w:t>
-      </w:r>
-      <w:r>
-        <w:t xml:space="preserve"> </w:t>
-      </w:r>
-      <w:r>
-        <w:rPr>
-          <w:rStyle w:val="VerbatimChar"/>
-        </w:rPr>
-        <w:t xml:space="preserve">knc6/diffractgpt_mistral_chemical_formula</w:t>
-      </w:r>
-      <w:r>
-        <w:t xml:space="preserve"> </w:t>
-      </w:r>
-      <w:r>
-        <w:t xml:space="preserve">and code at</w:t>
-      </w:r>
-      <w:r>
-        <w:t xml:space="preserve"> </w:t>
-      </w:r>
-      <w:r>
-        <w:rPr>
-          <w:rStyle w:val="VerbatimChar"/>
-        </w:rPr>
-        <w:t xml:space="preserve">github.com/atomgptlab/atomgpt</w:t>
-      </w:r>
-      <w:r>
-        <w:t xml:space="preserve">.</w:t>
+        <w:t xml:space="preserve">Transactions on Machine Learning Research</w:t>
+      </w:r>
+      <w:r>
+        <w:t xml:space="preserve"> </w:t>
+      </w:r>
+      <w:r>
+        <w:t xml:space="preserve">(arXiv:2502.02189).</w:t>
       </w:r>
     </w:p>
   </w:footnote>
@@ -11396,7 +11512,7 @@
         <w:t xml:space="preserve"> </w:t>
       </w:r>
       <w:r>
-        <w:t xml:space="preserve">Riesel, E. A., Mackey, T., Nilforoshan, H., Xu, M., Badding, C. K., Altman, A. B., Leskovec, J., &amp; Freedman, D. E. (2024). Crystal Structure Determination from Powder Diffraction Patterns with Generative Machine Learning.</w:t>
+        <w:t xml:space="preserve">Choudhary, K. (2025). DiffractGPT: Atomic Structure Determination from X-ray Diffraction Patterns using a Generative Pretrained Transformer.</w:t>
       </w:r>
       <w:r>
         <w:t xml:space="preserve"> </w:t>
@@ -11406,10 +11522,10 @@
           <w:i/>
           <w:iCs/>
         </w:rPr>
-        <w:t xml:space="preserve">Journal of the American Chemical Society</w:t>
-      </w:r>
-      <w:r>
-        <w:t xml:space="preserve">, 146(44), 30340–30348. DOI: 10.1021/jacs.4c10244. Code:</w:t>
+        <w:t xml:space="preserve">The Journal of Physical Chemistry Letters</w:t>
+      </w:r>
+      <w:r>
+        <w:t xml:space="preserve">, 16(8), 2110–2119. DOI: 10.1021/acs.jpclett.4c03137. Reproduced from HF checkpoint</w:t>
       </w:r>
       <w:r>
         <w:t xml:space="preserve"> </w:t>
@@ -11418,22 +11534,25 @@
         <w:rPr>
           <w:rStyle w:val="VerbatimChar"/>
         </w:rPr>
-        <w:t xml:space="preserve">github.com/ML-PXRD/Crystalyze</w:t>
-      </w:r>
-      <w:r>
-        <w:t xml:space="preserve">. We could not reproduce: the checkpoint download link is marked</w:t>
-      </w:r>
-      <w:r>
-        <w:t xml:space="preserve"> </w:t>
-      </w:r>
-      <w:r>
-        <w:t xml:space="preserve">“not yet active”</w:t>
-      </w:r>
-      <w:r>
-        <w:t xml:space="preserve"> </w:t>
-      </w:r>
-      <w:r>
-        <w:t xml:space="preserve">in the upstream README (verified 2026-06-01).</w:t>
+        <w:t xml:space="preserve">knc6/diffractgpt_mistral_chemical_formula</w:t>
+      </w:r>
+      <w:r>
+        <w:t xml:space="preserve"> </w:t>
+      </w:r>
+      <w:r>
+        <w:t xml:space="preserve">and code at</w:t>
+      </w:r>
+      <w:r>
+        <w:t xml:space="preserve"> </w:t>
+      </w:r>
+      <w:r>
+        <w:rPr>
+          <w:rStyle w:val="VerbatimChar"/>
+        </w:rPr>
+        <w:t xml:space="preserve">github.com/atomgptlab/atomgpt</w:t>
+      </w:r>
+      <w:r>
+        <w:t xml:space="preserve">.</w:t>
       </w:r>
     </w:p>
   </w:footnote>
@@ -11452,7 +11571,7 @@
         <w:t xml:space="preserve"> </w:t>
       </w:r>
       <w:r>
-        <w:t xml:space="preserve">Guo, G., Saidi, T. L., Terban, M. W., Valsecchi, M., Billinge, S. J. L., &amp; Lipson, H. (2025). Ab initio structure solutions from nanocrystalline powder diffraction data via diffusion models.</w:t>
+        <w:t xml:space="preserve">Riesel, E. A., Mackey, T., Nilforoshan, H., Xu, M., Badding, C. K., Altman, A. B., Leskovec, J., &amp; Freedman, D. E. (2024). Crystal Structure Determination from Powder Diffraction Patterns with Generative Machine Learning.</w:t>
       </w:r>
       <w:r>
         <w:t xml:space="preserve"> </w:t>
@@ -11462,10 +11581,10 @@
           <w:i/>
           <w:iCs/>
         </w:rPr>
-        <w:t xml:space="preserve">Nature Materials</w:t>
-      </w:r>
-      <w:r>
-        <w:t xml:space="preserve">, 24, 1726–1734. DOI: 10.1038/s41563-025-02220-y (Author Correction: 10.1038/s41563-025-02301-y; preprint arXiv:2406.10796). Reproduced from HF checkpoint</w:t>
+        <w:t xml:space="preserve">Journal of the American Chemical Society</w:t>
+      </w:r>
+      <w:r>
+        <w:t xml:space="preserve">, 146(44), 30340–30348. DOI: 10.1021/jacs.4c10244. Code:</w:t>
       </w:r>
       <w:r>
         <w:t xml:space="preserve"> </w:t>
@@ -11474,25 +11593,22 @@
         <w:rPr>
           <w:rStyle w:val="VerbatimChar"/>
         </w:rPr>
-        <w:t xml:space="preserve">therealgabeguo/cdvae_xrd_sinc100</w:t>
-      </w:r>
-      <w:r>
-        <w:t xml:space="preserve"> </w:t>
-      </w:r>
-      <w:r>
-        <w:t xml:space="preserve">and code at</w:t>
-      </w:r>
-      <w:r>
-        <w:t xml:space="preserve"> </w:t>
-      </w:r>
-      <w:r>
-        <w:rPr>
-          <w:rStyle w:val="VerbatimChar"/>
-        </w:rPr>
-        <w:t xml:space="preserve">github.com/gabeguo/cdvae_xrd</w:t>
-      </w:r>
-      <w:r>
-        <w:t xml:space="preserve">.</w:t>
+        <w:t xml:space="preserve">github.com/ML-PXRD/Crystalyze</w:t>
+      </w:r>
+      <w:r>
+        <w:t xml:space="preserve">. We could not reproduce: the checkpoint download link is marked</w:t>
+      </w:r>
+      <w:r>
+        <w:t xml:space="preserve"> </w:t>
+      </w:r>
+      <w:r>
+        <w:t xml:space="preserve">“not yet active”</w:t>
+      </w:r>
+      <w:r>
+        <w:t xml:space="preserve"> </w:t>
+      </w:r>
+      <w:r>
+        <w:t xml:space="preserve">in the upstream README (verified 2026-06-01).</w:t>
       </w:r>
     </w:p>
   </w:footnote>
@@ -11511,7 +11627,7 @@
         <w:t xml:space="preserve"> </w:t>
       </w:r>
       <w:r>
-        <w:t xml:space="preserve">Segal, N., Subramanian, A., Li, M., Miller, B. K., &amp; Gómez-Bombarelli, R. (2025). The Loss Landscape of Powder X-Ray Diffraction-Based Structure Optimization Is Too Rough for Gradient Descent.</w:t>
+        <w:t xml:space="preserve">Guo, G., Saidi, T. L., Terban, M. W., Valsecchi, M., Billinge, S. J. L., &amp; Lipson, H. (2025). Ab initio structure solutions from nanocrystalline powder diffraction data via diffusion models.</w:t>
       </w:r>
       <w:r>
         <w:t xml:space="preserve"> </w:t>
@@ -11521,14 +11637,41 @@
           <w:i/>
           <w:iCs/>
         </w:rPr>
-        <w:t xml:space="preserve">arXiv:2512.04036</w:t>
+        <w:t xml:space="preserve">Nature Materials</w:t>
+      </w:r>
+      <w:r>
+        <w:t xml:space="preserve">, 24, 1726–1734. DOI: 10.1038/s41563-025-02220-y (Author Correction: 10.1038/s41563-025-02301-y; preprint arXiv:2406.10796). Reproduced from HF checkpoint</w:t>
+      </w:r>
+      <w:r>
+        <w:t xml:space="preserve"> </w:t>
+      </w:r>
+      <w:r>
+        <w:rPr>
+          <w:rStyle w:val="VerbatimChar"/>
+        </w:rPr>
+        <w:t xml:space="preserve">therealgabeguo/cdvae_xrd_sinc100</w:t>
+      </w:r>
+      <w:r>
+        <w:t xml:space="preserve"> </w:t>
+      </w:r>
+      <w:r>
+        <w:t xml:space="preserve">and code at</w:t>
+      </w:r>
+      <w:r>
+        <w:t xml:space="preserve"> </w:t>
+      </w:r>
+      <w:r>
+        <w:rPr>
+          <w:rStyle w:val="VerbatimChar"/>
+        </w:rPr>
+        <w:t xml:space="preserve">github.com/gabeguo/cdvae_xrd</w:t>
       </w:r>
       <w:r>
         <w:t xml:space="preserve">.</w:t>
       </w:r>
     </w:p>
   </w:footnote>
-  <w:footnote w:id="17">
+  <w:footnote w:id="16">
     <w:p>
       <w:pPr>
         <w:pStyle w:val="FootnoteText"/>
@@ -11543,7 +11686,7 @@
         <w:t xml:space="preserve"> </w:t>
       </w:r>
       <w:r>
-        <w:t xml:space="preserve">Xie, T., Fu, X., Ganea, O.-E., Barzilay, R., &amp; Jaakkola, T. (2022). Crystal diffusion variational autoencoder for periodic material generation.</w:t>
+        <w:t xml:space="preserve">Segal, N., Subramanian, A., Li, M., Miller, B. K., &amp; Gómez-Bombarelli, R. (2025). The Loss Landscape of Powder X-Ray Diffraction-Based Structure Optimization Is Too Rough for Gradient Descent.</w:t>
       </w:r>
       <w:r>
         <w:t xml:space="preserve"> </w:t>
@@ -11553,7 +11696,7 @@
           <w:i/>
           <w:iCs/>
         </w:rPr>
-        <w:t xml:space="preserve">International Conference on Learning Representations</w:t>
+        <w:t xml:space="preserve">arXiv:2512.04036</w:t>
       </w:r>
       <w:r>
         <w:t xml:space="preserve">.</w:t>
@@ -11575,7 +11718,7 @@
         <w:t xml:space="preserve"> </w:t>
       </w:r>
       <w:r>
-        <w:t xml:space="preserve">Jiao, R., et al. (2023). Crystal structure prediction by joint equivariant diffusion.</w:t>
+        <w:t xml:space="preserve">Xie, T., Fu, X., Ganea, O.-E., Barzilay, R., &amp; Jaakkola, T. (2022). Crystal diffusion variational autoencoder for periodic material generation.</w:t>
       </w:r>
       <w:r>
         <w:t xml:space="preserve"> </w:t>
@@ -11585,13 +11728,10 @@
           <w:i/>
           <w:iCs/>
         </w:rPr>
-        <w:t xml:space="preserve">Advances in Neural Information Processing Systems</w:t>
-      </w:r>
-      <w:r>
-        <w:t xml:space="preserve"> </w:t>
-      </w:r>
-      <w:r>
-        <w:t xml:space="preserve">36.</w:t>
+        <w:t xml:space="preserve">International Conference on Learning Representations</w:t>
+      </w:r>
+      <w:r>
+        <w:t xml:space="preserve">.</w:t>
       </w:r>
     </w:p>
   </w:footnote>
@@ -11610,7 +11750,7 @@
         <w:t xml:space="preserve"> </w:t>
       </w:r>
       <w:r>
-        <w:t xml:space="preserve">Zeni, C., et al. (2024). MatterGen: A generative model for inorganic materials design.</w:t>
+        <w:t xml:space="preserve">Jiao, R., et al. (2023). Crystal structure prediction by joint equivariant diffusion.</w:t>
       </w:r>
       <w:r>
         <w:t xml:space="preserve"> </w:t>
@@ -11620,10 +11760,13 @@
           <w:i/>
           <w:iCs/>
         </w:rPr>
-        <w:t xml:space="preserve">arXiv:2312.03687</w:t>
-      </w:r>
-      <w:r>
-        <w:t xml:space="preserve">.</w:t>
+        <w:t xml:space="preserve">Advances in Neural Information Processing Systems</w:t>
+      </w:r>
+      <w:r>
+        <w:t xml:space="preserve"> </w:t>
+      </w:r>
+      <w:r>
+        <w:t xml:space="preserve">36.</w:t>
       </w:r>
     </w:p>
   </w:footnote>
@@ -11642,7 +11785,7 @@
         <w:t xml:space="preserve"> </w:t>
       </w:r>
       <w:r>
-        <w:t xml:space="preserve">Choudhary, K. (2025). DiffractGPT: Atomic Structure Determination from X-ray Diffraction Patterns using a Generative Pretrained Transformer.</w:t>
+        <w:t xml:space="preserve">Zeni, C., et al. (2024). MatterGen: A generative model for inorganic materials design.</w:t>
       </w:r>
       <w:r>
         <w:t xml:space="preserve"> </w:t>
@@ -11652,34 +11795,7 @@
           <w:i/>
           <w:iCs/>
         </w:rPr>
-        <w:t xml:space="preserve">The Journal of Physical Chemistry Letters</w:t>
-      </w:r>
-      <w:r>
-        <w:t xml:space="preserve">, 16(8), 2110–2119. DOI: 10.1021/acs.jpclett.4c03137. Reproduced from HF checkpoint</w:t>
-      </w:r>
-      <w:r>
-        <w:t xml:space="preserve"> </w:t>
-      </w:r>
-      <w:r>
-        <w:rPr>
-          <w:rStyle w:val="VerbatimChar"/>
-        </w:rPr>
-        <w:t xml:space="preserve">knc6/diffractgpt_mistral_chemical_formula</w:t>
-      </w:r>
-      <w:r>
-        <w:t xml:space="preserve"> </w:t>
-      </w:r>
-      <w:r>
-        <w:t xml:space="preserve">and code at</w:t>
-      </w:r>
-      <w:r>
-        <w:t xml:space="preserve"> </w:t>
-      </w:r>
-      <w:r>
-        <w:rPr>
-          <w:rStyle w:val="VerbatimChar"/>
-        </w:rPr>
-        <w:t xml:space="preserve">github.com/atomgptlab/atomgpt</w:t>
+        <w:t xml:space="preserve">arXiv:2312.03687</w:t>
       </w:r>
       <w:r>
         <w:t xml:space="preserve">.</w:t>
@@ -11701,7 +11817,7 @@
         <w:t xml:space="preserve"> </w:t>
       </w:r>
       <w:r>
-        <w:t xml:space="preserve">Riesel, E. A., Mackey, T., Nilforoshan, H., Xu, M., Badding, C. K., Altman, A. B., Leskovec, J., &amp; Freedman, D. E. (2024). Crystal Structure Determination from Powder Diffraction Patterns with Generative Machine Learning.</w:t>
+        <w:t xml:space="preserve">Choudhary, K. (2025). DiffractGPT: Atomic Structure Determination from X-ray Diffraction Patterns using a Generative Pretrained Transformer.</w:t>
       </w:r>
       <w:r>
         <w:t xml:space="preserve"> </w:t>
@@ -11711,10 +11827,10 @@
           <w:i/>
           <w:iCs/>
         </w:rPr>
-        <w:t xml:space="preserve">Journal of the American Chemical Society</w:t>
-      </w:r>
-      <w:r>
-        <w:t xml:space="preserve">, 146(44), 30340–30348. DOI: 10.1021/jacs.4c10244. Code:</w:t>
+        <w:t xml:space="preserve">The Journal of Physical Chemistry Letters</w:t>
+      </w:r>
+      <w:r>
+        <w:t xml:space="preserve">, 16(8), 2110–2119. DOI: 10.1021/acs.jpclett.4c03137. Reproduced from HF checkpoint</w:t>
       </w:r>
       <w:r>
         <w:t xml:space="preserve"> </w:t>
@@ -11723,22 +11839,25 @@
         <w:rPr>
           <w:rStyle w:val="VerbatimChar"/>
         </w:rPr>
-        <w:t xml:space="preserve">github.com/ML-PXRD/Crystalyze</w:t>
-      </w:r>
-      <w:r>
-        <w:t xml:space="preserve">. We could not reproduce: the checkpoint download link is marked</w:t>
-      </w:r>
-      <w:r>
-        <w:t xml:space="preserve"> </w:t>
-      </w:r>
-      <w:r>
-        <w:t xml:space="preserve">“not yet active”</w:t>
-      </w:r>
-      <w:r>
-        <w:t xml:space="preserve"> </w:t>
-      </w:r>
-      <w:r>
-        <w:t xml:space="preserve">in the upstream README (verified 2026-06-01).</w:t>
+        <w:t xml:space="preserve">knc6/diffractgpt_mistral_chemical_formula</w:t>
+      </w:r>
+      <w:r>
+        <w:t xml:space="preserve"> </w:t>
+      </w:r>
+      <w:r>
+        <w:t xml:space="preserve">and code at</w:t>
+      </w:r>
+      <w:r>
+        <w:t xml:space="preserve"> </w:t>
+      </w:r>
+      <w:r>
+        <w:rPr>
+          <w:rStyle w:val="VerbatimChar"/>
+        </w:rPr>
+        <w:t xml:space="preserve">github.com/atomgptlab/atomgpt</w:t>
+      </w:r>
+      <w:r>
+        <w:t xml:space="preserve">.</w:t>
       </w:r>
     </w:p>
   </w:footnote>
@@ -11757,7 +11876,7 @@
         <w:t xml:space="preserve"> </w:t>
       </w:r>
       <w:r>
-        <w:t xml:space="preserve">Guo, G., Saidi, T. L., Terban, M. W., Valsecchi, M., Billinge, S. J. L., &amp; Lipson, H. (2025). Ab initio structure solutions from nanocrystalline powder diffraction data via diffusion models.</w:t>
+        <w:t xml:space="preserve">Riesel, E. A., Mackey, T., Nilforoshan, H., Xu, M., Badding, C. K., Altman, A. B., Leskovec, J., &amp; Freedman, D. E. (2024). Crystal Structure Determination from Powder Diffraction Patterns with Generative Machine Learning.</w:t>
       </w:r>
       <w:r>
         <w:t xml:space="preserve"> </w:t>
@@ -11767,10 +11886,10 @@
           <w:i/>
           <w:iCs/>
         </w:rPr>
-        <w:t xml:space="preserve">Nature Materials</w:t>
-      </w:r>
-      <w:r>
-        <w:t xml:space="preserve">, 24, 1726–1734. DOI: 10.1038/s41563-025-02220-y (Author Correction: 10.1038/s41563-025-02301-y; preprint arXiv:2406.10796). Reproduced from HF checkpoint</w:t>
+        <w:t xml:space="preserve">Journal of the American Chemical Society</w:t>
+      </w:r>
+      <w:r>
+        <w:t xml:space="preserve">, 146(44), 30340–30348. DOI: 10.1021/jacs.4c10244. Code:</w:t>
       </w:r>
       <w:r>
         <w:t xml:space="preserve"> </w:t>
@@ -11779,25 +11898,22 @@
         <w:rPr>
           <w:rStyle w:val="VerbatimChar"/>
         </w:rPr>
-        <w:t xml:space="preserve">therealgabeguo/cdvae_xrd_sinc100</w:t>
-      </w:r>
-      <w:r>
-        <w:t xml:space="preserve"> </w:t>
-      </w:r>
-      <w:r>
-        <w:t xml:space="preserve">and code at</w:t>
-      </w:r>
-      <w:r>
-        <w:t xml:space="preserve"> </w:t>
-      </w:r>
-      <w:r>
-        <w:rPr>
-          <w:rStyle w:val="VerbatimChar"/>
-        </w:rPr>
-        <w:t xml:space="preserve">github.com/gabeguo/cdvae_xrd</w:t>
-      </w:r>
-      <w:r>
-        <w:t xml:space="preserve">.</w:t>
+        <w:t xml:space="preserve">github.com/ML-PXRD/Crystalyze</w:t>
+      </w:r>
+      <w:r>
+        <w:t xml:space="preserve">. We could not reproduce: the checkpoint download link is marked</w:t>
+      </w:r>
+      <w:r>
+        <w:t xml:space="preserve"> </w:t>
+      </w:r>
+      <w:r>
+        <w:t xml:space="preserve">“not yet active”</w:t>
+      </w:r>
+      <w:r>
+        <w:t xml:space="preserve"> </w:t>
+      </w:r>
+      <w:r>
+        <w:t xml:space="preserve">in the upstream README (verified 2026-06-01).</w:t>
       </w:r>
     </w:p>
   </w:footnote>
@@ -11816,7 +11932,7 @@
         <w:t xml:space="preserve"> </w:t>
       </w:r>
       <w:r>
-        <w:t xml:space="preserve">Johansen, F. L., Friis-Jensen, U., Dam, E. B., Jensen, K. M. Ø., Mercado, R., &amp; Selvan, R. (2025). deCIFer: Crystal Structure Prediction from Powder Diffraction Data using Autoregressive Language Models.</w:t>
+        <w:t xml:space="preserve">Guo, G., Saidi, T. L., Terban, M. W., Valsecchi, M., Billinge, S. J. L., &amp; Lipson, H. (2025). Ab initio structure solutions from nanocrystalline powder diffraction data via diffusion models.</w:t>
       </w:r>
       <w:r>
         <w:t xml:space="preserve"> </w:t>
@@ -11826,13 +11942,37 @@
           <w:i/>
           <w:iCs/>
         </w:rPr>
-        <w:t xml:space="preserve">Transactions on Machine Learning Research</w:t>
-      </w:r>
-      <w:r>
-        <w:t xml:space="preserve"> </w:t>
-      </w:r>
-      <w:r>
-        <w:t xml:space="preserve">(arXiv:2502.02189).</w:t>
+        <w:t xml:space="preserve">Nature Materials</w:t>
+      </w:r>
+      <w:r>
+        <w:t xml:space="preserve">, 24, 1726–1734. DOI: 10.1038/s41563-025-02220-y (Author Correction: 10.1038/s41563-025-02301-y; preprint arXiv:2406.10796). Reproduced from HF checkpoint</w:t>
+      </w:r>
+      <w:r>
+        <w:t xml:space="preserve"> </w:t>
+      </w:r>
+      <w:r>
+        <w:rPr>
+          <w:rStyle w:val="VerbatimChar"/>
+        </w:rPr>
+        <w:t xml:space="preserve">therealgabeguo/cdvae_xrd_sinc100</w:t>
+      </w:r>
+      <w:r>
+        <w:t xml:space="preserve"> </w:t>
+      </w:r>
+      <w:r>
+        <w:t xml:space="preserve">and code at</w:t>
+      </w:r>
+      <w:r>
+        <w:t xml:space="preserve"> </w:t>
+      </w:r>
+      <w:r>
+        <w:rPr>
+          <w:rStyle w:val="VerbatimChar"/>
+        </w:rPr>
+        <w:t xml:space="preserve">github.com/gabeguo/cdvae_xrd</w:t>
+      </w:r>
+      <w:r>
+        <w:t xml:space="preserve">.</w:t>
       </w:r>
     </w:p>
   </w:footnote>
@@ -11851,7 +11991,7 @@
         <w:t xml:space="preserve"> </w:t>
       </w:r>
       <w:r>
-        <w:t xml:space="preserve">Boultif, A., &amp; Louër, D. (2004). Powder pattern indexing with the dichotomy method.</w:t>
+        <w:t xml:space="preserve">Johansen, F. L., Friis-Jensen, U., Dam, E. B., Jensen, K. M. Ø., Mercado, R., &amp; Selvan, R. (2025). deCIFer: Crystal Structure Prediction from Powder Diffraction Data using Autoregressive Language Models.</w:t>
       </w:r>
       <w:r>
         <w:t xml:space="preserve"> </w:t>
@@ -11861,10 +12001,13 @@
           <w:i/>
           <w:iCs/>
         </w:rPr>
-        <w:t xml:space="preserve">Journal of Applied Crystallography</w:t>
-      </w:r>
-      <w:r>
-        <w:t xml:space="preserve">, 37(5), 724–731. DOI: 10.1107/S0021889804014876.</w:t>
+        <w:t xml:space="preserve">Transactions on Machine Learning Research</w:t>
+      </w:r>
+      <w:r>
+        <w:t xml:space="preserve"> </w:t>
+      </w:r>
+      <w:r>
+        <w:t xml:space="preserve">(arXiv:2502.02189).</w:t>
       </w:r>
     </w:p>
   </w:footnote>
@@ -11883,7 +12026,7 @@
         <w:t xml:space="preserve"> </w:t>
       </w:r>
       <w:r>
-        <w:t xml:space="preserve">Guo, J., &amp; Schwalbe-Koda, D. (2026). Generative Inversion of Spectroscopic Data for Amorphous Structure Elucidation.</w:t>
+        <w:t xml:space="preserve">Boultif, A., &amp; Louër, D. (2004). Powder pattern indexing with the dichotomy method.</w:t>
       </w:r>
       <w:r>
         <w:t xml:space="preserve"> </w:t>
@@ -11893,10 +12036,10 @@
           <w:i/>
           <w:iCs/>
         </w:rPr>
-        <w:t xml:space="preserve">arXiv:2603.23210</w:t>
-      </w:r>
-      <w:r>
-        <w:t xml:space="preserve">.</w:t>
+        <w:t xml:space="preserve">Journal of Applied Crystallography</w:t>
+      </w:r>
+      <w:r>
+        <w:t xml:space="preserve">, 37(5), 724–731. DOI: 10.1107/S0021889804014876.</w:t>
       </w:r>
     </w:p>
   </w:footnote>
@@ -11915,7 +12058,7 @@
         <w:t xml:space="preserve"> </w:t>
       </w:r>
       <w:r>
-        <w:t xml:space="preserve">Segal, N., Subramanian, A., Li, M., Miller, B. K., &amp; Gómez-Bombarelli, R. (2025). The Loss Landscape of Powder X-Ray Diffraction-Based Structure Optimization Is Too Rough for Gradient Descent.</w:t>
+        <w:t xml:space="preserve">Guo, J., &amp; Schwalbe-Koda, D. (2026). Generative Inversion of Spectroscopic Data for Amorphous Structure Elucidation.</w:t>
       </w:r>
       <w:r>
         <w:t xml:space="preserve"> </w:t>
@@ -11925,7 +12068,7 @@
           <w:i/>
           <w:iCs/>
         </w:rPr>
-        <w:t xml:space="preserve">arXiv:2512.04036</w:t>
+        <w:t xml:space="preserve">arXiv:2603.23210</w:t>
       </w:r>
       <w:r>
         <w:t xml:space="preserve">.</w:t>
@@ -11947,7 +12090,7 @@
         <w:t xml:space="preserve"> </w:t>
       </w:r>
       <w:r>
-        <w:t xml:space="preserve">Schütt, K. T., et al. (2017). SchNet: A continuous-filter convolutional neural network for modeling quantum interactions.</w:t>
+        <w:t xml:space="preserve">Segal, N., Subramanian, A., Li, M., Miller, B. K., &amp; Gómez-Bombarelli, R. (2025). The Loss Landscape of Powder X-Ray Diffraction-Based Structure Optimization Is Too Rough for Gradient Descent.</w:t>
       </w:r>
       <w:r>
         <w:t xml:space="preserve"> </w:t>
@@ -11957,13 +12100,10 @@
           <w:i/>
           <w:iCs/>
         </w:rPr>
-        <w:t xml:space="preserve">Advances in Neural Information Processing Systems</w:t>
-      </w:r>
-      <w:r>
-        <w:t xml:space="preserve"> </w:t>
-      </w:r>
-      <w:r>
-        <w:t xml:space="preserve">30.</w:t>
+        <w:t xml:space="preserve">arXiv:2512.04036</w:t>
+      </w:r>
+      <w:r>
+        <w:t xml:space="preserve">.</w:t>
       </w:r>
     </w:p>
   </w:footnote>
@@ -11982,7 +12122,7 @@
         <w:t xml:space="preserve"> </w:t>
       </w:r>
       <w:r>
-        <w:t xml:space="preserve">Batatia, I., Kovács, D. P., Simm, G. N. C., Ortner, C., &amp; Csányi, G. (2022). MACE: Higher order equivariant message passing neural networks for fast and accurate force fields.</w:t>
+        <w:t xml:space="preserve">Schütt, K. T., et al. (2017). SchNet: A continuous-filter convolutional neural network for modeling quantum interactions.</w:t>
       </w:r>
       <w:r>
         <w:t xml:space="preserve"> </w:t>
@@ -11998,11 +12138,11 @@
         <w:t xml:space="preserve"> </w:t>
       </w:r>
       <w:r>
-        <w:t xml:space="preserve">35.</w:t>
+        <w:t xml:space="preserve">30.</w:t>
       </w:r>
     </w:p>
   </w:footnote>
-  <w:footnote w:id="37">
+  <w:footnote w:id="29">
     <w:p>
       <w:pPr>
         <w:pStyle w:val="FootnoteText"/>
@@ -12017,7 +12157,7 @@
         <w:t xml:space="preserve"> </w:t>
       </w:r>
       <w:r>
-        <w:t xml:space="preserve">Nichol, A., &amp; Dhariwal, P. (2021). Improved denoising diffusion probabilistic models.</w:t>
+        <w:t xml:space="preserve">Batatia, I., Kovács, D. P., Simm, G. N. C., Ortner, C., &amp; Csányi, G. (2022). MACE: Higher order equivariant message passing neural networks for fast and accurate force fields.</w:t>
       </w:r>
       <w:r>
         <w:t xml:space="preserve"> </w:t>
@@ -12027,14 +12167,17 @@
           <w:i/>
           <w:iCs/>
         </w:rPr>
-        <w:t xml:space="preserve">International Conference on Machine Learning</w:t>
-      </w:r>
-      <w:r>
-        <w:t xml:space="preserve">.</w:t>
+        <w:t xml:space="preserve">Advances in Neural Information Processing Systems</w:t>
+      </w:r>
+      <w:r>
+        <w:t xml:space="preserve"> </w:t>
+      </w:r>
+      <w:r>
+        <w:t xml:space="preserve">35.</w:t>
       </w:r>
     </w:p>
   </w:footnote>
-  <w:footnote w:id="39">
+  <w:footnote w:id="38">
     <w:p>
       <w:pPr>
         <w:pStyle w:val="FootnoteText"/>
@@ -12049,7 +12192,7 @@
         <w:t xml:space="preserve"> </w:t>
       </w:r>
       <w:r>
-        <w:t xml:space="preserve">Toby, B. H., &amp; Von Dreele, R. B. (2013). GSAS-II: the genesis of a modern open-source all purpose crystallography software package.</w:t>
+        <w:t xml:space="preserve">Nichol, A., &amp; Dhariwal, P. (2021). Improved denoising diffusion probabilistic models.</w:t>
       </w:r>
       <w:r>
         <w:t xml:space="preserve"> </w:t>
@@ -12059,26 +12202,14 @@
           <w:i/>
           <w:iCs/>
         </w:rPr>
-        <w:t xml:space="preserve">Journal of Applied Crystallography</w:t>
-      </w:r>
-      <w:r>
-        <w:t xml:space="preserve">, 46(2), 544–549. Code:</w:t>
-      </w:r>
-      <w:r>
-        <w:t xml:space="preserve"> </w:t>
-      </w:r>
-      <w:r>
-        <w:rPr>
-          <w:rStyle w:val="VerbatimChar"/>
-        </w:rPr>
-        <w:t xml:space="preserve">github.com/AdvancedPhotonSource/GSAS-II</w:t>
+        <w:t xml:space="preserve">International Conference on Machine Learning</w:t>
       </w:r>
       <w:r>
         <w:t xml:space="preserve">.</w:t>
       </w:r>
     </w:p>
   </w:footnote>
-  <w:footnote w:id="41">
+  <w:footnote w:id="40">
     <w:p>
       <w:pPr>
         <w:pStyle w:val="FootnoteText"/>
@@ -12093,7 +12224,7 @@
         <w:t xml:space="preserve"> </w:t>
       </w:r>
       <w:r>
-        <w:t xml:space="preserve">Song, J., Meng, C., &amp; Ermon, S. (2021). Denoising diffusion implicit models.</w:t>
+        <w:t xml:space="preserve">Toby, B. H., &amp; Von Dreele, R. B. (2013). GSAS-II: the genesis of a modern open-source all purpose crystallography software package.</w:t>
       </w:r>
       <w:r>
         <w:t xml:space="preserve"> </w:t>
@@ -12103,14 +12234,26 @@
           <w:i/>
           <w:iCs/>
         </w:rPr>
-        <w:t xml:space="preserve">International Conference on Learning Representations</w:t>
+        <w:t xml:space="preserve">Journal of Applied Crystallography</w:t>
+      </w:r>
+      <w:r>
+        <w:t xml:space="preserve">, 46(2), 544–549. Code:</w:t>
+      </w:r>
+      <w:r>
+        <w:t xml:space="preserve"> </w:t>
+      </w:r>
+      <w:r>
+        <w:rPr>
+          <w:rStyle w:val="VerbatimChar"/>
+        </w:rPr>
+        <w:t xml:space="preserve">github.com/AdvancedPhotonSource/GSAS-II</w:t>
       </w:r>
       <w:r>
         <w:t xml:space="preserve">.</w:t>
       </w:r>
     </w:p>
   </w:footnote>
-  <w:footnote w:id="44">
+  <w:footnote w:id="42">
     <w:p>
       <w:pPr>
         <w:pStyle w:val="FootnoteText"/>
@@ -12125,7 +12268,7 @@
         <w:t xml:space="preserve"> </w:t>
       </w:r>
       <w:r>
-        <w:t xml:space="preserve">Xie, T., Fu, X., Ganea, O.-E., Barzilay, R., &amp; Jaakkola, T. (2022). Crystal diffusion variational autoencoder for periodic material generation.</w:t>
+        <w:t xml:space="preserve">Song, J., Meng, C., &amp; Ermon, S. (2021). Denoising diffusion implicit models.</w:t>
       </w:r>
       <w:r>
         <w:t xml:space="preserve"> </w:t>
@@ -12142,7 +12285,7 @@
       </w:r>
     </w:p>
   </w:footnote>
-  <w:footnote w:id="56">
+  <w:footnote w:id="45">
     <w:p>
       <w:pPr>
         <w:pStyle w:val="FootnoteText"/>
@@ -12157,7 +12300,7 @@
         <w:t xml:space="preserve"> </w:t>
       </w:r>
       <w:r>
-        <w:t xml:space="preserve">Choudhary, K. (2025). DiffractGPT: Atomic Structure Determination from X-ray Diffraction Patterns using a Generative Pretrained Transformer.</w:t>
+        <w:t xml:space="preserve">Xie, T., Fu, X., Ganea, O.-E., Barzilay, R., &amp; Jaakkola, T. (2022). Crystal diffusion variational autoencoder for periodic material generation.</w:t>
       </w:r>
       <w:r>
         <w:t xml:space="preserve"> </w:t>
@@ -12167,34 +12310,7 @@
           <w:i/>
           <w:iCs/>
         </w:rPr>
-        <w:t xml:space="preserve">The Journal of Physical Chemistry Letters</w:t>
-      </w:r>
-      <w:r>
-        <w:t xml:space="preserve">, 16(8), 2110–2119. DOI: 10.1021/acs.jpclett.4c03137. Reproduced from HF checkpoint</w:t>
-      </w:r>
-      <w:r>
-        <w:t xml:space="preserve"> </w:t>
-      </w:r>
-      <w:r>
-        <w:rPr>
-          <w:rStyle w:val="VerbatimChar"/>
-        </w:rPr>
-        <w:t xml:space="preserve">knc6/diffractgpt_mistral_chemical_formula</w:t>
-      </w:r>
-      <w:r>
-        <w:t xml:space="preserve"> </w:t>
-      </w:r>
-      <w:r>
-        <w:t xml:space="preserve">and code at</w:t>
-      </w:r>
-      <w:r>
-        <w:t xml:space="preserve"> </w:t>
-      </w:r>
-      <w:r>
-        <w:rPr>
-          <w:rStyle w:val="VerbatimChar"/>
-        </w:rPr>
-        <w:t xml:space="preserve">github.com/atomgptlab/atomgpt</w:t>
+        <w:t xml:space="preserve">International Conference on Learning Representations</w:t>
       </w:r>
       <w:r>
         <w:t xml:space="preserve">.</w:t>
@@ -12216,7 +12332,7 @@
         <w:t xml:space="preserve"> </w:t>
       </w:r>
       <w:r>
-        <w:t xml:space="preserve">Guo, G., Saidi, T. L., Terban, M. W., Valsecchi, M., Billinge, S. J. L., &amp; Lipson, H. (2025). Ab initio structure solutions from nanocrystalline powder diffraction data via diffusion models.</w:t>
+        <w:t xml:space="preserve">Choudhary, K. (2025). DiffractGPT: Atomic Structure Determination from X-ray Diffraction Patterns using a Generative Pretrained Transformer.</w:t>
       </w:r>
       <w:r>
         <w:t xml:space="preserve"> </w:t>
@@ -12226,6 +12342,65 @@
           <w:i/>
           <w:iCs/>
         </w:rPr>
+        <w:t xml:space="preserve">The Journal of Physical Chemistry Letters</w:t>
+      </w:r>
+      <w:r>
+        <w:t xml:space="preserve">, 16(8), 2110–2119. DOI: 10.1021/acs.jpclett.4c03137. Reproduced from HF checkpoint</w:t>
+      </w:r>
+      <w:r>
+        <w:t xml:space="preserve"> </w:t>
+      </w:r>
+      <w:r>
+        <w:rPr>
+          <w:rStyle w:val="VerbatimChar"/>
+        </w:rPr>
+        <w:t xml:space="preserve">knc6/diffractgpt_mistral_chemical_formula</w:t>
+      </w:r>
+      <w:r>
+        <w:t xml:space="preserve"> </w:t>
+      </w:r>
+      <w:r>
+        <w:t xml:space="preserve">and code at</w:t>
+      </w:r>
+      <w:r>
+        <w:t xml:space="preserve"> </w:t>
+      </w:r>
+      <w:r>
+        <w:rPr>
+          <w:rStyle w:val="VerbatimChar"/>
+        </w:rPr>
+        <w:t xml:space="preserve">github.com/atomgptlab/atomgpt</w:t>
+      </w:r>
+      <w:r>
+        <w:t xml:space="preserve">.</w:t>
+      </w:r>
+    </w:p>
+  </w:footnote>
+  <w:footnote w:id="58">
+    <w:p>
+      <w:pPr>
+        <w:pStyle w:val="FootnoteText"/>
+      </w:pPr>
+      <w:r>
+        <w:rPr>
+          <w:rStyle w:val="FootnoteReference"/>
+        </w:rPr>
+        <w:footnoteRef/>
+      </w:r>
+      <w:r>
+        <w:t xml:space="preserve"> </w:t>
+      </w:r>
+      <w:r>
+        <w:t xml:space="preserve">Guo, G., Saidi, T. L., Terban, M. W., Valsecchi, M., Billinge, S. J. L., &amp; Lipson, H. (2025). Ab initio structure solutions from nanocrystalline powder diffraction data via diffusion models.</w:t>
+      </w:r>
+      <w:r>
+        <w:t xml:space="preserve"> </w:t>
+      </w:r>
+      <w:r>
+        <w:rPr>
+          <w:i/>
+          <w:iCs/>
+        </w:rPr>
         <w:t xml:space="preserve">Nature Materials</w:t>
       </w:r>
       <w:r>
@@ -12260,7 +12435,42 @@
       </w:r>
     </w:p>
   </w:footnote>
-  <w:footnote w:id="63">
+  <w:footnote w:id="59">
+    <w:p>
+      <w:pPr>
+        <w:pStyle w:val="FootnoteText"/>
+      </w:pPr>
+      <w:r>
+        <w:rPr>
+          <w:rStyle w:val="FootnoteReference"/>
+        </w:rPr>
+        <w:footnoteRef/>
+      </w:r>
+      <w:r>
+        <w:t xml:space="preserve"> </w:t>
+      </w:r>
+      <w:r>
+        <w:t xml:space="preserve">Johansen, F. L., Friis-Jensen, U., Dam, E. B., Jensen, K. M. Ø., Mercado, R., &amp; Selvan, R. (2025). deCIFer: Crystal Structure Prediction from Powder Diffraction Data using Autoregressive Language Models.</w:t>
+      </w:r>
+      <w:r>
+        <w:t xml:space="preserve"> </w:t>
+      </w:r>
+      <w:r>
+        <w:rPr>
+          <w:i/>
+          <w:iCs/>
+        </w:rPr>
+        <w:t xml:space="preserve">Transactions on Machine Learning Research</w:t>
+      </w:r>
+      <w:r>
+        <w:t xml:space="preserve"> </w:t>
+      </w:r>
+      <w:r>
+        <w:t xml:space="preserve">(arXiv:2502.02189).</w:t>
+      </w:r>
+    </w:p>
+  </w:footnote>
+  <w:footnote w:id="65">
     <w:p>
       <w:pPr>
         <w:pStyle w:val="FootnoteText"/>

</xml_diff>

<commit_message>
paper: address RSC submission checks — add affiliation (Independent Researcher, Fort Wayne IN), trim abstract 432->258 words, convert references to numbered list (no footnotes), make data-availability links detectable, reword offensive-words flag; regen tex/pdf/docx
</commit_message>
<xml_diff>
--- a/paper/paper.docx
+++ b/paper/paper.docx
@@ -21,13 +21,20 @@
         </w:rPr>
         <w:t xml:space="preserve">Frank Cai</w:t>
       </w:r>
-      <w:r>
-        <w:t xml:space="preserve"> </w:t>
-      </w:r>
-      <w:r>
-        <w:rPr>
-          <w:rStyle w:val="VerbatimChar"/>
-        </w:rPr>
+    </w:p>
+    <w:p>
+      <w:pPr>
+        <w:pStyle w:val="BodyText"/>
+      </w:pPr>
+      <w:r>
+        <w:t xml:space="preserve">Independent Researcher, Fort Wayne, IN, USA</w:t>
+      </w:r>
+    </w:p>
+    <w:p>
+      <w:pPr>
+        <w:pStyle w:val="BodyText"/>
+      </w:pPr>
+      <w:r>
         <w:t xml:space="preserve">frankyc11223@gmail.com</w:t>
       </w:r>
     </w:p>
@@ -50,7 +57,7 @@
         </w:pict>
       </w:r>
     </w:p>
-    <w:bookmarkStart w:id="12" w:name="abstract"/>
+    <w:bookmarkStart w:id="9" w:name="abstract"/>
     <w:p>
       <w:pPr>
         <w:pStyle w:val="Heading1"/>
@@ -77,46 +84,7 @@
         <w:t xml:space="preserve">PXRD-Diff</w:t>
       </w:r>
       <w:r>
-        <w:t xml:space="preserve">, a 3.7 M-parameter conditional diffusion model on the CDVAE MP-20 split, and reproduce DiffractGPT</w:t>
-      </w:r>
-      <w:r>
-        <w:t xml:space="preserve"> </w:t>
-      </w:r>
-      <w:r>
-        <w:rPr>
-          <w:rStyle w:val="FootnoteReference"/>
-        </w:rPr>
-        <w:footnoteReference w:id="9"/>
-      </w:r>
-      <w:r>
-        <w:t xml:space="preserve">, PXRDnet</w:t>
-      </w:r>
-      <w:r>
-        <w:t xml:space="preserve"> </w:t>
-      </w:r>
-      <w:r>
-        <w:rPr>
-          <w:rStyle w:val="FootnoteReference"/>
-        </w:rPr>
-        <w:footnoteReference w:id="10"/>
-      </w:r>
-      <w:r>
-        <w:t xml:space="preserve">, and deCIFer</w:t>
-      </w:r>
-      <w:r>
-        <w:t xml:space="preserve"> </w:t>
-      </w:r>
-      <w:r>
-        <w:rPr>
-          <w:rStyle w:val="FootnoteReference"/>
-        </w:rPr>
-        <w:footnoteReference w:id="11"/>
-      </w:r>
-      <w:r>
-        <w:t xml:space="preserve"> </w:t>
-      </w:r>
-      <w:r>
-        <w:t xml:space="preserve">through the</w:t>
+        <w:t xml:space="preserve">, a 3.7 M-parameter conditional diffusion model on the CDVAE MP-20 split, and reproduce DiffractGPT [1], PXRDnet [2], and deCIFer [3] through the</w:t>
       </w:r>
       <w:r>
         <w:t xml:space="preserve"> </w:t>
@@ -141,7 +109,23 @@
         <w:t xml:space="preserve"> </w:t>
       </w:r>
       <w:r>
-        <w:t xml:space="preserve">harness. Our central, statistically robust finding is a</w:t>
+        <w:t xml:space="preserve">harness. Our central, statistically robust finding is mechanistic: the learned PXRD encoder reaches a 0.007</w:t>
+      </w:r>
+      <w:r>
+        <w:t xml:space="preserve"> </w:t>
+      </w:r>
+      <w:r>
+        <w:rPr>
+          <w:i/>
+          <w:iCs/>
+        </w:rPr>
+        <w:t xml:space="preserve">normalised</w:t>
+      </w:r>
+      <w:r>
+        <w:t xml:space="preserve"> </w:t>
+      </w:r>
+      <w:r>
+        <w:t xml:space="preserve">auxiliary lattice-regression loss in isolation, yet substituting that head’s own lattice into the sampler recovers only 1.2 %, because its ~1.1 Å length error shifts every Bragg peak by ~15 %. The limiter is the global pooling that discards absolute peak positions, not the denoiser alone. A perturbation study locates a sharp sensitivity knee at ~0.5 Å cell error, and a true-lattice oracle lifts match to</w:t>
       </w:r>
       <w:r>
         <w:t xml:space="preserve"> </w:t>
@@ -151,138 +135,13 @@
           <w:b/>
           <w:bCs/>
         </w:rPr>
-        <w:t xml:space="preserve">mechanism</w:t>
-      </w:r>
-      <w:r>
-        <w:t xml:space="preserve">: the learned PXRD encoder reaches a 0.007</w:t>
-      </w:r>
-      <w:r>
-        <w:t xml:space="preserve"> </w:t>
-      </w:r>
-      <w:r>
-        <w:rPr>
-          <w:i/>
-          <w:iCs/>
-        </w:rPr>
-        <w:t xml:space="preserve">normalised</w:t>
-      </w:r>
-      <w:r>
-        <w:t xml:space="preserve"> </w:t>
-      </w:r>
-      <w:r>
-        <w:t xml:space="preserve">auxiliary lattice-regression loss in isolation, but that relative fit does not survive conversion to absolute scale: substituting the auxiliary head’s own lattice into the sampler recovers only 1.2 %, because its ~1.1 Å length error shifts every Bragg peak by ~15 % and collapses pattern agreement. The bottleneck is the global pooling that discards absolute peak positions, not the denoiser alone: neither the pooled encoding nor the denoiser fixes the lattice from scratch. A perturbation study locates a sharp sensitivity knee at ~0.5 Å cell error, and a true-lattice oracle lifts match to</w:t>
-      </w:r>
-      <w:r>
-        <w:t xml:space="preserve"> </w:t>
-      </w:r>
-      <w:r>
-        <w:rPr>
-          <w:b/>
-          <w:bCs/>
-        </w:rPr>
         <w:t xml:space="preserve">4.5 %</w:t>
       </w:r>
       <w:r>
         <w:t xml:space="preserve"> </w:t>
       </w:r>
       <w:r>
-        <w:t xml:space="preserve">at n = 1000 (three seeds, 135 / 3 000 pooled, firming an earlier single-seed 5.6 %); its 95 % Wilson CI [3.8, 5.3] is disjoint from the no-true-lattice indexer’s 1.5 % [1.2, 2.0], so the gap is real. Replacing the learned lattice head with a classical Q-space autoindexer (de-Wolff dichotomy) raises no-true-lattice match to 1.5 % [1.2, 2.0] (three-seed pooled) from a learned-head baseline that recovers essentially nothing (0 / 1 949). A</w:t>
-      </w:r>
-      <w:r>
-        <w:t xml:space="preserve"> </w:t>
-      </w:r>
-      <w:r>
-        <w:rPr>
-          <w:b/>
-          <w:bCs/>
-        </w:rPr>
-        <w:t xml:space="preserve">paired McNemar test across three seeds confirms the improvement is significant</w:t>
-      </w:r>
-      <w:r>
-        <w:t xml:space="preserve"> </w:t>
-      </w:r>
-      <w:r>
-        <w:t xml:space="preserve">(p &lt; 10⁻⁴; 27 structures fixed, none broken); an earlier unpaired test (p = 0.24) was simply underpowered. The gain is concentrated in the high-symmetry systems where the indexer’s cell error sits below the 0.5 Å knee. Reproduced baselines on our harness:</w:t>
-      </w:r>
-      <w:r>
-        <w:t xml:space="preserve"> </w:t>
-      </w:r>
-      <w:r>
-        <w:rPr>
-          <w:b/>
-          <w:bCs/>
-        </w:rPr>
-        <w:t xml:space="preserve">deCIFer 73.8 %</w:t>
-      </w:r>
-      <w:r>
-        <w:t xml:space="preserve"> </w:t>
-      </w:r>
-      <w:r>
-        <w:t xml:space="preserve">match (69.5 % all-correct) at n = 300,</w:t>
-      </w:r>
-      <w:r>
-        <w:t xml:space="preserve"> </w:t>
-      </w:r>
-      <w:r>
-        <w:rPr>
-          <w:b/>
-          <w:bCs/>
-        </w:rPr>
-        <w:t xml:space="preserve">DiffractGPT 18.9 %</w:t>
-      </w:r>
-      <w:r>
-        <w:t xml:space="preserve"> </w:t>
-      </w:r>
-      <w:r>
-        <w:t xml:space="preserve">match (15.9 % all-correct) at n = 1000,</w:t>
-      </w:r>
-      <w:r>
-        <w:t xml:space="preserve"> </w:t>
-      </w:r>
-      <w:r>
-        <w:rPr>
-          <w:b/>
-          <w:bCs/>
-        </w:rPr>
-        <w:t xml:space="preserve">PXRDnet sinc100 30.0 %</w:t>
-      </w:r>
-      <w:r>
-        <w:t xml:space="preserve"> </w:t>
-      </w:r>
-      <w:r>
-        <w:t xml:space="preserve">match (5.0 % all-correct) at n = 20. PXRD-Diff is 12–19× behind DGpt and PXRDnet and ~46× behind deCIFer on raw match rate. We note a striking</w:t>
-      </w:r>
-      <w:r>
-        <w:t xml:space="preserve"> </w:t>
-      </w:r>
-      <w:r>
-        <w:rPr>
-          <w:i/>
-          <w:iCs/>
-        </w:rPr>
-        <w:t xml:space="preserve">candidate</w:t>
-      </w:r>
-      <w:r>
-        <w:t xml:space="preserve"> </w:t>
-      </w:r>
-      <w:r>
-        <w:t xml:space="preserve">discrepancy, in which DiffractGPT recovers far more space groups (all-correct) than PXRDnet despite a lower match rate, but flag it as a hypothesis rather than a result: at n = 20 the PXRDnet all-correct CI is [0.9, 23.6] and cannot support the comparison. The contributions that</w:t>
-      </w:r>
-      <w:r>
-        <w:t xml:space="preserve"> </w:t>
-      </w:r>
-      <w:r>
-        <w:rPr>
-          <w:i/>
-          <w:iCs/>
-        </w:rPr>
-        <w:t xml:space="preserve">do</w:t>
-      </w:r>
-      <w:r>
-        <w:t xml:space="preserve"> </w:t>
-      </w:r>
-      <w:r>
-        <w:t xml:space="preserve">hold are the encoder-bottleneck diagnosis, the indexer drop-in, the four-extension failure catalogue (top-K rerank, Debye guidance, Wyckoff embeddings, distance-aux), and the shared evaluation harness itself. Code, checkpoints, per-phase JSONs, and the differentiable Bragg simulator are released.</w:t>
+        <w:t xml:space="preserve">at n = 1000 (three seeds; 95 % Wilson CI [3.8, 5.3]), disjoint from the no-true-lattice indexer’s 1.5 % [1.2, 2.0]. Replacing the learned lattice head with a classical Q-space autoindexer raises no-true-lattice match to 1.5 % from a learned head that recovers essentially nothing; a three-seed paired McNemar test confirms the gain is significant (p &lt; 10⁻⁴; 27 fixed, none broken), concentrated in the high-symmetry systems below the knee. Reproduced on one harness, deCIFer reaches 73.8 % match, DiffractGPT 18.9 %, and PXRDnet 30.0 %, leaving PXRD-Diff 12–46× behind. The contributions are the encoder-bottleneck diagnosis, the classical-indexer drop-in, a four-item failure catalogue, and the shared evaluation harness; code, checkpoints, and the differentiable Bragg simulator are released.</w:t>
       </w:r>
     </w:p>
     <w:p>
@@ -310,8 +169,8 @@
         </w:pict>
       </w:r>
     </w:p>
-    <w:bookmarkEnd w:id="12"/>
-    <w:bookmarkStart w:id="17" w:name="introduction"/>
+    <w:bookmarkEnd w:id="9"/>
+    <w:bookmarkStart w:id="10" w:name="introduction"/>
     <w:p>
       <w:pPr>
         <w:pStyle w:val="Heading1"/>
@@ -348,43 +207,7 @@
         <w:pStyle w:val="BodyText"/>
       </w:pPr>
       <w:r>
-        <w:t xml:space="preserve">Three recent generative approaches (DiffractGPT</w:t>
-      </w:r>
-      <w:r>
-        <w:t xml:space="preserve"> </w:t>
-      </w:r>
-      <w:r>
-        <w:rPr>
-          <w:rStyle w:val="FootnoteReference"/>
-        </w:rPr>
-        <w:footnoteReference w:id="13"/>
-      </w:r>
-      <w:r>
-        <w:t xml:space="preserve">, Crystalyze</w:t>
-      </w:r>
-      <w:r>
-        <w:t xml:space="preserve"> </w:t>
-      </w:r>
-      <w:r>
-        <w:rPr>
-          <w:rStyle w:val="FootnoteReference"/>
-        </w:rPr>
-        <w:footnoteReference w:id="14"/>
-      </w:r>
-      <w:r>
-        <w:t xml:space="preserve">, PXRDnet</w:t>
-      </w:r>
-      <w:r>
-        <w:t xml:space="preserve"> </w:t>
-      </w:r>
-      <w:r>
-        <w:rPr>
-          <w:rStyle w:val="FootnoteReference"/>
-        </w:rPr>
-        <w:footnoteReference w:id="15"/>
-      </w:r>
-      <w:r>
-        <w:t xml:space="preserve">) argue neural networks can shortcut this pipeline. They report match rates in the tens of percent, but under mutually incompatible evaluation protocols, and failure modes are seldom catalogued. A practitioner cannot easily form a calibrated expectation of</w:t>
+        <w:t xml:space="preserve">Three recent generative approaches (DiffractGPT [1], Crystalyze [4], PXRDnet [2]) argue neural networks can shortcut this pipeline. They report match rates in the tens of percent, but under mutually incompatible evaluation protocols, and failure modes are seldom catalogued. A practitioner cannot easily form a calibrated expectation of</w:t>
       </w:r>
       <w:r>
         <w:t xml:space="preserve"> </w:t>
@@ -584,19 +407,7 @@
         <w:t xml:space="preserve"> </w:t>
       </w:r>
       <w:r>
-        <w:t xml:space="preserve">Top-K Debye rerank, Debye-gradient DDIM guidance, Wyckoff-site embeddings, and distance-matrix aux loss all fail at n ≥ 200; the latter two combined (v14) underperform the bare ε baseline. The gradient-guidance failure is corroborated independently by concurrent work showing the PXRD loss landscape is too rough for gradient descent</w:t>
-      </w:r>
-      <w:r>
-        <w:t xml:space="preserve"> </w:t>
-      </w:r>
-      <w:r>
-        <w:rPr>
-          <w:rStyle w:val="FootnoteReference"/>
-        </w:rPr>
-        <w:footnoteReference w:id="16"/>
-      </w:r>
-      <w:r>
-        <w:t xml:space="preserve">.</w:t>
+        <w:t xml:space="preserve">Top-K Debye rerank, Debye-gradient DDIM guidance, Wyckoff-site embeddings, and distance-matrix aux loss all fail at n ≥ 200; the latter two combined (v14) underperform the bare ε baseline. The gradient-guidance failure is corroborated independently by concurrent work showing the PXRD loss landscape is too rough for gradient descent [5].</w:t>
       </w:r>
     </w:p>
     <w:p>
@@ -676,8 +487,8 @@
         </w:pict>
       </w:r>
     </w:p>
-    <w:bookmarkEnd w:id="17"/>
-    <w:bookmarkStart w:id="30" w:name="related-work"/>
+    <w:bookmarkEnd w:id="10"/>
+    <w:bookmarkStart w:id="11" w:name="related-work"/>
     <w:p>
       <w:pPr>
         <w:pStyle w:val="Heading1"/>
@@ -701,52 +512,7 @@
         <w:t xml:space="preserve"> </w:t>
       </w:r>
       <w:r>
-        <w:t xml:space="preserve">CDVAE</w:t>
-      </w:r>
-      <w:r>
-        <w:t xml:space="preserve"> </w:t>
-      </w:r>
-      <w:r>
-        <w:rPr>
-          <w:rStyle w:val="FootnoteReference"/>
-        </w:rPr>
-        <w:footnoteReference w:id="18"/>
-      </w:r>
-      <w:r>
-        <w:t xml:space="preserve"> </w:t>
-      </w:r>
-      <w:r>
-        <w:t xml:space="preserve">introduced the MP-20 protocol; DiffCSP</w:t>
-      </w:r>
-      <w:r>
-        <w:t xml:space="preserve"> </w:t>
-      </w:r>
-      <w:r>
-        <w:rPr>
-          <w:rStyle w:val="FootnoteReference"/>
-        </w:rPr>
-        <w:footnoteReference w:id="19"/>
-      </w:r>
-      <w:r>
-        <w:t xml:space="preserve"> </w:t>
-      </w:r>
-      <w:r>
-        <w:t xml:space="preserve">used joint coord+lattice diffusion; MatterGen</w:t>
-      </w:r>
-      <w:r>
-        <w:t xml:space="preserve"> </w:t>
-      </w:r>
-      <w:r>
-        <w:rPr>
-          <w:rStyle w:val="FootnoteReference"/>
-        </w:rPr>
-        <w:footnoteReference w:id="20"/>
-      </w:r>
-      <w:r>
-        <w:t xml:space="preserve"> </w:t>
-      </w:r>
-      <w:r>
-        <w:t xml:space="preserve">scaled to millions of structures. PXRD-Diff borrows DiffCSP’s joint diffusion, restricted to the conditional setting where a 1D pattern conditions generation.</w:t>
+        <w:t xml:space="preserve">CDVAE [6] introduced the MP-20 protocol; DiffCSP [7] used joint coord+lattice diffusion; MatterGen [8] scaled to millions of structures. PXRD-Diff borrows DiffCSP’s joint diffusion, restricted to the conditional setting where a 1D pattern conditions generation.</w:t>
       </w:r>
     </w:p>
     <w:p>
@@ -764,52 +530,7 @@
         <w:t xml:space="preserve"> </w:t>
       </w:r>
       <w:r>
-        <w:t xml:space="preserve">DiffractGPT</w:t>
-      </w:r>
-      <w:r>
-        <w:t xml:space="preserve"> </w:t>
-      </w:r>
-      <w:r>
-        <w:rPr>
-          <w:rStyle w:val="FootnoteReference"/>
-        </w:rPr>
-        <w:footnoteReference w:id="21"/>
-      </w:r>
-      <w:r>
-        <w:t xml:space="preserve"> </w:t>
-      </w:r>
-      <w:r>
-        <w:t xml:space="preserve">is a fine-tuned Mistral-7B that decodes peak list + formula → CIF tokens. Crystalyze</w:t>
-      </w:r>
-      <w:r>
-        <w:t xml:space="preserve"> </w:t>
-      </w:r>
-      <w:r>
-        <w:rPr>
-          <w:rStyle w:val="FootnoteReference"/>
-        </w:rPr>
-        <w:footnoteReference w:id="22"/>
-      </w:r>
-      <w:r>
-        <w:t xml:space="preserve"> </w:t>
-      </w:r>
-      <w:r>
-        <w:t xml:space="preserve">uses CDVAE conditioned on an XRD transformer encoder with post-hoc symmetry filtering. PXRDnet</w:t>
-      </w:r>
-      <w:r>
-        <w:t xml:space="preserve"> </w:t>
-      </w:r>
-      <w:r>
-        <w:rPr>
-          <w:rStyle w:val="FootnoteReference"/>
-        </w:rPr>
-        <w:footnoteReference w:id="23"/>
-      </w:r>
-      <w:r>
-        <w:t xml:space="preserve"> </w:t>
-      </w:r>
-      <w:r>
-        <w:t xml:space="preserve">is a CDVAE variant with</w:t>
+        <w:t xml:space="preserve">DiffractGPT [1] is a fine-tuned Mistral-7B that decodes peak list + formula → CIF tokens. Crystalyze [4] uses CDVAE conditioned on an XRD transformer encoder with post-hoc symmetry filtering. PXRDnet [2] is a CDVAE variant with</w:t>
       </w:r>
       <w:r>
         <w:t xml:space="preserve"> </w:t>
@@ -841,22 +562,7 @@
         <w:t xml:space="preserve"> </w:t>
       </w:r>
       <w:r>
-        <w:t xml:space="preserve">in 2025. deCIFer</w:t>
-      </w:r>
-      <w:r>
-        <w:t xml:space="preserve"> </w:t>
-      </w:r>
-      <w:r>
-        <w:rPr>
-          <w:rStyle w:val="FootnoteReference"/>
-        </w:rPr>
-        <w:footnoteReference w:id="24"/>
-      </w:r>
-      <w:r>
-        <w:t xml:space="preserve"> </w:t>
-      </w:r>
-      <w:r>
-        <w:t xml:space="preserve">is a concurrent autoregressive-language-model approach that, like DiffractGPT, emits CIF tokens. All four are larger than PXRD-Diff and report results under bespoke evaluation pipelines; §5.3 re-scores DiffractGPT, PXRDnet, and deCIFer on a single shared</w:t>
+        <w:t xml:space="preserve">in 2025. deCIFer [3] is a concurrent autoregressive-language-model approach that, like DiffractGPT, emits CIF tokens. All four are larger than PXRD-Diff and report results under bespoke evaluation pipelines; §5.3 re-scores DiffractGPT, PXRDnet, and deCIFer on a single shared</w:t>
       </w:r>
       <w:r>
         <w:t xml:space="preserve"> </w:t>
@@ -901,22 +607,7 @@
         <w:t xml:space="preserve"> </w:t>
       </w:r>
       <w:r>
-        <w:t xml:space="preserve">Recovering a unit cell from peak positions is a solved sub-problem with a fifty-year toolchain: the de-Wolff dichotomy method, ITO, TREOR, and DICVOL</w:t>
-      </w:r>
-      <w:r>
-        <w:t xml:space="preserve"> </w:t>
-      </w:r>
-      <w:r>
-        <w:rPr>
-          <w:rStyle w:val="FootnoteReference"/>
-        </w:rPr>
-        <w:footnoteReference w:id="25"/>
-      </w:r>
-      <w:r>
-        <w:t xml:space="preserve"> </w:t>
-      </w:r>
-      <w:r>
-        <w:t xml:space="preserve">index high-symmetry powder patterns in CPU milliseconds, with the difficulty concentrated in low-symmetry (monoclinic/triclinic) cells. §3.5 reuses this machinery as a drop-in for the learned lattice head, and §5.2/§5.5 show the resulting lift tracks exactly the symmetry-dependent accuracy classical indexers have always had.</w:t>
+        <w:t xml:space="preserve">Recovering a unit cell from peak positions is a solved sub-problem with a fifty-year toolchain: the de-Wolff dichotomy method, ITO, TREOR, and DICVOL [9] index high-symmetry powder patterns in CPU milliseconds, with the difficulty concentrated in low-symmetry (monoclinic/triclinic) cells. §3.5 reuses this machinery as a drop-in for the learned lattice head, and §5.2/§5.5 show the resulting lift tracks exactly the symmetry-dependent accuracy classical indexers have always had.</w:t>
       </w:r>
     </w:p>
     <w:p>
@@ -934,34 +625,7 @@
         <w:t xml:space="preserve"> </w:t>
       </w:r>
       <w:r>
-        <w:t xml:space="preserve">Scattering-pattern losses date to Rietveld; the contribution here is full differentiability w.r.t. coordinates and lattice in PyTorch, usable as a diffusion-training loss term. Concurrent generative-inversion work conditions on differentiable spectral targets for amorphous and nanostructured systems</w:t>
-      </w:r>
-      <w:r>
-        <w:t xml:space="preserve"> </w:t>
-      </w:r>
-      <w:r>
-        <w:rPr>
-          <w:rStyle w:val="FootnoteReference"/>
-        </w:rPr>
-        <w:footnoteReference w:id="26"/>
-      </w:r>
-      <w:r>
-        <w:t xml:space="preserve">. Relevant to our negative results, Segal et al.</w:t>
-      </w:r>
-      <w:r>
-        <w:t xml:space="preserve"> </w:t>
-      </w:r>
-      <w:r>
-        <w:rPr>
-          <w:rStyle w:val="FootnoteReference"/>
-        </w:rPr>
-        <w:footnoteReference w:id="27"/>
-      </w:r>
-      <w:r>
-        <w:t xml:space="preserve"> </w:t>
-      </w:r>
-      <w:r>
-        <w:t xml:space="preserve">show the powder-XRD similarity loss landscape is</w:t>
+        <w:t xml:space="preserve">Scattering-pattern losses date to Rietveld; the contribution here is full differentiability w.r.t. coordinates and lattice in PyTorch, usable as a diffusion-training loss term. Concurrent generative-inversion work conditions on differentiable spectral targets for amorphous and nanostructured systems [10]. Relevant to our negative results, Segal et al. [5] show the powder-XRD similarity loss landscape is</w:t>
       </w:r>
       <w:r>
         <w:t xml:space="preserve"> </w:t>
@@ -988,34 +652,7 @@
         <w:t xml:space="preserve"> </w:t>
       </w:r>
       <w:r>
-        <w:t xml:space="preserve">Not strictly E(3)-equivariant: we use periodic-distance RBFs (SchNet-style</w:t>
-      </w:r>
-      <w:r>
-        <w:t xml:space="preserve"> </w:t>
-      </w:r>
-      <w:r>
-        <w:rPr>
-          <w:rStyle w:val="FootnoteReference"/>
-        </w:rPr>
-        <w:footnoteReference w:id="28"/>
-      </w:r>
-      <w:r>
-        <w:t xml:space="preserve">). A frozen MACE</w:t>
-      </w:r>
-      <w:r>
-        <w:t xml:space="preserve"> </w:t>
-      </w:r>
-      <w:r>
-        <w:rPr>
-          <w:rStyle w:val="FootnoteReference"/>
-        </w:rPr>
-        <w:footnoteReference w:id="29"/>
-      </w:r>
-      <w:r>
-        <w:t xml:space="preserve"> </w:t>
-      </w:r>
-      <w:r>
-        <w:t xml:space="preserve">encoder showed no measurable benefit at MP-20 scale in pilots and was deferred.</w:t>
+        <w:t xml:space="preserve">Not strictly E(3)-equivariant: we use periodic-distance RBFs (SchNet-style [11]). A frozen MACE [12] encoder showed no measurable benefit at MP-20 scale in pilots and was deferred.</w:t>
       </w:r>
     </w:p>
     <w:p>
@@ -1025,8 +662,8 @@
         </w:pict>
       </w:r>
     </w:p>
-    <w:bookmarkEnd w:id="30"/>
-    <w:bookmarkStart w:id="44" w:name="method"/>
+    <w:bookmarkEnd w:id="11"/>
+    <w:bookmarkStart w:id="22" w:name="method"/>
     <w:p>
       <w:pPr>
         <w:pStyle w:val="Heading1"/>
@@ -1035,7 +672,7 @@
         <w:t xml:space="preserve">3. Method</w:t>
       </w:r>
     </w:p>
-    <w:bookmarkStart w:id="31" w:name="problem-formulation"/>
+    <w:bookmarkStart w:id="12" w:name="problem-formulation"/>
     <w:p>
       <w:pPr>
         <w:pStyle w:val="Heading2"/>
@@ -1587,8 +1224,8 @@
         <w:t xml:space="preserve">being known is a meaningful simplification (in practice one usually knows the chemistry from synthesis), but it is consistent with prior work on the same task.</w:t>
       </w:r>
     </w:p>
-    <w:bookmarkEnd w:id="31"/>
-    <w:bookmarkStart w:id="32" w:name="architecture-overview"/>
+    <w:bookmarkEnd w:id="12"/>
+    <w:bookmarkStart w:id="13" w:name="architecture-overview"/>
     <w:p>
       <w:pPr>
         <w:pStyle w:val="Heading2"/>
@@ -2426,8 +2063,8 @@
         <w:t xml:space="preserve">alone, trained with an MSE loss against the (normalised) ground-truth lattice. Its purpose is purely diagnostic, to expose whether the encoder is learning any lattice-relevant representation, and its loss does not flow back into the denoiser.</w:t>
       </w:r>
     </w:p>
-    <w:bookmarkEnd w:id="32"/>
-    <w:bookmarkStart w:id="37" w:name="Xc917a453586cc10256448f63d6af218d81ba9bb"/>
+    <w:bookmarkEnd w:id="13"/>
+    <w:bookmarkStart w:id="18" w:name="Xc917a453586cc10256448f63d6af218d81ba9bb"/>
     <w:p>
       <w:pPr>
         <w:pStyle w:val="Heading2"/>
@@ -3138,7 +2775,7 @@
         <w:t xml:space="preserve">reference: mean 0.962, std 0.027, min 0.896, max 0.998. All 50/50 correlations exceed 0.7 and we verified non-zero gradients through the structure factor with respect to fractional coordinates.</w:t>
       </w:r>
     </w:p>
-    <w:bookmarkStart w:id="36" w:name="fig:validation"/>
+    <w:bookmarkStart w:id="17" w:name="fig:validation"/>
     <w:p>
       <w:pPr>
         <w:pStyle w:val="CaptionedFigure"/>
@@ -3148,18 +2785,18 @@
           <wp:inline>
             <wp:extent cx="4140794" cy="2672861"/>
             <wp:effectExtent b="0" l="0" r="0" t="0"/>
-            <wp:docPr descr="Figure 1. Differentiable-simulator validation. Distribution of Pearson correlation between the PyTorch DiffPXRD module and pymatgen.XRDCalculator over 50 random MP-20 test structures (mean 0.962). All 50 exceed 0.7; the lower tail is dominated by layered structures with strong texture in the reference." title="" id="34" name="Picture"/>
+            <wp:docPr descr="Figure 1. Differentiable-simulator validation. Distribution of Pearson correlation between the PyTorch DiffPXRD module and pymatgen.XRDCalculator over 50 random MP-20 test structures (mean 0.962). All 50 exceed 0.7; the lower tail is dominated by layered structures with strong texture in the reference." title="" id="15" name="Picture"/>
             <a:graphic>
               <a:graphicData uri="http://schemas.openxmlformats.org/drawingml/2006/picture">
                 <pic:pic>
                   <pic:nvPicPr>
-                    <pic:cNvPr descr="fig3_diffpxrd_validation.png" id="35" name="Picture"/>
+                    <pic:cNvPr descr="fig3_diffpxrd_validation.png" id="16" name="Picture"/>
                     <pic:cNvPicPr>
                       <a:picLocks noChangeArrowheads="1" noChangeAspect="1"/>
                     </pic:cNvPicPr>
                   </pic:nvPicPr>
                   <pic:blipFill>
-                    <a:blip r:embed="rId33"/>
+                    <a:blip r:embed="rId14"/>
                     <a:stretch>
                       <a:fillRect/>
                     </a:stretch>
@@ -3219,7 +2856,7 @@
         <w:t xml:space="preserve">over 50 random MP-20 test structures (mean 0.962). All 50 exceed 0.7; the lower tail is dominated by layered structures with strong texture in the reference.</w:t>
       </w:r>
     </w:p>
-    <w:bookmarkEnd w:id="36"/>
+    <w:bookmarkEnd w:id="17"/>
     <w:p>
       <w:pPr>
         <w:pStyle w:val="BodyText"/>
@@ -3441,8 +3078,8 @@
         <w:t xml:space="preserve">. We use the true lattice for this auxiliary loss because the differentiable simulator is more sensitive to lattice errors than to coordinate errors at the early stages of training, and disentangling the two signals proved more stable.</w:t>
       </w:r>
     </w:p>
-    <w:bookmarkEnd w:id="37"/>
-    <w:bookmarkStart w:id="39" w:name="training-objective"/>
+    <w:bookmarkEnd w:id="18"/>
+    <w:bookmarkStart w:id="19" w:name="training-objective"/>
     <w:p>
       <w:pPr>
         <w:pStyle w:val="Heading2"/>
@@ -3456,22 +3093,7 @@
         <w:pStyle w:val="FirstParagraph"/>
       </w:pPr>
       <w:r>
-        <w:t xml:space="preserve">We use a VP-SDE with cosine schedule</w:t>
-      </w:r>
-      <w:r>
-        <w:t xml:space="preserve"> </w:t>
-      </w:r>
-      <w:r>
-        <w:rPr>
-          <w:rStyle w:val="FootnoteReference"/>
-        </w:rPr>
-        <w:footnoteReference w:id="38"/>
-      </w:r>
-      <w:r>
-        <w:t xml:space="preserve"> </w:t>
-      </w:r>
-      <w:r>
-        <w:t xml:space="preserve">for both channels:</w:t>
+        <w:t xml:space="preserve">We use a VP-SDE with cosine schedule [13] for both channels:</w:t>
       </w:r>
     </w:p>
     <w:p>
@@ -4695,8 +4317,8 @@
         <w:t xml:space="preserve">flags.</w:t>
       </w:r>
     </w:p>
-    <w:bookmarkEnd w:id="39"/>
-    <w:bookmarkStart w:id="41" w:name="X6e75ac1b115bab34c6f95946b56455b7789be55"/>
+    <w:bookmarkEnd w:id="19"/>
+    <w:bookmarkStart w:id="20" w:name="X6e75ac1b115bab34c6f95946b56455b7789be55"/>
     <w:p>
       <w:pPr>
         <w:pStyle w:val="Heading2"/>
@@ -4768,22 +4390,7 @@
         <w:t xml:space="preserve"> </w:t>
       </w:r>
       <w:r>
-        <w:t xml:space="preserve">Native indexer overall: 48.8 % strict cell match, 1.45 Å mean cell-length MAE. Per crystal system: hexagonal 77.9 % / 0.53 Å, orthorhombic 59.8 % / 0.96 Å, trigonal 43.3 % / 4.62 Å, monoclinic 18.9 % / 1.76 Å, triclinic 0 %. The low-symmetry blowup (monoclinic and triclinic each have ≥ 4 free cell parameters and the de-Wolff search becomes hypothesis-capped) is the dominant remaining error. We ship a GSAS-II</w:t>
-      </w:r>
-      <w:r>
-        <w:t xml:space="preserve"> </w:t>
-      </w:r>
-      <w:r>
-        <w:rPr>
-          <w:rStyle w:val="FootnoteReference"/>
-        </w:rPr>
-        <w:footnoteReference w:id="40"/>
-      </w:r>
-      <w:r>
-        <w:t xml:space="preserve"> </w:t>
-      </w:r>
-      <w:r>
-        <w:t xml:space="preserve">adapter (</w:t>
+        <w:t xml:space="preserve">Native indexer overall: 48.8 % strict cell match, 1.45 Å mean cell-length MAE. Per crystal system: hexagonal 77.9 % / 0.53 Å, orthorhombic 59.8 % / 0.96 Å, trigonal 43.3 % / 4.62 Å, monoclinic 18.9 % / 1.76 Å, triclinic 0 %. The low-symmetry blowup (monoclinic and triclinic each have ≥ 4 free cell parameters and the de-Wolff search becomes hypothesis-capped) is the dominant remaining error. We ship a GSAS-II [14] adapter (</w:t>
       </w:r>
       <w:r>
         <w:rPr>
@@ -4864,8 +4471,8 @@
         <w:t xml:space="preserve">in the strongest sense: training is unchanged, the diffusion sampler is unchanged except for the lattice-channel substitution at t = T, and the headline metric (§5.2) reports both with and without the indexer for direct comparison.</w:t>
       </w:r>
     </w:p>
-    <w:bookmarkEnd w:id="41"/>
-    <w:bookmarkStart w:id="43" w:name="sampling"/>
+    <w:bookmarkEnd w:id="20"/>
+    <w:bookmarkStart w:id="21" w:name="sampling"/>
     <w:p>
       <w:pPr>
         <w:pStyle w:val="Heading2"/>
@@ -4879,22 +4486,7 @@
         <w:pStyle w:val="FirstParagraph"/>
       </w:pPr>
       <w:r>
-        <w:t xml:space="preserve">DDIM</w:t>
-      </w:r>
-      <w:r>
-        <w:t xml:space="preserve"> </w:t>
-      </w:r>
-      <w:r>
-        <w:rPr>
-          <w:rStyle w:val="FootnoteReference"/>
-        </w:rPr>
-        <w:footnoteReference w:id="42"/>
-      </w:r>
-      <w:r>
-        <w:t xml:space="preserve"> </w:t>
-      </w:r>
-      <w:r>
-        <w:t xml:space="preserve">with 50 steps and</w:t>
+        <w:t xml:space="preserve">DDIM [15] with 50 steps and</w:t>
       </w:r>
       <w:r>
         <w:t xml:space="preserve"> </w:t>
@@ -5212,9 +4804,9 @@
         </w:pict>
       </w:r>
     </w:p>
-    <w:bookmarkEnd w:id="43"/>
-    <w:bookmarkEnd w:id="44"/>
-    <w:bookmarkStart w:id="46" w:name="experiments"/>
+    <w:bookmarkEnd w:id="21"/>
+    <w:bookmarkEnd w:id="22"/>
+    <w:bookmarkStart w:id="23" w:name="experiments"/>
     <w:p>
       <w:pPr>
         <w:pStyle w:val="Heading1"/>
@@ -5238,22 +4830,7 @@
         <w:t xml:space="preserve"> </w:t>
       </w:r>
       <w:r>
-        <w:t xml:space="preserve">Canonical CDVAE</w:t>
-      </w:r>
-      <w:r>
-        <w:t xml:space="preserve"> </w:t>
-      </w:r>
-      <w:r>
-        <w:rPr>
-          <w:rStyle w:val="FootnoteReference"/>
-        </w:rPr>
-        <w:footnoteReference w:id="45"/>
-      </w:r>
-      <w:r>
-        <w:t xml:space="preserve"> </w:t>
-      </w:r>
-      <w:r>
-        <w:t xml:space="preserve">MP-20 split: 27 136 / 9 047 / 9 046 train/val/test, ≤ 20 atoms/conventional cell. Patterns simulated with</w:t>
+        <w:t xml:space="preserve">Canonical CDVAE [6] MP-20 split: 27 136 / 9 047 / 9 046 train/val/test, ≤ 20 atoms/conventional cell. Patterns simulated with</w:t>
       </w:r>
       <w:r>
         <w:t xml:space="preserve"> </w:t>
@@ -5841,8 +5418,8 @@
         </w:pict>
       </w:r>
     </w:p>
-    <w:bookmarkEnd w:id="46"/>
-    <w:bookmarkStart w:id="73" w:name="results"/>
+    <w:bookmarkEnd w:id="23"/>
+    <w:bookmarkStart w:id="46" w:name="results"/>
     <w:p>
       <w:pPr>
         <w:pStyle w:val="Heading1"/>
@@ -5859,7 +5436,7 @@
         <w:t xml:space="preserve">Order: Phase 4 architectural ablation (§5.1) → Phase 9 indexer drop-in (§5.2) → reproduced baselines (§5.3) → failure catalogue (§5.4) → encoder-bottleneck perturbation study (§5.5).</w:t>
       </w:r>
     </w:p>
-    <w:bookmarkStart w:id="51" w:name="Xadaaeed9a4d3d9b8a4dfaf721f122e0603fe773"/>
+    <w:bookmarkStart w:id="28" w:name="Xadaaeed9a4d3d9b8a4dfaf721f122e0603fe773"/>
     <w:p>
       <w:pPr>
         <w:pStyle w:val="Heading2"/>
@@ -6573,7 +6150,7 @@
         </w:tc>
       </w:tr>
     </w:tbl>
-    <w:bookmarkStart w:id="50" w:name="fig:ablation"/>
+    <w:bookmarkStart w:id="27" w:name="fig:ablation"/>
     <w:p>
       <w:pPr>
         <w:pStyle w:val="CaptionedFigure"/>
@@ -6583,18 +6160,18 @@
           <wp:inline>
             <wp:extent cx="5334000" cy="2222893"/>
             <wp:effectExtent b="0" l="0" r="0" t="0"/>
-            <wp:docPr descr="Figure 2. Phase 4 architectural ablation. Match rate (a) and pattern Pearson (b) for the seven coordinate-only runs of Table 1 on MP-20 test (n = 1000, true lattice substituted). The ε → x₀-residual switch (v11 → v13) shows the largest single-seed match lift (panel a), but that match lift does not replicate across seeds; only the pattern-Pearson gain (panel b) does (§7); adding Wyckoff embeddings or a distance-matrix loss regresses below it." title="" id="48" name="Picture"/>
+            <wp:docPr descr="Figure 2. Phase 4 architectural ablation. Match rate (a) and pattern Pearson (b) for the seven coordinate-only runs of Table 1 on MP-20 test (n = 1000, true lattice substituted). The ε → x₀-residual switch (v11 → v13) shows the largest single-seed match lift (panel a), but that match lift does not replicate across seeds; only the pattern-Pearson gain (panel b) does (§7); adding Wyckoff embeddings or a distance-matrix loss regresses below it." title="" id="25" name="Picture"/>
             <a:graphic>
               <a:graphicData uri="http://schemas.openxmlformats.org/drawingml/2006/picture">
                 <pic:pic>
                   <pic:nvPicPr>
-                    <pic:cNvPr descr="fig1_ablation.png" id="49" name="Picture"/>
+                    <pic:cNvPr descr="fig1_ablation.png" id="26" name="Picture"/>
                     <pic:cNvPicPr>
                       <a:picLocks noChangeArrowheads="1" noChangeAspect="1"/>
                     </pic:cNvPicPr>
                   </pic:nvPicPr>
                   <pic:blipFill>
-                    <a:blip r:embed="rId47"/>
+                    <a:blip r:embed="rId24"/>
                     <a:stretch>
                       <a:fillRect/>
                     </a:stretch>
@@ -6639,7 +6216,7 @@
         <w:t xml:space="preserve">Match rate (a) and pattern Pearson (b) for the seven coordinate-only runs of Table 1 on MP-20 test (n = 1000, true lattice substituted). The ε → x₀-residual switch (v11 → v13) shows the largest single-seed match lift (panel a), but that match lift does not replicate across seeds; only the pattern-Pearson gain (panel b) does (§7); adding Wyckoff embeddings or a distance-matrix loss regresses below it.</w:t>
       </w:r>
     </w:p>
-    <w:bookmarkEnd w:id="50"/>
+    <w:bookmarkEnd w:id="27"/>
     <w:p>
       <w:pPr>
         <w:pStyle w:val="BodyText"/>
@@ -6799,8 +6376,8 @@
         <w:t xml:space="preserve">) stayed at the same ~1.0 coord-loss plateau as v10. Under the full pipeline (sampled lattice), v13 drops to 1.2 % at n = 256; the Phase 9 v21 checkpoint reaches 4.5 % under oracle (three seeds; an earlier single-seed snapshot read 5.6 %) but only 1.0 % under full pipeline. §5.2 attacks that gap.</w:t>
       </w:r>
     </w:p>
-    <w:bookmarkEnd w:id="51"/>
-    <w:bookmarkStart w:id="56" w:name="phase-9-classical-indexer-drop-in"/>
+    <w:bookmarkEnd w:id="28"/>
+    <w:bookmarkStart w:id="33" w:name="phase-9-classical-indexer-drop-in"/>
     <w:p>
       <w:pPr>
         <w:pStyle w:val="Heading2"/>
@@ -7700,7 +7277,7 @@
         <w:t xml:space="preserve">(135 / 3 000 pooled), still disjoint from the indexer’s 1.5 % [1.2, 2.0]. The indexer → oracle gap (1.5 → 4.5 %) is itself significant (disjoint CIs) and isolates the lattice-attributable error: even with a perfect lattice, match caps at 4.5 %, so coordinate prediction is the dominant limiter while lattice error explains the 1.5 → 4.5 % shortfall. The indexer’s per-system MAE (1.45 Å overall, dominated by mono 1.76 Å and triclinic NaN) sits above the 0.5 Å knee; closing the rest requires fixing the low-symmetry path (GSAS-II remains experimental).</w:t>
       </w:r>
     </w:p>
-    <w:bookmarkStart w:id="55" w:name="fig:indexer"/>
+    <w:bookmarkStart w:id="32" w:name="fig:indexer"/>
     <w:p>
       <w:pPr>
         <w:pStyle w:val="CaptionedFigure"/>
@@ -7710,18 +7287,18 @@
           <wp:inline>
             <wp:extent cx="5334000" cy="2423254"/>
             <wp:effectExtent b="0" l="0" r="0" t="0"/>
-            <wp:docPr descr="Figure 3. Per-system indexer performance. Strict and consistent indexing rates (a) and length MAE (b) on n = 1 000. High-symmetry systems (hex, ortho) sit below the 0.5 Å knee; trig and mono blow up; triclinic is unindexable in this implementation. The overall 1.45 Å MAE hides two regimes, and explains why the indexer’s significant match-rate gain (§5.2) is concentrated entirely in the high-symmetry systems." title="" id="53" name="Picture"/>
+            <wp:docPr descr="Figure 3. Per-system indexer performance. Strict and consistent indexing rates (a) and length MAE (b) on n = 1 000. High-symmetry systems (hex, ortho) sit below the 0.5 Å knee; trig and mono blow up; triclinic is unindexable in this implementation. The overall 1.45 Å MAE hides two regimes, and explains why the indexer’s significant match-rate gain (§5.2) is concentrated entirely in the high-symmetry systems." title="" id="30" name="Picture"/>
             <a:graphic>
               <a:graphicData uri="http://schemas.openxmlformats.org/drawingml/2006/picture">
                 <pic:pic>
                   <pic:nvPicPr>
-                    <pic:cNvPr descr="fig4_indexer_bench.png" id="54" name="Picture"/>
+                    <pic:cNvPr descr="fig4_indexer_bench.png" id="31" name="Picture"/>
                     <pic:cNvPicPr>
                       <a:picLocks noChangeArrowheads="1" noChangeAspect="1"/>
                     </pic:cNvPicPr>
                   </pic:nvPicPr>
                   <pic:blipFill>
-                    <a:blip r:embed="rId52"/>
+                    <a:blip r:embed="rId29"/>
                     <a:stretch>
                       <a:fillRect/>
                     </a:stretch>
@@ -7766,9 +7343,9 @@
         <w:t xml:space="preserve">Strict and consistent indexing rates (a) and length MAE (b) on n = 1 000. High-symmetry systems (hex, ortho) sit below the 0.5 Å knee; trig and mono blow up; triclinic is unindexable in this implementation. The overall 1.45 Å MAE hides two regimes, and explains why the indexer’s significant match-rate gain (§5.2) is concentrated entirely in the high-symmetry systems.</w:t>
       </w:r>
     </w:p>
-    <w:bookmarkEnd w:id="55"/>
-    <w:bookmarkEnd w:id="56"/>
-    <w:bookmarkStart w:id="64" w:name="head-to-head-with-external-baselines"/>
+    <w:bookmarkEnd w:id="32"/>
+    <w:bookmarkEnd w:id="33"/>
+    <w:bookmarkStart w:id="38" w:name="head-to-head-with-external-baselines"/>
     <w:p>
       <w:pPr>
         <w:pStyle w:val="Heading2"/>
@@ -8008,16 +7585,7 @@
               <w:pStyle w:val="Compact"/>
             </w:pPr>
             <w:r>
-              <w:t xml:space="preserve">DiffractGPT</w:t>
-            </w:r>
-            <w:r>
-              <w:t xml:space="preserve"> </w:t>
-            </w:r>
-            <w:r>
-              <w:rPr>
-                <w:rStyle w:val="FootnoteReference"/>
-              </w:rPr>
-              <w:footnoteReference w:id="57"/>
+              <w:t xml:space="preserve">DiffractGPT [1]</w:t>
             </w:r>
           </w:p>
         </w:tc>
@@ -8085,16 +7653,7 @@
               <w:pStyle w:val="Compact"/>
             </w:pPr>
             <w:r>
-              <w:t xml:space="preserve">PXRDnet sinc100</w:t>
-            </w:r>
-            <w:r>
-              <w:t xml:space="preserve"> </w:t>
-            </w:r>
-            <w:r>
-              <w:rPr>
-                <w:rStyle w:val="FootnoteReference"/>
-              </w:rPr>
-              <w:footnoteReference w:id="58"/>
+              <w:t xml:space="preserve">PXRDnet sinc100 [2]</w:t>
             </w:r>
           </w:p>
         </w:tc>
@@ -8162,16 +7721,7 @@
               <w:pStyle w:val="Compact"/>
             </w:pPr>
             <w:r>
-              <w:t xml:space="preserve">deCIFer</w:t>
-            </w:r>
-            <w:r>
-              <w:t xml:space="preserve"> </w:t>
-            </w:r>
-            <w:r>
-              <w:rPr>
-                <w:rStyle w:val="FootnoteReference"/>
-              </w:rPr>
-              <w:footnoteReference w:id="59"/>
+              <w:t xml:space="preserve">deCIFer [3]</w:t>
             </w:r>
           </w:p>
         </w:tc>
@@ -8426,10 +7976,10 @@
         <w:t xml:space="preserve"> </w:t>
       </w:r>
       <w:r>
-        <w:t xml:space="preserve">(PXRDnet’s ~35 k-op latent optimisation vs our single DDIM pass). The honest reading of Table 3 is therefore a capability/compute gap at fixed input information, not an input-handicap artefact; it is exactly the gap a deliberately small diagnostic model is expected to exhibit (§6).</w:t>
-      </w:r>
-    </w:p>
-    <w:bookmarkStart w:id="63" w:name="fig:threeway"/>
+        <w:t xml:space="preserve">(PXRDnet’s ~35 k-op latent optimisation vs our single DDIM pass). The honest reading of Table 3 is therefore a capability/compute gap at fixed input information, not an artefact of unequal input information; it is exactly the gap a deliberately small diagnostic model is expected to exhibit (§6).</w:t>
+      </w:r>
+    </w:p>
+    <w:bookmarkStart w:id="37" w:name="fig:threeway"/>
     <w:p>
       <w:pPr>
         <w:pStyle w:val="CaptionedFigure"/>
@@ -8439,18 +7989,18 @@
           <wp:inline>
             <wp:extent cx="5334000" cy="2210273"/>
             <wp:effectExtent b="0" l="0" r="0" t="0"/>
-            <wp:docPr descr="Figure 4. Three-way headline comparison. Match rate, all-correct, and pattern-Pearson on the same MP-20 test materials scored through our StructureMatcher harness, with 95 % Wilson CIs. PXRD-Diff loses on match rate by 12–19× but wins on per-pattern Pearson. Note the wide PXRDnet (n = 20) intervals: the DGpt &gt; PXRDnet all-correct ordering is a hypothesis, not an established result (§5.3, §6)." title="" id="61" name="Picture"/>
+            <wp:docPr descr="Figure 4. Three-way headline comparison. Match rate, all-correct, and pattern-Pearson on the same MP-20 test materials scored through our StructureMatcher harness, with 95 % Wilson CIs. PXRD-Diff loses on match rate by 12–19× but wins on per-pattern Pearson. Note the wide PXRDnet (n = 20) intervals: the DGpt &gt; PXRDnet all-correct ordering is a hypothesis, not an established result (§5.3, §6)." title="" id="35" name="Picture"/>
             <a:graphic>
               <a:graphicData uri="http://schemas.openxmlformats.org/drawingml/2006/picture">
                 <pic:pic>
                   <pic:nvPicPr>
-                    <pic:cNvPr descr="fig5_threeway_headline.png" id="62" name="Picture"/>
+                    <pic:cNvPr descr="fig5_threeway_headline.png" id="36" name="Picture"/>
                     <pic:cNvPicPr>
                       <a:picLocks noChangeArrowheads="1" noChangeAspect="1"/>
                     </pic:cNvPicPr>
                   </pic:nvPicPr>
                   <pic:blipFill>
-                    <a:blip r:embed="rId60"/>
+                    <a:blip r:embed="rId34"/>
                     <a:stretch>
                       <a:fillRect/>
                     </a:stretch>
@@ -8520,7 +8070,7 @@
         <w:t xml:space="preserve">harness, with 95 % Wilson CIs. PXRD-Diff loses on match rate by 12–19× but wins on per-pattern Pearson. Note the wide PXRDnet (n = 20) intervals: the DGpt &gt; PXRDnet all-correct ordering is a hypothesis, not an established result (§5.3, §6).</w:t>
       </w:r>
     </w:p>
-    <w:bookmarkEnd w:id="63"/>
+    <w:bookmarkEnd w:id="37"/>
     <w:p>
       <w:pPr>
         <w:pStyle w:val="BodyText"/>
@@ -8539,8 +8089,8 @@
         <w:t xml:space="preserve">PXRDnet n = 20 has a 95 % Wilson CI of roughly ±20 pp on every rate; n = 200 would need ~33 days of RTX 5090 rental at ~4 GPU-hr/material. Patterns are simulated through each model’s own preprocessing (different bins, 2θ vs Q, broadening): material_ids are identical, pattern inputs are not bit-identical; §7 bounds this.</w:t>
       </w:r>
     </w:p>
-    <w:bookmarkEnd w:id="64"/>
-    <w:bookmarkStart w:id="70" w:name="what-did-not-work"/>
+    <w:bookmarkEnd w:id="38"/>
+    <w:bookmarkStart w:id="43" w:name="what-did-not-work"/>
     <w:p>
       <w:pPr>
         <w:pStyle w:val="Heading2"/>
@@ -8739,19 +8289,7 @@
         <w:t xml:space="preserve"> </w:t>
       </w:r>
       <w:r>
-        <w:t xml:space="preserve">on n = 200: flat 1.0–2.5 % within noise, all-correct 0 % throughout. Sampling-time Debye gradient is too noisy to steer the trajectory, consistent with Segal et al.</w:t>
-      </w:r>
-      <w:r>
-        <w:t xml:space="preserve"> </w:t>
-      </w:r>
-      <w:r>
-        <w:rPr>
-          <w:rStyle w:val="FootnoteReference"/>
-        </w:rPr>
-        <w:footnoteReference w:id="65"/>
-      </w:r>
-      <w:r>
-        <w:t xml:space="preserve">, who show the powder-XRD similarity loss landscape is too non-convex for direct gradient descent.</w:t>
+        <w:t xml:space="preserve">on n = 200: flat 1.0–2.5 % within noise, all-correct 0 % throughout. Sampling-time Debye gradient is too noisy to steer the trajectory, consistent with Segal et al. [5], who show the powder-XRD similarity loss landscape is too non-convex for direct gradient descent.</w:t>
       </w:r>
     </w:p>
     <w:p>
@@ -8793,7 +8331,7 @@
         <w:t xml:space="preserve">added to atom features. The embedding learns (5 404/6 912 entries non-zero) but match drops 2.5 % → 2.1 % and destabilises lattice prediction (lat loss ~0.6 vs ~0.02; Figure 5). We suspect inflated atom-feature norm shifts the lattice-pool input distribution.</w:t>
       </w:r>
     </w:p>
-    <w:bookmarkStart w:id="69" w:name="fig:training"/>
+    <w:bookmarkStart w:id="42" w:name="fig:training"/>
     <w:p>
       <w:pPr>
         <w:pStyle w:val="CaptionedFigure"/>
@@ -8803,18 +8341,18 @@
           <wp:inline>
             <wp:extent cx="5334000" cy="2277073"/>
             <wp:effectExtent b="0" l="0" r="0" t="0"/>
-            <wp:docPr descr="Figure 5. Wyckoff embedding destabilises lattice prediction. Lattice (a) and coordinate (b) training-loss curves for the distance-aux run (v16) vs the Wyckoff-embedding run (v15). Adding the Wyckoff embedding inflates the lattice loss by an order of magnitude (~0.6 vs ~0.02) while leaving the coordinate loss largely unchanged; the failure is localised to the lattice channel." title="" id="67" name="Picture"/>
+            <wp:docPr descr="Figure 5. Wyckoff embedding destabilises lattice prediction. Lattice (a) and coordinate (b) training-loss curves for the distance-aux run (v16) vs the Wyckoff-embedding run (v15). Adding the Wyckoff embedding inflates the lattice loss by an order of magnitude (~0.6 vs ~0.02) while leaving the coordinate loss largely unchanged; the failure is localised to the lattice channel." title="" id="40" name="Picture"/>
             <a:graphic>
               <a:graphicData uri="http://schemas.openxmlformats.org/drawingml/2006/picture">
                 <pic:pic>
                   <pic:nvPicPr>
-                    <pic:cNvPr descr="fig2_training_curves.png" id="68" name="Picture"/>
+                    <pic:cNvPr descr="fig2_training_curves.png" id="41" name="Picture"/>
                     <pic:cNvPicPr>
                       <a:picLocks noChangeArrowheads="1" noChangeAspect="1"/>
                     </pic:cNvPicPr>
                   </pic:nvPicPr>
                   <pic:blipFill>
-                    <a:blip r:embed="rId66"/>
+                    <a:blip r:embed="rId39"/>
                     <a:stretch>
                       <a:fillRect/>
                     </a:stretch>
@@ -8859,7 +8397,7 @@
         <w:t xml:space="preserve">Lattice (a) and coordinate (b) training-loss curves for the distance-aux run (v16) vs the Wyckoff-embedding run (v15). Adding the Wyckoff embedding inflates the lattice loss by an order of magnitude (~0.6 vs ~0.02) while leaving the coordinate loss largely unchanged; the failure is localised to the lattice channel.</w:t>
       </w:r>
     </w:p>
-    <w:bookmarkEnd w:id="69"/>
+    <w:bookmarkEnd w:id="42"/>
     <w:p>
       <w:pPr>
         <w:pStyle w:val="BodyText"/>
@@ -8932,8 +8470,8 @@
         <w:t xml:space="preserve">Wyckoff + distance loss together collapses to 0.8 %, below the bare ε baseline; the two interact destructively, no clean theoretical explanation.</w:t>
       </w:r>
     </w:p>
-    <w:bookmarkEnd w:id="70"/>
-    <w:bookmarkStart w:id="71" w:name="encoder-bottleneck-perturbation-study"/>
+    <w:bookmarkEnd w:id="43"/>
+    <w:bookmarkStart w:id="44" w:name="encoder-bottleneck-perturbation-study"/>
     <w:p>
       <w:pPr>
         <w:pStyle w:val="Heading2"/>
@@ -9036,8 +8574,8 @@
         <w:t xml:space="preserve">: it works where it can.</w:t>
       </w:r>
     </w:p>
-    <w:bookmarkEnd w:id="71"/>
-    <w:bookmarkStart w:id="72" w:name="Xe14ee5fe759b907ea0190421ae7272432ef5613"/>
+    <w:bookmarkEnd w:id="44"/>
+    <w:bookmarkStart w:id="45" w:name="Xe14ee5fe759b907ea0190421ae7272432ef5613"/>
     <w:p>
       <w:pPr>
         <w:pStyle w:val="Heading2"/>
@@ -9337,9 +8875,9 @@
         </w:pict>
       </w:r>
     </w:p>
-    <w:bookmarkEnd w:id="72"/>
-    <w:bookmarkEnd w:id="73"/>
-    <w:bookmarkStart w:id="74" w:name="discussion"/>
+    <w:bookmarkEnd w:id="45"/>
+    <w:bookmarkEnd w:id="46"/>
+    <w:bookmarkStart w:id="47" w:name="discussion"/>
     <w:p>
       <w:pPr>
         <w:pStyle w:val="Heading1"/>
@@ -9576,8 +9114,8 @@
         </w:pict>
       </w:r>
     </w:p>
-    <w:bookmarkEnd w:id="74"/>
-    <w:bookmarkStart w:id="75" w:name="limitations"/>
+    <w:bookmarkEnd w:id="47"/>
+    <w:bookmarkStart w:id="48" w:name="limitations"/>
     <w:p>
       <w:pPr>
         <w:pStyle w:val="Heading1"/>
@@ -9850,8 +9388,8 @@
         </w:pict>
       </w:r>
     </w:p>
-    <w:bookmarkEnd w:id="75"/>
-    <w:bookmarkStart w:id="76" w:name="conclusion"/>
+    <w:bookmarkEnd w:id="48"/>
+    <w:bookmarkStart w:id="49" w:name="conclusion"/>
     <w:p>
       <w:pPr>
         <w:pStyle w:val="Heading1"/>
@@ -9890,8 +9428,8 @@
         </w:pict>
       </w:r>
     </w:p>
-    <w:bookmarkEnd w:id="76"/>
-    <w:bookmarkStart w:id="77" w:name="acknowledgments"/>
+    <w:bookmarkEnd w:id="49"/>
+    <w:bookmarkStart w:id="50" w:name="acknowledgments"/>
     <w:p>
       <w:pPr>
         <w:pStyle w:val="Heading1"/>
@@ -9950,8 +9488,8 @@
         <w:t xml:space="preserve">) for releasing checkpoints and code that made the head-to-head reproduction in §5.3 possible. Compute was rented from Vast.ai; total spend was approximately USD 25 across roughly 30 GPU-hours on RTX 5090 instances (Phase 4 ablation, Phase 9 retrain + indexer sweeps, DiffractGPT n = 1 000 inference, and PXRDnet n = 20 inference).</w:t>
       </w:r>
     </w:p>
-    <w:bookmarkEnd w:id="77"/>
-    <w:bookmarkStart w:id="78" w:name="author-contributions-credit"/>
+    <w:bookmarkEnd w:id="50"/>
+    <w:bookmarkStart w:id="51" w:name="author-contributions-credit"/>
     <w:p>
       <w:pPr>
         <w:pStyle w:val="Heading1"/>
@@ -9968,8 +9506,8 @@
         <w:t xml:space="preserve">F. Cai: Conceptualization, Methodology, Software, Validation, Formal analysis, Investigation, Data curation, Writing – Original Draft, Writing – Review &amp; Editing, Visualization, Project administration.</w:t>
       </w:r>
     </w:p>
-    <w:bookmarkEnd w:id="78"/>
-    <w:bookmarkStart w:id="79" w:name="conflict-of-interest"/>
+    <w:bookmarkEnd w:id="51"/>
+    <w:bookmarkStart w:id="52" w:name="conflict-of-interest"/>
     <w:p>
       <w:pPr>
         <w:pStyle w:val="Heading1"/>
@@ -9986,8 +9524,8 @@
         <w:t xml:space="preserve">The author declares no competing interests.</w:t>
       </w:r>
     </w:p>
-    <w:bookmarkEnd w:id="79"/>
-    <w:bookmarkStart w:id="80" w:name="funding"/>
+    <w:bookmarkEnd w:id="52"/>
+    <w:bookmarkStart w:id="53" w:name="funding"/>
     <w:p>
       <w:pPr>
         <w:pStyle w:val="Heading1"/>
@@ -10004,8 +9542,8 @@
         <w:t xml:space="preserve">This research received no external funding.</w:t>
       </w:r>
     </w:p>
-    <w:bookmarkEnd w:id="80"/>
-    <w:bookmarkStart w:id="81" w:name="data-and-code-availability"/>
+    <w:bookmarkEnd w:id="53"/>
+    <w:bookmarkStart w:id="55" w:name="data-and-code-availability"/>
     <w:p>
       <w:pPr>
         <w:pStyle w:val="Heading1"/>
@@ -10019,56 +9557,28 @@
         <w:pStyle w:val="FirstParagraph"/>
       </w:pPr>
       <w:r>
-        <w:t xml:space="preserve">Source code, trained checkpoints, and all per-phase training/evaluation logs are available at</w:t>
-      </w:r>
-      <w:r>
-        <w:t xml:space="preserve"> </w:t>
-      </w:r>
-      <w:r>
-        <w:rPr>
-          <w:rStyle w:val="VerbatimChar"/>
-        </w:rPr>
-        <w:t xml:space="preserve">https://github.com/fronkt/pxrd-diff</w:t>
-      </w:r>
-      <w:r>
-        <w:t xml:space="preserve"> </w:t>
-      </w:r>
-      <w:r>
-        <w:t xml:space="preserve">and archived at Zenodo (DOI: 10.5281/zenodo.20738994). The MP-20 dataset is publicly available via the CDVAE benchmark. All experiments reproduce from a single</w:t>
-      </w:r>
-      <w:r>
-        <w:t xml:space="preserve"> </w:t>
-      </w:r>
-      <w:r>
-        <w:rPr>
-          <w:rStyle w:val="VerbatimChar"/>
-        </w:rPr>
-        <w:t xml:space="preserve">requirements.txt</w:t>
-      </w:r>
-      <w:r>
-        <w:t xml:space="preserve"> </w:t>
-      </w:r>
-      <w:r>
-        <w:t xml:space="preserve">and the</w:t>
-      </w:r>
-      <w:r>
-        <w:t xml:space="preserve"> </w:t>
-      </w:r>
-      <w:r>
-        <w:rPr>
-          <w:rStyle w:val="VerbatimChar"/>
-        </w:rPr>
-        <w:t xml:space="preserve">scripts/</w:t>
-      </w:r>
-      <w:r>
-        <w:t xml:space="preserve"> </w:t>
-      </w:r>
-      <w:r>
-        <w:t xml:space="preserve">pipeline; per-structure evaluation flags are released to support paired re-analysis.</w:t>
-      </w:r>
-    </w:p>
-    <w:bookmarkEnd w:id="81"/>
-    <w:bookmarkStart w:id="82" w:name="ethics-declaration"/>
+        <w:t xml:space="preserve">Source code, trained checkpoints, and all per-phase training/evaluation logs are openly available in the GitHub repository at https://github.com/fronkt/pxrd-diff and archived at Zenodo:</w:t>
+      </w:r>
+      <w:r>
+        <w:t xml:space="preserve"> </w:t>
+      </w:r>
+      <w:hyperlink r:id="rId54">
+        <w:r>
+          <w:rPr>
+            <w:rStyle w:val="Hyperlink"/>
+          </w:rPr>
+          <w:t xml:space="preserve">https://doi.org/10.5281/zenodo.20738994</w:t>
+        </w:r>
+      </w:hyperlink>
+      <w:r>
+        <w:t xml:space="preserve"> </w:t>
+      </w:r>
+      <w:r>
+        <w:t xml:space="preserve">(DOI: 10.5281/zenodo.20738994). The MP-20 dataset is publicly available via the CDVAE benchmark. All experiments reproduce from a single requirements.txt and the scripts/ pipeline; per-structure evaluation flags are released to support paired re-analysis.</w:t>
+      </w:r>
+    </w:p>
+    <w:bookmarkEnd w:id="55"/>
+    <w:bookmarkStart w:id="56" w:name="ethics-declaration"/>
     <w:p>
       <w:pPr>
         <w:pStyle w:val="Heading1"/>
@@ -10092,14 +9602,491 @@
         </w:pict>
       </w:r>
     </w:p>
-    <w:bookmarkEnd w:id="82"/>
-    <w:bookmarkStart w:id="83" w:name="references"/>
+    <w:bookmarkEnd w:id="56"/>
+    <w:bookmarkStart w:id="57" w:name="references"/>
     <w:p>
       <w:pPr>
         <w:pStyle w:val="Heading1"/>
       </w:pPr>
       <w:r>
         <w:t xml:space="preserve">References</w:t>
+      </w:r>
+    </w:p>
+    <w:p>
+      <w:pPr>
+        <w:pStyle w:val="Compact"/>
+        <w:numPr>
+          <w:ilvl w:val="0"/>
+          <w:numId w:val="1003"/>
+        </w:numPr>
+      </w:pPr>
+      <w:r>
+        <w:t xml:space="preserve">Choudhary, K. (2025). DiffractGPT: Atomic Structure Determination from X-ray Diffraction Patterns using a Generative Pretrained Transformer.</w:t>
+      </w:r>
+      <w:r>
+        <w:t xml:space="preserve"> </w:t>
+      </w:r>
+      <w:r>
+        <w:rPr>
+          <w:i/>
+          <w:iCs/>
+        </w:rPr>
+        <w:t xml:space="preserve">The Journal of Physical Chemistry Letters</w:t>
+      </w:r>
+      <w:r>
+        <w:t xml:space="preserve">, 16(8), 2110–2119. DOI: 10.1021/acs.jpclett.4c03137. Reproduced from HF checkpoint</w:t>
+      </w:r>
+      <w:r>
+        <w:t xml:space="preserve"> </w:t>
+      </w:r>
+      <w:r>
+        <w:rPr>
+          <w:rStyle w:val="VerbatimChar"/>
+        </w:rPr>
+        <w:t xml:space="preserve">knc6/diffractgpt_mistral_chemical_formula</w:t>
+      </w:r>
+      <w:r>
+        <w:t xml:space="preserve"> </w:t>
+      </w:r>
+      <w:r>
+        <w:t xml:space="preserve">and code at</w:t>
+      </w:r>
+      <w:r>
+        <w:t xml:space="preserve"> </w:t>
+      </w:r>
+      <w:r>
+        <w:rPr>
+          <w:rStyle w:val="VerbatimChar"/>
+        </w:rPr>
+        <w:t xml:space="preserve">github.com/atomgptlab/atomgpt</w:t>
+      </w:r>
+      <w:r>
+        <w:t xml:space="preserve">.</w:t>
+      </w:r>
+    </w:p>
+    <w:p>
+      <w:pPr>
+        <w:pStyle w:val="Compact"/>
+        <w:numPr>
+          <w:ilvl w:val="0"/>
+          <w:numId w:val="1003"/>
+        </w:numPr>
+      </w:pPr>
+      <w:r>
+        <w:t xml:space="preserve">Guo, G., Saidi, T. L., Terban, M. W., Valsecchi, M., Billinge, S. J. L., &amp; Lipson, H. (2025). Ab initio structure solutions from nanocrystalline powder diffraction data via diffusion models.</w:t>
+      </w:r>
+      <w:r>
+        <w:t xml:space="preserve"> </w:t>
+      </w:r>
+      <w:r>
+        <w:rPr>
+          <w:i/>
+          <w:iCs/>
+        </w:rPr>
+        <w:t xml:space="preserve">Nature Materials</w:t>
+      </w:r>
+      <w:r>
+        <w:t xml:space="preserve">, 24, 1726–1734. DOI: 10.1038/s41563-025-02220-y (Author Correction: 10.1038/s41563-025-02301-y; preprint arXiv:2406.10796). Reproduced from HF checkpoint</w:t>
+      </w:r>
+      <w:r>
+        <w:t xml:space="preserve"> </w:t>
+      </w:r>
+      <w:r>
+        <w:rPr>
+          <w:rStyle w:val="VerbatimChar"/>
+        </w:rPr>
+        <w:t xml:space="preserve">therealgabeguo/cdvae_xrd_sinc100</w:t>
+      </w:r>
+      <w:r>
+        <w:t xml:space="preserve"> </w:t>
+      </w:r>
+      <w:r>
+        <w:t xml:space="preserve">and code at</w:t>
+      </w:r>
+      <w:r>
+        <w:t xml:space="preserve"> </w:t>
+      </w:r>
+      <w:r>
+        <w:rPr>
+          <w:rStyle w:val="VerbatimChar"/>
+        </w:rPr>
+        <w:t xml:space="preserve">github.com/gabeguo/cdvae_xrd</w:t>
+      </w:r>
+      <w:r>
+        <w:t xml:space="preserve">.</w:t>
+      </w:r>
+    </w:p>
+    <w:p>
+      <w:pPr>
+        <w:pStyle w:val="Compact"/>
+        <w:numPr>
+          <w:ilvl w:val="0"/>
+          <w:numId w:val="1003"/>
+        </w:numPr>
+      </w:pPr>
+      <w:r>
+        <w:t xml:space="preserve">Johansen, F. L., Friis-Jensen, U., Dam, E. B., Jensen, K. M. Ø., Mercado, R., &amp; Selvan, R. (2025). deCIFer: Crystal Structure Prediction from Powder Diffraction Data using Autoregressive Language Models.</w:t>
+      </w:r>
+      <w:r>
+        <w:t xml:space="preserve"> </w:t>
+      </w:r>
+      <w:r>
+        <w:rPr>
+          <w:i/>
+          <w:iCs/>
+        </w:rPr>
+        <w:t xml:space="preserve">Transactions on Machine Learning Research</w:t>
+      </w:r>
+      <w:r>
+        <w:t xml:space="preserve"> </w:t>
+      </w:r>
+      <w:r>
+        <w:t xml:space="preserve">(arXiv:2502.02189).</w:t>
+      </w:r>
+    </w:p>
+    <w:p>
+      <w:pPr>
+        <w:pStyle w:val="Compact"/>
+        <w:numPr>
+          <w:ilvl w:val="0"/>
+          <w:numId w:val="1003"/>
+        </w:numPr>
+      </w:pPr>
+      <w:r>
+        <w:t xml:space="preserve">Riesel, E. A., Mackey, T., Nilforoshan, H., Xu, M., Badding, C. K., Altman, A. B., Leskovec, J., &amp; Freedman, D. E. (2024). Crystal Structure Determination from Powder Diffraction Patterns with Generative Machine Learning.</w:t>
+      </w:r>
+      <w:r>
+        <w:t xml:space="preserve"> </w:t>
+      </w:r>
+      <w:r>
+        <w:rPr>
+          <w:i/>
+          <w:iCs/>
+        </w:rPr>
+        <w:t xml:space="preserve">Journal of the American Chemical Society</w:t>
+      </w:r>
+      <w:r>
+        <w:t xml:space="preserve">, 146(44), 30340–30348. DOI: 10.1021/jacs.4c10244. Code:</w:t>
+      </w:r>
+      <w:r>
+        <w:t xml:space="preserve"> </w:t>
+      </w:r>
+      <w:r>
+        <w:rPr>
+          <w:rStyle w:val="VerbatimChar"/>
+        </w:rPr>
+        <w:t xml:space="preserve">github.com/ML-PXRD/Crystalyze</w:t>
+      </w:r>
+      <w:r>
+        <w:t xml:space="preserve">. We could not reproduce: the checkpoint download link is marked</w:t>
+      </w:r>
+      <w:r>
+        <w:t xml:space="preserve"> </w:t>
+      </w:r>
+      <w:r>
+        <w:t xml:space="preserve">“not yet active”</w:t>
+      </w:r>
+      <w:r>
+        <w:t xml:space="preserve"> </w:t>
+      </w:r>
+      <w:r>
+        <w:t xml:space="preserve">in the upstream README (verified 2026-06-01).</w:t>
+      </w:r>
+    </w:p>
+    <w:p>
+      <w:pPr>
+        <w:pStyle w:val="Compact"/>
+        <w:numPr>
+          <w:ilvl w:val="0"/>
+          <w:numId w:val="1003"/>
+        </w:numPr>
+      </w:pPr>
+      <w:r>
+        <w:t xml:space="preserve">Segal, N., Subramanian, A., Li, M., Miller, B. K., &amp; Gómez-Bombarelli, R. (2025). The Loss Landscape of Powder X-Ray Diffraction-Based Structure Optimization Is Too Rough for Gradient Descent.</w:t>
+      </w:r>
+      <w:r>
+        <w:t xml:space="preserve"> </w:t>
+      </w:r>
+      <w:r>
+        <w:rPr>
+          <w:i/>
+          <w:iCs/>
+        </w:rPr>
+        <w:t xml:space="preserve">arXiv:2512.04036</w:t>
+      </w:r>
+      <w:r>
+        <w:t xml:space="preserve">.</w:t>
+      </w:r>
+    </w:p>
+    <w:p>
+      <w:pPr>
+        <w:pStyle w:val="Compact"/>
+        <w:numPr>
+          <w:ilvl w:val="0"/>
+          <w:numId w:val="1003"/>
+        </w:numPr>
+      </w:pPr>
+      <w:r>
+        <w:t xml:space="preserve">Xie, T., Fu, X., Ganea, O.-E., Barzilay, R., &amp; Jaakkola, T. (2022). Crystal diffusion variational autoencoder for periodic material generation.</w:t>
+      </w:r>
+      <w:r>
+        <w:t xml:space="preserve"> </w:t>
+      </w:r>
+      <w:r>
+        <w:rPr>
+          <w:i/>
+          <w:iCs/>
+        </w:rPr>
+        <w:t xml:space="preserve">International Conference on Learning Representations</w:t>
+      </w:r>
+      <w:r>
+        <w:t xml:space="preserve">.</w:t>
+      </w:r>
+    </w:p>
+    <w:p>
+      <w:pPr>
+        <w:pStyle w:val="Compact"/>
+        <w:numPr>
+          <w:ilvl w:val="0"/>
+          <w:numId w:val="1003"/>
+        </w:numPr>
+      </w:pPr>
+      <w:r>
+        <w:t xml:space="preserve">Jiao, R., et al. (2023). Crystal structure prediction by joint equivariant diffusion.</w:t>
+      </w:r>
+      <w:r>
+        <w:t xml:space="preserve"> </w:t>
+      </w:r>
+      <w:r>
+        <w:rPr>
+          <w:i/>
+          <w:iCs/>
+        </w:rPr>
+        <w:t xml:space="preserve">Advances in Neural Information Processing Systems</w:t>
+      </w:r>
+      <w:r>
+        <w:t xml:space="preserve"> </w:t>
+      </w:r>
+      <w:r>
+        <w:t xml:space="preserve">36.</w:t>
+      </w:r>
+    </w:p>
+    <w:p>
+      <w:pPr>
+        <w:pStyle w:val="Compact"/>
+        <w:numPr>
+          <w:ilvl w:val="0"/>
+          <w:numId w:val="1003"/>
+        </w:numPr>
+      </w:pPr>
+      <w:r>
+        <w:t xml:space="preserve">Zeni, C., et al. (2024). MatterGen: A generative model for inorganic materials design.</w:t>
+      </w:r>
+      <w:r>
+        <w:t xml:space="preserve"> </w:t>
+      </w:r>
+      <w:r>
+        <w:rPr>
+          <w:i/>
+          <w:iCs/>
+        </w:rPr>
+        <w:t xml:space="preserve">arXiv:2312.03687</w:t>
+      </w:r>
+      <w:r>
+        <w:t xml:space="preserve">.</w:t>
+      </w:r>
+    </w:p>
+    <w:p>
+      <w:pPr>
+        <w:pStyle w:val="Compact"/>
+        <w:numPr>
+          <w:ilvl w:val="0"/>
+          <w:numId w:val="1003"/>
+        </w:numPr>
+      </w:pPr>
+      <w:r>
+        <w:t xml:space="preserve">Boultif, A., &amp; Louër, D. (2004). Powder pattern indexing with the dichotomy method.</w:t>
+      </w:r>
+      <w:r>
+        <w:t xml:space="preserve"> </w:t>
+      </w:r>
+      <w:r>
+        <w:rPr>
+          <w:i/>
+          <w:iCs/>
+        </w:rPr>
+        <w:t xml:space="preserve">Journal of Applied Crystallography</w:t>
+      </w:r>
+      <w:r>
+        <w:t xml:space="preserve">, 37(5), 724–731. DOI: 10.1107/S0021889804014876.</w:t>
+      </w:r>
+    </w:p>
+    <w:p>
+      <w:pPr>
+        <w:pStyle w:val="Compact"/>
+        <w:numPr>
+          <w:ilvl w:val="0"/>
+          <w:numId w:val="1003"/>
+        </w:numPr>
+      </w:pPr>
+      <w:r>
+        <w:t xml:space="preserve">Guo, J., &amp; Schwalbe-Koda, D. (2026). Generative Inversion of Spectroscopic Data for Amorphous Structure Elucidation.</w:t>
+      </w:r>
+      <w:r>
+        <w:t xml:space="preserve"> </w:t>
+      </w:r>
+      <w:r>
+        <w:rPr>
+          <w:i/>
+          <w:iCs/>
+        </w:rPr>
+        <w:t xml:space="preserve">arXiv:2603.23210</w:t>
+      </w:r>
+      <w:r>
+        <w:t xml:space="preserve">.</w:t>
+      </w:r>
+    </w:p>
+    <w:p>
+      <w:pPr>
+        <w:pStyle w:val="Compact"/>
+        <w:numPr>
+          <w:ilvl w:val="0"/>
+          <w:numId w:val="1003"/>
+        </w:numPr>
+      </w:pPr>
+      <w:r>
+        <w:t xml:space="preserve">Schütt, K. T., et al. (2017). SchNet: A continuous-filter convolutional neural network for modeling quantum interactions.</w:t>
+      </w:r>
+      <w:r>
+        <w:t xml:space="preserve"> </w:t>
+      </w:r>
+      <w:r>
+        <w:rPr>
+          <w:i/>
+          <w:iCs/>
+        </w:rPr>
+        <w:t xml:space="preserve">Advances in Neural Information Processing Systems</w:t>
+      </w:r>
+      <w:r>
+        <w:t xml:space="preserve"> </w:t>
+      </w:r>
+      <w:r>
+        <w:t xml:space="preserve">30.</w:t>
+      </w:r>
+    </w:p>
+    <w:p>
+      <w:pPr>
+        <w:pStyle w:val="Compact"/>
+        <w:numPr>
+          <w:ilvl w:val="0"/>
+          <w:numId w:val="1003"/>
+        </w:numPr>
+      </w:pPr>
+      <w:r>
+        <w:t xml:space="preserve">Batatia, I., Kovács, D. P., Simm, G. N. C., Ortner, C., &amp; Csányi, G. (2022). MACE: Higher order equivariant message passing neural networks for fast and accurate force fields.</w:t>
+      </w:r>
+      <w:r>
+        <w:t xml:space="preserve"> </w:t>
+      </w:r>
+      <w:r>
+        <w:rPr>
+          <w:i/>
+          <w:iCs/>
+        </w:rPr>
+        <w:t xml:space="preserve">Advances in Neural Information Processing Systems</w:t>
+      </w:r>
+      <w:r>
+        <w:t xml:space="preserve"> </w:t>
+      </w:r>
+      <w:r>
+        <w:t xml:space="preserve">35.</w:t>
+      </w:r>
+    </w:p>
+    <w:p>
+      <w:pPr>
+        <w:pStyle w:val="Compact"/>
+        <w:numPr>
+          <w:ilvl w:val="0"/>
+          <w:numId w:val="1003"/>
+        </w:numPr>
+      </w:pPr>
+      <w:r>
+        <w:t xml:space="preserve">Nichol, A., &amp; Dhariwal, P. (2021). Improved denoising diffusion probabilistic models.</w:t>
+      </w:r>
+      <w:r>
+        <w:t xml:space="preserve"> </w:t>
+      </w:r>
+      <w:r>
+        <w:rPr>
+          <w:i/>
+          <w:iCs/>
+        </w:rPr>
+        <w:t xml:space="preserve">International Conference on Machine Learning</w:t>
+      </w:r>
+      <w:r>
+        <w:t xml:space="preserve">.</w:t>
+      </w:r>
+    </w:p>
+    <w:p>
+      <w:pPr>
+        <w:pStyle w:val="Compact"/>
+        <w:numPr>
+          <w:ilvl w:val="0"/>
+          <w:numId w:val="1003"/>
+        </w:numPr>
+      </w:pPr>
+      <w:r>
+        <w:t xml:space="preserve">Toby, B. H., &amp; Von Dreele, R. B. (2013). GSAS-II: the genesis of a modern open-source all purpose crystallography software package.</w:t>
+      </w:r>
+      <w:r>
+        <w:t xml:space="preserve"> </w:t>
+      </w:r>
+      <w:r>
+        <w:rPr>
+          <w:i/>
+          <w:iCs/>
+        </w:rPr>
+        <w:t xml:space="preserve">Journal of Applied Crystallography</w:t>
+      </w:r>
+      <w:r>
+        <w:t xml:space="preserve">, 46(2), 544–549. Code:</w:t>
+      </w:r>
+      <w:r>
+        <w:t xml:space="preserve"> </w:t>
+      </w:r>
+      <w:r>
+        <w:rPr>
+          <w:rStyle w:val="VerbatimChar"/>
+        </w:rPr>
+        <w:t xml:space="preserve">github.com/AdvancedPhotonSource/GSAS-II</w:t>
+      </w:r>
+      <w:r>
+        <w:t xml:space="preserve">.</w:t>
+      </w:r>
+    </w:p>
+    <w:p>
+      <w:pPr>
+        <w:pStyle w:val="Compact"/>
+        <w:numPr>
+          <w:ilvl w:val="0"/>
+          <w:numId w:val="1003"/>
+        </w:numPr>
+      </w:pPr>
+      <w:r>
+        <w:t xml:space="preserve">Song, J., Meng, C., &amp; Ermon, S. (2021). Denoising diffusion implicit models.</w:t>
+      </w:r>
+      <w:r>
+        <w:t xml:space="preserve"> </w:t>
+      </w:r>
+      <w:r>
+        <w:rPr>
+          <w:i/>
+          <w:iCs/>
+        </w:rPr>
+        <w:t xml:space="preserve">International Conference on Learning Representations</w:t>
+      </w:r>
+      <w:r>
+        <w:t xml:space="preserve">.</w:t>
       </w:r>
     </w:p>
     <w:p>
@@ -10142,8 +10129,8 @@
         </w:pict>
       </w:r>
     </w:p>
-    <w:bookmarkEnd w:id="83"/>
-    <w:bookmarkStart w:id="88" w:name="appendix"/>
+    <w:bookmarkEnd w:id="57"/>
+    <w:bookmarkStart w:id="62" w:name="appendix"/>
     <w:p>
       <w:pPr>
         <w:pStyle w:val="Heading1"/>
@@ -10152,7 +10139,7 @@
         <w:t xml:space="preserve">Appendix</w:t>
       </w:r>
     </w:p>
-    <w:bookmarkStart w:id="84" w:name="a.-full-ablation-history"/>
+    <w:bookmarkStart w:id="58" w:name="a.-full-ablation-history"/>
     <w:p>
       <w:pPr>
         <w:pStyle w:val="Heading2"/>
@@ -11013,8 +11000,8 @@
         </w:tc>
       </w:tr>
     </w:tbl>
-    <w:bookmarkEnd w:id="84"/>
-    <w:bookmarkStart w:id="85" w:name="b.-hyperparameter-sensitivity"/>
+    <w:bookmarkEnd w:id="58"/>
+    <w:bookmarkStart w:id="59" w:name="b.-hyperparameter-sensitivity"/>
     <w:p>
       <w:pPr>
         <w:pStyle w:val="Heading2"/>
@@ -11061,8 +11048,8 @@
         <w:t xml:space="preserve">showed (256, 3) as a reasonable Pareto point. The Debye loss weight was swept {0, 0.1, 1, 10} in early ε-prediction runs (v6–v9) without measurable effect on match rate; we re-fixed it at 1.0 for the x₀-residual runs by analogy.</w:t>
       </w:r>
     </w:p>
-    <w:bookmarkEnd w:id="85"/>
-    <w:bookmarkStart w:id="86" w:name="X984f5037fa8fa240d4e7791708ee54c226ae797"/>
+    <w:bookmarkEnd w:id="59"/>
+    <w:bookmarkStart w:id="60" w:name="X984f5037fa8fa240d4e7791708ee54c226ae797"/>
     <w:p>
       <w:pPr>
         <w:pStyle w:val="Heading2"/>
@@ -11092,153 +11079,6 @@
       </w:r>
       <w:r>
         <w:t xml:space="preserve">over a random 50-structure MP-20 test subset:</w:t>
-      </w:r>
-    </w:p>
-    <w:p>
-      <w:pPr>
-        <w:pStyle w:val="Compact"/>
-        <w:numPr>
-          <w:ilvl w:val="0"/>
-          <w:numId w:val="1003"/>
-        </w:numPr>
-      </w:pPr>
-      <w:r>
-        <w:t xml:space="preserve">Mean: 0.962</w:t>
-      </w:r>
-    </w:p>
-    <w:p>
-      <w:pPr>
-        <w:pStyle w:val="Compact"/>
-        <w:numPr>
-          <w:ilvl w:val="0"/>
-          <w:numId w:val="1003"/>
-        </w:numPr>
-      </w:pPr>
-      <w:r>
-        <w:t xml:space="preserve">Std: 0.027</w:t>
-      </w:r>
-    </w:p>
-    <w:p>
-      <w:pPr>
-        <w:pStyle w:val="Compact"/>
-        <w:numPr>
-          <w:ilvl w:val="0"/>
-          <w:numId w:val="1003"/>
-        </w:numPr>
-      </w:pPr>
-      <w:r>
-        <w:t xml:space="preserve">Min: 0.896 (mp-1213821, layered structure with strong texture in the reference)</w:t>
-      </w:r>
-    </w:p>
-    <w:p>
-      <w:pPr>
-        <w:pStyle w:val="Compact"/>
-        <w:numPr>
-          <w:ilvl w:val="0"/>
-          <w:numId w:val="1003"/>
-        </w:numPr>
-      </w:pPr>
-      <w:r>
-        <w:t xml:space="preserve">Max: 0.998 (mp-149, Si)</w:t>
-      </w:r>
-    </w:p>
-    <w:p>
-      <w:pPr>
-        <w:pStyle w:val="Compact"/>
-        <w:numPr>
-          <w:ilvl w:val="0"/>
-          <w:numId w:val="1003"/>
-        </w:numPr>
-      </w:pPr>
-      <w:r>
-        <w:t xml:space="preserve">Fraction &gt; 0.95: 33/50</w:t>
-      </w:r>
-    </w:p>
-    <w:p>
-      <w:pPr>
-        <w:pStyle w:val="Compact"/>
-        <w:numPr>
-          <w:ilvl w:val="0"/>
-          <w:numId w:val="1003"/>
-        </w:numPr>
-      </w:pPr>
-      <w:r>
-        <w:t xml:space="preserve">Fraction &gt; 0.9: 49/50</w:t>
-      </w:r>
-    </w:p>
-    <w:p>
-      <w:pPr>
-        <w:pStyle w:val="Compact"/>
-        <w:numPr>
-          <w:ilvl w:val="0"/>
-          <w:numId w:val="1003"/>
-        </w:numPr>
-      </w:pPr>
-      <w:r>
-        <w:t xml:space="preserve">Fraction &gt; 0.7: 50/50</w:t>
-      </w:r>
-    </w:p>
-    <w:p>
-      <w:pPr>
-        <w:pStyle w:val="FirstParagraph"/>
-      </w:pPr>
-      <w:r>
-        <w:t xml:space="preserve">Gradient sanity: for all 50 structures we confirmed</w:t>
-      </w:r>
-      <w:r>
-        <w:t xml:space="preserve"> </w:t>
-      </w:r>
-      <w:r>
-        <w:rPr>
-          <w:rStyle w:val="VerbatimChar"/>
-        </w:rPr>
-        <w:t xml:space="preserve">∂L/∂F</w:t>
-      </w:r>
-      <w:r>
-        <w:t xml:space="preserve"> </w:t>
-      </w:r>
-      <w:r>
-        <w:t xml:space="preserve">and</w:t>
-      </w:r>
-      <w:r>
-        <w:t xml:space="preserve"> </w:t>
-      </w:r>
-      <w:r>
-        <w:rPr>
-          <w:rStyle w:val="VerbatimChar"/>
-        </w:rPr>
-        <w:t xml:space="preserve">∂L/∂L</w:t>
-      </w:r>
-      <w:r>
-        <w:t xml:space="preserve"> </w:t>
-      </w:r>
-      <w:r>
-        <w:t xml:space="preserve">are non-zero and finite via</w:t>
-      </w:r>
-      <w:r>
-        <w:t xml:space="preserve"> </w:t>
-      </w:r>
-      <w:r>
-        <w:rPr>
-          <w:rStyle w:val="VerbatimChar"/>
-        </w:rPr>
-        <w:t xml:space="preserve">torch.autograd.gradcheck</w:t>
-      </w:r>
-      <w:r>
-        <w:t xml:space="preserve"> </w:t>
-      </w:r>
-      <w:r>
-        <w:t xml:space="preserve">on a 4-atom subset.</w:t>
-      </w:r>
-    </w:p>
-    <w:bookmarkEnd w:id="86"/>
-    <w:bookmarkStart w:id="87" w:name="d.-reproducibility-checklist"/>
-    <w:p>
-      <w:pPr>
-        <w:pStyle w:val="Heading2"/>
-      </w:pPr>
-      <w:r>
-        <w:t xml:space="preserve">D. Reproducibility checklist</w:t>
       </w:r>
     </w:p>
     <w:p>
@@ -11250,7 +11090,142 @@
         </w:numPr>
       </w:pPr>
       <w:r>
-        <w:t xml:space="preserve">Hyperparameters specified (§4.3)</w:t>
+        <w:t xml:space="preserve">Mean: 0.962</w:t>
+      </w:r>
+    </w:p>
+    <w:p>
+      <w:pPr>
+        <w:pStyle w:val="Compact"/>
+        <w:numPr>
+          <w:ilvl w:val="0"/>
+          <w:numId w:val="1004"/>
+        </w:numPr>
+      </w:pPr>
+      <w:r>
+        <w:t xml:space="preserve">Std: 0.027</w:t>
+      </w:r>
+    </w:p>
+    <w:p>
+      <w:pPr>
+        <w:pStyle w:val="Compact"/>
+        <w:numPr>
+          <w:ilvl w:val="0"/>
+          <w:numId w:val="1004"/>
+        </w:numPr>
+      </w:pPr>
+      <w:r>
+        <w:t xml:space="preserve">Min: 0.896 (mp-1213821, layered structure with strong texture in the reference)</w:t>
+      </w:r>
+    </w:p>
+    <w:p>
+      <w:pPr>
+        <w:pStyle w:val="Compact"/>
+        <w:numPr>
+          <w:ilvl w:val="0"/>
+          <w:numId w:val="1004"/>
+        </w:numPr>
+      </w:pPr>
+      <w:r>
+        <w:t xml:space="preserve">Max: 0.998 (mp-149, Si)</w:t>
+      </w:r>
+    </w:p>
+    <w:p>
+      <w:pPr>
+        <w:pStyle w:val="Compact"/>
+        <w:numPr>
+          <w:ilvl w:val="0"/>
+          <w:numId w:val="1004"/>
+        </w:numPr>
+      </w:pPr>
+      <w:r>
+        <w:t xml:space="preserve">Fraction &gt; 0.95: 33/50</w:t>
+      </w:r>
+    </w:p>
+    <w:p>
+      <w:pPr>
+        <w:pStyle w:val="Compact"/>
+        <w:numPr>
+          <w:ilvl w:val="0"/>
+          <w:numId w:val="1004"/>
+        </w:numPr>
+      </w:pPr>
+      <w:r>
+        <w:t xml:space="preserve">Fraction &gt; 0.9: 49/50</w:t>
+      </w:r>
+    </w:p>
+    <w:p>
+      <w:pPr>
+        <w:pStyle w:val="Compact"/>
+        <w:numPr>
+          <w:ilvl w:val="0"/>
+          <w:numId w:val="1004"/>
+        </w:numPr>
+      </w:pPr>
+      <w:r>
+        <w:t xml:space="preserve">Fraction &gt; 0.7: 50/50</w:t>
+      </w:r>
+    </w:p>
+    <w:p>
+      <w:pPr>
+        <w:pStyle w:val="FirstParagraph"/>
+      </w:pPr>
+      <w:r>
+        <w:t xml:space="preserve">Gradient sanity: for all 50 structures we confirmed</w:t>
+      </w:r>
+      <w:r>
+        <w:t xml:space="preserve"> </w:t>
+      </w:r>
+      <w:r>
+        <w:rPr>
+          <w:rStyle w:val="VerbatimChar"/>
+        </w:rPr>
+        <w:t xml:space="preserve">∂L/∂F</w:t>
+      </w:r>
+      <w:r>
+        <w:t xml:space="preserve"> </w:t>
+      </w:r>
+      <w:r>
+        <w:t xml:space="preserve">and</w:t>
+      </w:r>
+      <w:r>
+        <w:t xml:space="preserve"> </w:t>
+      </w:r>
+      <w:r>
+        <w:rPr>
+          <w:rStyle w:val="VerbatimChar"/>
+        </w:rPr>
+        <w:t xml:space="preserve">∂L/∂L</w:t>
+      </w:r>
+      <w:r>
+        <w:t xml:space="preserve"> </w:t>
+      </w:r>
+      <w:r>
+        <w:t xml:space="preserve">are non-zero and finite via</w:t>
+      </w:r>
+      <w:r>
+        <w:t xml:space="preserve"> </w:t>
+      </w:r>
+      <w:r>
+        <w:rPr>
+          <w:rStyle w:val="VerbatimChar"/>
+        </w:rPr>
+        <w:t xml:space="preserve">torch.autograd.gradcheck</w:t>
+      </w:r>
+      <w:r>
+        <w:t xml:space="preserve"> </w:t>
+      </w:r>
+      <w:r>
+        <w:t xml:space="preserve">on a 4-atom subset.</w:t>
+      </w:r>
+    </w:p>
+    <w:bookmarkEnd w:id="60"/>
+    <w:bookmarkStart w:id="61" w:name="d.-reproducibility-checklist"/>
+    <w:p>
+      <w:pPr>
+        <w:pStyle w:val="Heading2"/>
+      </w:pPr>
+      <w:r>
+        <w:t xml:space="preserve">D. Reproducibility checklist</w:t>
       </w:r>
     </w:p>
     <w:p>
@@ -11262,7 +11237,7 @@
         </w:numPr>
       </w:pPr>
       <w:r>
-        <w:t xml:space="preserve">Datasets and splits specified (§4.1; canonical CDVAE MP-20)</w:t>
+        <w:t xml:space="preserve">Hyperparameters specified (§4.3)</w:t>
       </w:r>
     </w:p>
     <w:p>
@@ -11274,7 +11249,7 @@
         </w:numPr>
       </w:pPr>
       <w:r>
-        <w:t xml:space="preserve">Evaluation protocol specified (§4.2)</w:t>
+        <w:t xml:space="preserve">Datasets and splits specified (§4.1; canonical CDVAE MP-20)</w:t>
       </w:r>
     </w:p>
     <w:p>
@@ -11286,7 +11261,7 @@
         </w:numPr>
       </w:pPr>
       <w:r>
-        <w:t xml:space="preserve">Random seed: single seed (42) per run; pilot variance ≈ 0.5 % match-rate absolute</w:t>
+        <w:t xml:space="preserve">Evaluation protocol specified (§4.2)</w:t>
       </w:r>
     </w:p>
     <w:p>
@@ -11298,7 +11273,7 @@
         </w:numPr>
       </w:pPr>
       <w:r>
-        <w:t xml:space="preserve">Compute environment: PyTorch 2.x, CUDA 12.x, single RTX 5090; Python 3.12</w:t>
+        <w:t xml:space="preserve">Random seed: single seed (42) per run; pilot variance ≈ 0.5 % match-rate absolute</w:t>
       </w:r>
     </w:p>
     <w:p>
@@ -11310,11 +11285,23 @@
         </w:numPr>
       </w:pPr>
       <w:r>
+        <w:t xml:space="preserve">Compute environment: PyTorch 2.x, CUDA 12.x, single RTX 5090; Python 3.12</w:t>
+      </w:r>
+    </w:p>
+    <w:p>
+      <w:pPr>
+        <w:pStyle w:val="Compact"/>
+        <w:numPr>
+          <w:ilvl w:val="0"/>
+          <w:numId w:val="1010"/>
+        </w:numPr>
+      </w:pPr>
+      <w:r>
         <w:t xml:space="preserve">Code, checkpoints, logs, and full training scripts released</w:t>
       </w:r>
     </w:p>
-    <w:bookmarkEnd w:id="87"/>
-    <w:bookmarkEnd w:id="88"/>
+    <w:bookmarkEnd w:id="61"/>
+    <w:bookmarkEnd w:id="62"/>
     <w:sectPr>
       <w:footnotePr>
         <w:numRestart w:val="eachSect"/>
@@ -11341,1164 +11328,6 @@
     <w:p>
       <w:r>
         <w:separator/>
-      </w:r>
-    </w:p>
-  </w:footnote>
-  <w:footnote w:id="9">
-    <w:p>
-      <w:pPr>
-        <w:pStyle w:val="FootnoteText"/>
-      </w:pPr>
-      <w:r>
-        <w:rPr>
-          <w:rStyle w:val="FootnoteReference"/>
-        </w:rPr>
-        <w:footnoteRef/>
-      </w:r>
-      <w:r>
-        <w:t xml:space="preserve"> </w:t>
-      </w:r>
-      <w:r>
-        <w:t xml:space="preserve">Choudhary, K. (2025). DiffractGPT: Atomic Structure Determination from X-ray Diffraction Patterns using a Generative Pretrained Transformer.</w:t>
-      </w:r>
-      <w:r>
-        <w:t xml:space="preserve"> </w:t>
-      </w:r>
-      <w:r>
-        <w:rPr>
-          <w:i/>
-          <w:iCs/>
-        </w:rPr>
-        <w:t xml:space="preserve">The Journal of Physical Chemistry Letters</w:t>
-      </w:r>
-      <w:r>
-        <w:t xml:space="preserve">, 16(8), 2110–2119. DOI: 10.1021/acs.jpclett.4c03137. Reproduced from HF checkpoint</w:t>
-      </w:r>
-      <w:r>
-        <w:t xml:space="preserve"> </w:t>
-      </w:r>
-      <w:r>
-        <w:rPr>
-          <w:rStyle w:val="VerbatimChar"/>
-        </w:rPr>
-        <w:t xml:space="preserve">knc6/diffractgpt_mistral_chemical_formula</w:t>
-      </w:r>
-      <w:r>
-        <w:t xml:space="preserve"> </w:t>
-      </w:r>
-      <w:r>
-        <w:t xml:space="preserve">and code at</w:t>
-      </w:r>
-      <w:r>
-        <w:t xml:space="preserve"> </w:t>
-      </w:r>
-      <w:r>
-        <w:rPr>
-          <w:rStyle w:val="VerbatimChar"/>
-        </w:rPr>
-        <w:t xml:space="preserve">github.com/atomgptlab/atomgpt</w:t>
-      </w:r>
-      <w:r>
-        <w:t xml:space="preserve">.</w:t>
-      </w:r>
-    </w:p>
-  </w:footnote>
-  <w:footnote w:id="10">
-    <w:p>
-      <w:pPr>
-        <w:pStyle w:val="FootnoteText"/>
-      </w:pPr>
-      <w:r>
-        <w:rPr>
-          <w:rStyle w:val="FootnoteReference"/>
-        </w:rPr>
-        <w:footnoteRef/>
-      </w:r>
-      <w:r>
-        <w:t xml:space="preserve"> </w:t>
-      </w:r>
-      <w:r>
-        <w:t xml:space="preserve">Guo, G., Saidi, T. L., Terban, M. W., Valsecchi, M., Billinge, S. J. L., &amp; Lipson, H. (2025). Ab initio structure solutions from nanocrystalline powder diffraction data via diffusion models.</w:t>
-      </w:r>
-      <w:r>
-        <w:t xml:space="preserve"> </w:t>
-      </w:r>
-      <w:r>
-        <w:rPr>
-          <w:i/>
-          <w:iCs/>
-        </w:rPr>
-        <w:t xml:space="preserve">Nature Materials</w:t>
-      </w:r>
-      <w:r>
-        <w:t xml:space="preserve">, 24, 1726–1734. DOI: 10.1038/s41563-025-02220-y (Author Correction: 10.1038/s41563-025-02301-y; preprint arXiv:2406.10796). Reproduced from HF checkpoint</w:t>
-      </w:r>
-      <w:r>
-        <w:t xml:space="preserve"> </w:t>
-      </w:r>
-      <w:r>
-        <w:rPr>
-          <w:rStyle w:val="VerbatimChar"/>
-        </w:rPr>
-        <w:t xml:space="preserve">therealgabeguo/cdvae_xrd_sinc100</w:t>
-      </w:r>
-      <w:r>
-        <w:t xml:space="preserve"> </w:t>
-      </w:r>
-      <w:r>
-        <w:t xml:space="preserve">and code at</w:t>
-      </w:r>
-      <w:r>
-        <w:t xml:space="preserve"> </w:t>
-      </w:r>
-      <w:r>
-        <w:rPr>
-          <w:rStyle w:val="VerbatimChar"/>
-        </w:rPr>
-        <w:t xml:space="preserve">github.com/gabeguo/cdvae_xrd</w:t>
-      </w:r>
-      <w:r>
-        <w:t xml:space="preserve">.</w:t>
-      </w:r>
-    </w:p>
-  </w:footnote>
-  <w:footnote w:id="11">
-    <w:p>
-      <w:pPr>
-        <w:pStyle w:val="FootnoteText"/>
-      </w:pPr>
-      <w:r>
-        <w:rPr>
-          <w:rStyle w:val="FootnoteReference"/>
-        </w:rPr>
-        <w:footnoteRef/>
-      </w:r>
-      <w:r>
-        <w:t xml:space="preserve"> </w:t>
-      </w:r>
-      <w:r>
-        <w:t xml:space="preserve">Johansen, F. L., Friis-Jensen, U., Dam, E. B., Jensen, K. M. Ø., Mercado, R., &amp; Selvan, R. (2025). deCIFer: Crystal Structure Prediction from Powder Diffraction Data using Autoregressive Language Models.</w:t>
-      </w:r>
-      <w:r>
-        <w:t xml:space="preserve"> </w:t>
-      </w:r>
-      <w:r>
-        <w:rPr>
-          <w:i/>
-          <w:iCs/>
-        </w:rPr>
-        <w:t xml:space="preserve">Transactions on Machine Learning Research</w:t>
-      </w:r>
-      <w:r>
-        <w:t xml:space="preserve"> </w:t>
-      </w:r>
-      <w:r>
-        <w:t xml:space="preserve">(arXiv:2502.02189).</w:t>
-      </w:r>
-    </w:p>
-  </w:footnote>
-  <w:footnote w:id="13">
-    <w:p>
-      <w:pPr>
-        <w:pStyle w:val="FootnoteText"/>
-      </w:pPr>
-      <w:r>
-        <w:rPr>
-          <w:rStyle w:val="FootnoteReference"/>
-        </w:rPr>
-        <w:footnoteRef/>
-      </w:r>
-      <w:r>
-        <w:t xml:space="preserve"> </w:t>
-      </w:r>
-      <w:r>
-        <w:t xml:space="preserve">Choudhary, K. (2025). DiffractGPT: Atomic Structure Determination from X-ray Diffraction Patterns using a Generative Pretrained Transformer.</w:t>
-      </w:r>
-      <w:r>
-        <w:t xml:space="preserve"> </w:t>
-      </w:r>
-      <w:r>
-        <w:rPr>
-          <w:i/>
-          <w:iCs/>
-        </w:rPr>
-        <w:t xml:space="preserve">The Journal of Physical Chemistry Letters</w:t>
-      </w:r>
-      <w:r>
-        <w:t xml:space="preserve">, 16(8), 2110–2119. DOI: 10.1021/acs.jpclett.4c03137. Reproduced from HF checkpoint</w:t>
-      </w:r>
-      <w:r>
-        <w:t xml:space="preserve"> </w:t>
-      </w:r>
-      <w:r>
-        <w:rPr>
-          <w:rStyle w:val="VerbatimChar"/>
-        </w:rPr>
-        <w:t xml:space="preserve">knc6/diffractgpt_mistral_chemical_formula</w:t>
-      </w:r>
-      <w:r>
-        <w:t xml:space="preserve"> </w:t>
-      </w:r>
-      <w:r>
-        <w:t xml:space="preserve">and code at</w:t>
-      </w:r>
-      <w:r>
-        <w:t xml:space="preserve"> </w:t>
-      </w:r>
-      <w:r>
-        <w:rPr>
-          <w:rStyle w:val="VerbatimChar"/>
-        </w:rPr>
-        <w:t xml:space="preserve">github.com/atomgptlab/atomgpt</w:t>
-      </w:r>
-      <w:r>
-        <w:t xml:space="preserve">.</w:t>
-      </w:r>
-    </w:p>
-  </w:footnote>
-  <w:footnote w:id="14">
-    <w:p>
-      <w:pPr>
-        <w:pStyle w:val="FootnoteText"/>
-      </w:pPr>
-      <w:r>
-        <w:rPr>
-          <w:rStyle w:val="FootnoteReference"/>
-        </w:rPr>
-        <w:footnoteRef/>
-      </w:r>
-      <w:r>
-        <w:t xml:space="preserve"> </w:t>
-      </w:r>
-      <w:r>
-        <w:t xml:space="preserve">Riesel, E. A., Mackey, T., Nilforoshan, H., Xu, M., Badding, C. K., Altman, A. B., Leskovec, J., &amp; Freedman, D. E. (2024). Crystal Structure Determination from Powder Diffraction Patterns with Generative Machine Learning.</w:t>
-      </w:r>
-      <w:r>
-        <w:t xml:space="preserve"> </w:t>
-      </w:r>
-      <w:r>
-        <w:rPr>
-          <w:i/>
-          <w:iCs/>
-        </w:rPr>
-        <w:t xml:space="preserve">Journal of the American Chemical Society</w:t>
-      </w:r>
-      <w:r>
-        <w:t xml:space="preserve">, 146(44), 30340–30348. DOI: 10.1021/jacs.4c10244. Code:</w:t>
-      </w:r>
-      <w:r>
-        <w:t xml:space="preserve"> </w:t>
-      </w:r>
-      <w:r>
-        <w:rPr>
-          <w:rStyle w:val="VerbatimChar"/>
-        </w:rPr>
-        <w:t xml:space="preserve">github.com/ML-PXRD/Crystalyze</w:t>
-      </w:r>
-      <w:r>
-        <w:t xml:space="preserve">. We could not reproduce: the checkpoint download link is marked</w:t>
-      </w:r>
-      <w:r>
-        <w:t xml:space="preserve"> </w:t>
-      </w:r>
-      <w:r>
-        <w:t xml:space="preserve">“not yet active”</w:t>
-      </w:r>
-      <w:r>
-        <w:t xml:space="preserve"> </w:t>
-      </w:r>
-      <w:r>
-        <w:t xml:space="preserve">in the upstream README (verified 2026-06-01).</w:t>
-      </w:r>
-    </w:p>
-  </w:footnote>
-  <w:footnote w:id="15">
-    <w:p>
-      <w:pPr>
-        <w:pStyle w:val="FootnoteText"/>
-      </w:pPr>
-      <w:r>
-        <w:rPr>
-          <w:rStyle w:val="FootnoteReference"/>
-        </w:rPr>
-        <w:footnoteRef/>
-      </w:r>
-      <w:r>
-        <w:t xml:space="preserve"> </w:t>
-      </w:r>
-      <w:r>
-        <w:t xml:space="preserve">Guo, G., Saidi, T. L., Terban, M. W., Valsecchi, M., Billinge, S. J. L., &amp; Lipson, H. (2025). Ab initio structure solutions from nanocrystalline powder diffraction data via diffusion models.</w:t>
-      </w:r>
-      <w:r>
-        <w:t xml:space="preserve"> </w:t>
-      </w:r>
-      <w:r>
-        <w:rPr>
-          <w:i/>
-          <w:iCs/>
-        </w:rPr>
-        <w:t xml:space="preserve">Nature Materials</w:t>
-      </w:r>
-      <w:r>
-        <w:t xml:space="preserve">, 24, 1726–1734. DOI: 10.1038/s41563-025-02220-y (Author Correction: 10.1038/s41563-025-02301-y; preprint arXiv:2406.10796). Reproduced from HF checkpoint</w:t>
-      </w:r>
-      <w:r>
-        <w:t xml:space="preserve"> </w:t>
-      </w:r>
-      <w:r>
-        <w:rPr>
-          <w:rStyle w:val="VerbatimChar"/>
-        </w:rPr>
-        <w:t xml:space="preserve">therealgabeguo/cdvae_xrd_sinc100</w:t>
-      </w:r>
-      <w:r>
-        <w:t xml:space="preserve"> </w:t>
-      </w:r>
-      <w:r>
-        <w:t xml:space="preserve">and code at</w:t>
-      </w:r>
-      <w:r>
-        <w:t xml:space="preserve"> </w:t>
-      </w:r>
-      <w:r>
-        <w:rPr>
-          <w:rStyle w:val="VerbatimChar"/>
-        </w:rPr>
-        <w:t xml:space="preserve">github.com/gabeguo/cdvae_xrd</w:t>
-      </w:r>
-      <w:r>
-        <w:t xml:space="preserve">.</w:t>
-      </w:r>
-    </w:p>
-  </w:footnote>
-  <w:footnote w:id="16">
-    <w:p>
-      <w:pPr>
-        <w:pStyle w:val="FootnoteText"/>
-      </w:pPr>
-      <w:r>
-        <w:rPr>
-          <w:rStyle w:val="FootnoteReference"/>
-        </w:rPr>
-        <w:footnoteRef/>
-      </w:r>
-      <w:r>
-        <w:t xml:space="preserve"> </w:t>
-      </w:r>
-      <w:r>
-        <w:t xml:space="preserve">Segal, N., Subramanian, A., Li, M., Miller, B. K., &amp; Gómez-Bombarelli, R. (2025). The Loss Landscape of Powder X-Ray Diffraction-Based Structure Optimization Is Too Rough for Gradient Descent.</w:t>
-      </w:r>
-      <w:r>
-        <w:t xml:space="preserve"> </w:t>
-      </w:r>
-      <w:r>
-        <w:rPr>
-          <w:i/>
-          <w:iCs/>
-        </w:rPr>
-        <w:t xml:space="preserve">arXiv:2512.04036</w:t>
-      </w:r>
-      <w:r>
-        <w:t xml:space="preserve">.</w:t>
-      </w:r>
-    </w:p>
-  </w:footnote>
-  <w:footnote w:id="18">
-    <w:p>
-      <w:pPr>
-        <w:pStyle w:val="FootnoteText"/>
-      </w:pPr>
-      <w:r>
-        <w:rPr>
-          <w:rStyle w:val="FootnoteReference"/>
-        </w:rPr>
-        <w:footnoteRef/>
-      </w:r>
-      <w:r>
-        <w:t xml:space="preserve"> </w:t>
-      </w:r>
-      <w:r>
-        <w:t xml:space="preserve">Xie, T., Fu, X., Ganea, O.-E., Barzilay, R., &amp; Jaakkola, T. (2022). Crystal diffusion variational autoencoder for periodic material generation.</w:t>
-      </w:r>
-      <w:r>
-        <w:t xml:space="preserve"> </w:t>
-      </w:r>
-      <w:r>
-        <w:rPr>
-          <w:i/>
-          <w:iCs/>
-        </w:rPr>
-        <w:t xml:space="preserve">International Conference on Learning Representations</w:t>
-      </w:r>
-      <w:r>
-        <w:t xml:space="preserve">.</w:t>
-      </w:r>
-    </w:p>
-  </w:footnote>
-  <w:footnote w:id="19">
-    <w:p>
-      <w:pPr>
-        <w:pStyle w:val="FootnoteText"/>
-      </w:pPr>
-      <w:r>
-        <w:rPr>
-          <w:rStyle w:val="FootnoteReference"/>
-        </w:rPr>
-        <w:footnoteRef/>
-      </w:r>
-      <w:r>
-        <w:t xml:space="preserve"> </w:t>
-      </w:r>
-      <w:r>
-        <w:t xml:space="preserve">Jiao, R., et al. (2023). Crystal structure prediction by joint equivariant diffusion.</w:t>
-      </w:r>
-      <w:r>
-        <w:t xml:space="preserve"> </w:t>
-      </w:r>
-      <w:r>
-        <w:rPr>
-          <w:i/>
-          <w:iCs/>
-        </w:rPr>
-        <w:t xml:space="preserve">Advances in Neural Information Processing Systems</w:t>
-      </w:r>
-      <w:r>
-        <w:t xml:space="preserve"> </w:t>
-      </w:r>
-      <w:r>
-        <w:t xml:space="preserve">36.</w:t>
-      </w:r>
-    </w:p>
-  </w:footnote>
-  <w:footnote w:id="20">
-    <w:p>
-      <w:pPr>
-        <w:pStyle w:val="FootnoteText"/>
-      </w:pPr>
-      <w:r>
-        <w:rPr>
-          <w:rStyle w:val="FootnoteReference"/>
-        </w:rPr>
-        <w:footnoteRef/>
-      </w:r>
-      <w:r>
-        <w:t xml:space="preserve"> </w:t>
-      </w:r>
-      <w:r>
-        <w:t xml:space="preserve">Zeni, C., et al. (2024). MatterGen: A generative model for inorganic materials design.</w:t>
-      </w:r>
-      <w:r>
-        <w:t xml:space="preserve"> </w:t>
-      </w:r>
-      <w:r>
-        <w:rPr>
-          <w:i/>
-          <w:iCs/>
-        </w:rPr>
-        <w:t xml:space="preserve">arXiv:2312.03687</w:t>
-      </w:r>
-      <w:r>
-        <w:t xml:space="preserve">.</w:t>
-      </w:r>
-    </w:p>
-  </w:footnote>
-  <w:footnote w:id="21">
-    <w:p>
-      <w:pPr>
-        <w:pStyle w:val="FootnoteText"/>
-      </w:pPr>
-      <w:r>
-        <w:rPr>
-          <w:rStyle w:val="FootnoteReference"/>
-        </w:rPr>
-        <w:footnoteRef/>
-      </w:r>
-      <w:r>
-        <w:t xml:space="preserve"> </w:t>
-      </w:r>
-      <w:r>
-        <w:t xml:space="preserve">Choudhary, K. (2025). DiffractGPT: Atomic Structure Determination from X-ray Diffraction Patterns using a Generative Pretrained Transformer.</w:t>
-      </w:r>
-      <w:r>
-        <w:t xml:space="preserve"> </w:t>
-      </w:r>
-      <w:r>
-        <w:rPr>
-          <w:i/>
-          <w:iCs/>
-        </w:rPr>
-        <w:t xml:space="preserve">The Journal of Physical Chemistry Letters</w:t>
-      </w:r>
-      <w:r>
-        <w:t xml:space="preserve">, 16(8), 2110–2119. DOI: 10.1021/acs.jpclett.4c03137. Reproduced from HF checkpoint</w:t>
-      </w:r>
-      <w:r>
-        <w:t xml:space="preserve"> </w:t>
-      </w:r>
-      <w:r>
-        <w:rPr>
-          <w:rStyle w:val="VerbatimChar"/>
-        </w:rPr>
-        <w:t xml:space="preserve">knc6/diffractgpt_mistral_chemical_formula</w:t>
-      </w:r>
-      <w:r>
-        <w:t xml:space="preserve"> </w:t>
-      </w:r>
-      <w:r>
-        <w:t xml:space="preserve">and code at</w:t>
-      </w:r>
-      <w:r>
-        <w:t xml:space="preserve"> </w:t>
-      </w:r>
-      <w:r>
-        <w:rPr>
-          <w:rStyle w:val="VerbatimChar"/>
-        </w:rPr>
-        <w:t xml:space="preserve">github.com/atomgptlab/atomgpt</w:t>
-      </w:r>
-      <w:r>
-        <w:t xml:space="preserve">.</w:t>
-      </w:r>
-    </w:p>
-  </w:footnote>
-  <w:footnote w:id="22">
-    <w:p>
-      <w:pPr>
-        <w:pStyle w:val="FootnoteText"/>
-      </w:pPr>
-      <w:r>
-        <w:rPr>
-          <w:rStyle w:val="FootnoteReference"/>
-        </w:rPr>
-        <w:footnoteRef/>
-      </w:r>
-      <w:r>
-        <w:t xml:space="preserve"> </w:t>
-      </w:r>
-      <w:r>
-        <w:t xml:space="preserve">Riesel, E. A., Mackey, T., Nilforoshan, H., Xu, M., Badding, C. K., Altman, A. B., Leskovec, J., &amp; Freedman, D. E. (2024). Crystal Structure Determination from Powder Diffraction Patterns with Generative Machine Learning.</w:t>
-      </w:r>
-      <w:r>
-        <w:t xml:space="preserve"> </w:t>
-      </w:r>
-      <w:r>
-        <w:rPr>
-          <w:i/>
-          <w:iCs/>
-        </w:rPr>
-        <w:t xml:space="preserve">Journal of the American Chemical Society</w:t>
-      </w:r>
-      <w:r>
-        <w:t xml:space="preserve">, 146(44), 30340–30348. DOI: 10.1021/jacs.4c10244. Code:</w:t>
-      </w:r>
-      <w:r>
-        <w:t xml:space="preserve"> </w:t>
-      </w:r>
-      <w:r>
-        <w:rPr>
-          <w:rStyle w:val="VerbatimChar"/>
-        </w:rPr>
-        <w:t xml:space="preserve">github.com/ML-PXRD/Crystalyze</w:t>
-      </w:r>
-      <w:r>
-        <w:t xml:space="preserve">. We could not reproduce: the checkpoint download link is marked</w:t>
-      </w:r>
-      <w:r>
-        <w:t xml:space="preserve"> </w:t>
-      </w:r>
-      <w:r>
-        <w:t xml:space="preserve">“not yet active”</w:t>
-      </w:r>
-      <w:r>
-        <w:t xml:space="preserve"> </w:t>
-      </w:r>
-      <w:r>
-        <w:t xml:space="preserve">in the upstream README (verified 2026-06-01).</w:t>
-      </w:r>
-    </w:p>
-  </w:footnote>
-  <w:footnote w:id="23">
-    <w:p>
-      <w:pPr>
-        <w:pStyle w:val="FootnoteText"/>
-      </w:pPr>
-      <w:r>
-        <w:rPr>
-          <w:rStyle w:val="FootnoteReference"/>
-        </w:rPr>
-        <w:footnoteRef/>
-      </w:r>
-      <w:r>
-        <w:t xml:space="preserve"> </w:t>
-      </w:r>
-      <w:r>
-        <w:t xml:space="preserve">Guo, G., Saidi, T. L., Terban, M. W., Valsecchi, M., Billinge, S. J. L., &amp; Lipson, H. (2025). Ab initio structure solutions from nanocrystalline powder diffraction data via diffusion models.</w:t>
-      </w:r>
-      <w:r>
-        <w:t xml:space="preserve"> </w:t>
-      </w:r>
-      <w:r>
-        <w:rPr>
-          <w:i/>
-          <w:iCs/>
-        </w:rPr>
-        <w:t xml:space="preserve">Nature Materials</w:t>
-      </w:r>
-      <w:r>
-        <w:t xml:space="preserve">, 24, 1726–1734. DOI: 10.1038/s41563-025-02220-y (Author Correction: 10.1038/s41563-025-02301-y; preprint arXiv:2406.10796). Reproduced from HF checkpoint</w:t>
-      </w:r>
-      <w:r>
-        <w:t xml:space="preserve"> </w:t>
-      </w:r>
-      <w:r>
-        <w:rPr>
-          <w:rStyle w:val="VerbatimChar"/>
-        </w:rPr>
-        <w:t xml:space="preserve">therealgabeguo/cdvae_xrd_sinc100</w:t>
-      </w:r>
-      <w:r>
-        <w:t xml:space="preserve"> </w:t>
-      </w:r>
-      <w:r>
-        <w:t xml:space="preserve">and code at</w:t>
-      </w:r>
-      <w:r>
-        <w:t xml:space="preserve"> </w:t>
-      </w:r>
-      <w:r>
-        <w:rPr>
-          <w:rStyle w:val="VerbatimChar"/>
-        </w:rPr>
-        <w:t xml:space="preserve">github.com/gabeguo/cdvae_xrd</w:t>
-      </w:r>
-      <w:r>
-        <w:t xml:space="preserve">.</w:t>
-      </w:r>
-    </w:p>
-  </w:footnote>
-  <w:footnote w:id="24">
-    <w:p>
-      <w:pPr>
-        <w:pStyle w:val="FootnoteText"/>
-      </w:pPr>
-      <w:r>
-        <w:rPr>
-          <w:rStyle w:val="FootnoteReference"/>
-        </w:rPr>
-        <w:footnoteRef/>
-      </w:r>
-      <w:r>
-        <w:t xml:space="preserve"> </w:t>
-      </w:r>
-      <w:r>
-        <w:t xml:space="preserve">Johansen, F. L., Friis-Jensen, U., Dam, E. B., Jensen, K. M. Ø., Mercado, R., &amp; Selvan, R. (2025). deCIFer: Crystal Structure Prediction from Powder Diffraction Data using Autoregressive Language Models.</w:t>
-      </w:r>
-      <w:r>
-        <w:t xml:space="preserve"> </w:t>
-      </w:r>
-      <w:r>
-        <w:rPr>
-          <w:i/>
-          <w:iCs/>
-        </w:rPr>
-        <w:t xml:space="preserve">Transactions on Machine Learning Research</w:t>
-      </w:r>
-      <w:r>
-        <w:t xml:space="preserve"> </w:t>
-      </w:r>
-      <w:r>
-        <w:t xml:space="preserve">(arXiv:2502.02189).</w:t>
-      </w:r>
-    </w:p>
-  </w:footnote>
-  <w:footnote w:id="25">
-    <w:p>
-      <w:pPr>
-        <w:pStyle w:val="FootnoteText"/>
-      </w:pPr>
-      <w:r>
-        <w:rPr>
-          <w:rStyle w:val="FootnoteReference"/>
-        </w:rPr>
-        <w:footnoteRef/>
-      </w:r>
-      <w:r>
-        <w:t xml:space="preserve"> </w:t>
-      </w:r>
-      <w:r>
-        <w:t xml:space="preserve">Boultif, A., &amp; Louër, D. (2004). Powder pattern indexing with the dichotomy method.</w:t>
-      </w:r>
-      <w:r>
-        <w:t xml:space="preserve"> </w:t>
-      </w:r>
-      <w:r>
-        <w:rPr>
-          <w:i/>
-          <w:iCs/>
-        </w:rPr>
-        <w:t xml:space="preserve">Journal of Applied Crystallography</w:t>
-      </w:r>
-      <w:r>
-        <w:t xml:space="preserve">, 37(5), 724–731. DOI: 10.1107/S0021889804014876.</w:t>
-      </w:r>
-    </w:p>
-  </w:footnote>
-  <w:footnote w:id="26">
-    <w:p>
-      <w:pPr>
-        <w:pStyle w:val="FootnoteText"/>
-      </w:pPr>
-      <w:r>
-        <w:rPr>
-          <w:rStyle w:val="FootnoteReference"/>
-        </w:rPr>
-        <w:footnoteRef/>
-      </w:r>
-      <w:r>
-        <w:t xml:space="preserve"> </w:t>
-      </w:r>
-      <w:r>
-        <w:t xml:space="preserve">Guo, J., &amp; Schwalbe-Koda, D. (2026). Generative Inversion of Spectroscopic Data for Amorphous Structure Elucidation.</w:t>
-      </w:r>
-      <w:r>
-        <w:t xml:space="preserve"> </w:t>
-      </w:r>
-      <w:r>
-        <w:rPr>
-          <w:i/>
-          <w:iCs/>
-        </w:rPr>
-        <w:t xml:space="preserve">arXiv:2603.23210</w:t>
-      </w:r>
-      <w:r>
-        <w:t xml:space="preserve">.</w:t>
-      </w:r>
-    </w:p>
-  </w:footnote>
-  <w:footnote w:id="27">
-    <w:p>
-      <w:pPr>
-        <w:pStyle w:val="FootnoteText"/>
-      </w:pPr>
-      <w:r>
-        <w:rPr>
-          <w:rStyle w:val="FootnoteReference"/>
-        </w:rPr>
-        <w:footnoteRef/>
-      </w:r>
-      <w:r>
-        <w:t xml:space="preserve"> </w:t>
-      </w:r>
-      <w:r>
-        <w:t xml:space="preserve">Segal, N., Subramanian, A., Li, M., Miller, B. K., &amp; Gómez-Bombarelli, R. (2025). The Loss Landscape of Powder X-Ray Diffraction-Based Structure Optimization Is Too Rough for Gradient Descent.</w:t>
-      </w:r>
-      <w:r>
-        <w:t xml:space="preserve"> </w:t>
-      </w:r>
-      <w:r>
-        <w:rPr>
-          <w:i/>
-          <w:iCs/>
-        </w:rPr>
-        <w:t xml:space="preserve">arXiv:2512.04036</w:t>
-      </w:r>
-      <w:r>
-        <w:t xml:space="preserve">.</w:t>
-      </w:r>
-    </w:p>
-  </w:footnote>
-  <w:footnote w:id="28">
-    <w:p>
-      <w:pPr>
-        <w:pStyle w:val="FootnoteText"/>
-      </w:pPr>
-      <w:r>
-        <w:rPr>
-          <w:rStyle w:val="FootnoteReference"/>
-        </w:rPr>
-        <w:footnoteRef/>
-      </w:r>
-      <w:r>
-        <w:t xml:space="preserve"> </w:t>
-      </w:r>
-      <w:r>
-        <w:t xml:space="preserve">Schütt, K. T., et al. (2017). SchNet: A continuous-filter convolutional neural network for modeling quantum interactions.</w:t>
-      </w:r>
-      <w:r>
-        <w:t xml:space="preserve"> </w:t>
-      </w:r>
-      <w:r>
-        <w:rPr>
-          <w:i/>
-          <w:iCs/>
-        </w:rPr>
-        <w:t xml:space="preserve">Advances in Neural Information Processing Systems</w:t>
-      </w:r>
-      <w:r>
-        <w:t xml:space="preserve"> </w:t>
-      </w:r>
-      <w:r>
-        <w:t xml:space="preserve">30.</w:t>
-      </w:r>
-    </w:p>
-  </w:footnote>
-  <w:footnote w:id="29">
-    <w:p>
-      <w:pPr>
-        <w:pStyle w:val="FootnoteText"/>
-      </w:pPr>
-      <w:r>
-        <w:rPr>
-          <w:rStyle w:val="FootnoteReference"/>
-        </w:rPr>
-        <w:footnoteRef/>
-      </w:r>
-      <w:r>
-        <w:t xml:space="preserve"> </w:t>
-      </w:r>
-      <w:r>
-        <w:t xml:space="preserve">Batatia, I., Kovács, D. P., Simm, G. N. C., Ortner, C., &amp; Csányi, G. (2022). MACE: Higher order equivariant message passing neural networks for fast and accurate force fields.</w:t>
-      </w:r>
-      <w:r>
-        <w:t xml:space="preserve"> </w:t>
-      </w:r>
-      <w:r>
-        <w:rPr>
-          <w:i/>
-          <w:iCs/>
-        </w:rPr>
-        <w:t xml:space="preserve">Advances in Neural Information Processing Systems</w:t>
-      </w:r>
-      <w:r>
-        <w:t xml:space="preserve"> </w:t>
-      </w:r>
-      <w:r>
-        <w:t xml:space="preserve">35.</w:t>
-      </w:r>
-    </w:p>
-  </w:footnote>
-  <w:footnote w:id="38">
-    <w:p>
-      <w:pPr>
-        <w:pStyle w:val="FootnoteText"/>
-      </w:pPr>
-      <w:r>
-        <w:rPr>
-          <w:rStyle w:val="FootnoteReference"/>
-        </w:rPr>
-        <w:footnoteRef/>
-      </w:r>
-      <w:r>
-        <w:t xml:space="preserve"> </w:t>
-      </w:r>
-      <w:r>
-        <w:t xml:space="preserve">Nichol, A., &amp; Dhariwal, P. (2021). Improved denoising diffusion probabilistic models.</w:t>
-      </w:r>
-      <w:r>
-        <w:t xml:space="preserve"> </w:t>
-      </w:r>
-      <w:r>
-        <w:rPr>
-          <w:i/>
-          <w:iCs/>
-        </w:rPr>
-        <w:t xml:space="preserve">International Conference on Machine Learning</w:t>
-      </w:r>
-      <w:r>
-        <w:t xml:space="preserve">.</w:t>
-      </w:r>
-    </w:p>
-  </w:footnote>
-  <w:footnote w:id="40">
-    <w:p>
-      <w:pPr>
-        <w:pStyle w:val="FootnoteText"/>
-      </w:pPr>
-      <w:r>
-        <w:rPr>
-          <w:rStyle w:val="FootnoteReference"/>
-        </w:rPr>
-        <w:footnoteRef/>
-      </w:r>
-      <w:r>
-        <w:t xml:space="preserve"> </w:t>
-      </w:r>
-      <w:r>
-        <w:t xml:space="preserve">Toby, B. H., &amp; Von Dreele, R. B. (2013). GSAS-II: the genesis of a modern open-source all purpose crystallography software package.</w:t>
-      </w:r>
-      <w:r>
-        <w:t xml:space="preserve"> </w:t>
-      </w:r>
-      <w:r>
-        <w:rPr>
-          <w:i/>
-          <w:iCs/>
-        </w:rPr>
-        <w:t xml:space="preserve">Journal of Applied Crystallography</w:t>
-      </w:r>
-      <w:r>
-        <w:t xml:space="preserve">, 46(2), 544–549. Code:</w:t>
-      </w:r>
-      <w:r>
-        <w:t xml:space="preserve"> </w:t>
-      </w:r>
-      <w:r>
-        <w:rPr>
-          <w:rStyle w:val="VerbatimChar"/>
-        </w:rPr>
-        <w:t xml:space="preserve">github.com/AdvancedPhotonSource/GSAS-II</w:t>
-      </w:r>
-      <w:r>
-        <w:t xml:space="preserve">.</w:t>
-      </w:r>
-    </w:p>
-  </w:footnote>
-  <w:footnote w:id="42">
-    <w:p>
-      <w:pPr>
-        <w:pStyle w:val="FootnoteText"/>
-      </w:pPr>
-      <w:r>
-        <w:rPr>
-          <w:rStyle w:val="FootnoteReference"/>
-        </w:rPr>
-        <w:footnoteRef/>
-      </w:r>
-      <w:r>
-        <w:t xml:space="preserve"> </w:t>
-      </w:r>
-      <w:r>
-        <w:t xml:space="preserve">Song, J., Meng, C., &amp; Ermon, S. (2021). Denoising diffusion implicit models.</w:t>
-      </w:r>
-      <w:r>
-        <w:t xml:space="preserve"> </w:t>
-      </w:r>
-      <w:r>
-        <w:rPr>
-          <w:i/>
-          <w:iCs/>
-        </w:rPr>
-        <w:t xml:space="preserve">International Conference on Learning Representations</w:t>
-      </w:r>
-      <w:r>
-        <w:t xml:space="preserve">.</w:t>
-      </w:r>
-    </w:p>
-  </w:footnote>
-  <w:footnote w:id="45">
-    <w:p>
-      <w:pPr>
-        <w:pStyle w:val="FootnoteText"/>
-      </w:pPr>
-      <w:r>
-        <w:rPr>
-          <w:rStyle w:val="FootnoteReference"/>
-        </w:rPr>
-        <w:footnoteRef/>
-      </w:r>
-      <w:r>
-        <w:t xml:space="preserve"> </w:t>
-      </w:r>
-      <w:r>
-        <w:t xml:space="preserve">Xie, T., Fu, X., Ganea, O.-E., Barzilay, R., &amp; Jaakkola, T. (2022). Crystal diffusion variational autoencoder for periodic material generation.</w:t>
-      </w:r>
-      <w:r>
-        <w:t xml:space="preserve"> </w:t>
-      </w:r>
-      <w:r>
-        <w:rPr>
-          <w:i/>
-          <w:iCs/>
-        </w:rPr>
-        <w:t xml:space="preserve">International Conference on Learning Representations</w:t>
-      </w:r>
-      <w:r>
-        <w:t xml:space="preserve">.</w:t>
-      </w:r>
-    </w:p>
-  </w:footnote>
-  <w:footnote w:id="57">
-    <w:p>
-      <w:pPr>
-        <w:pStyle w:val="FootnoteText"/>
-      </w:pPr>
-      <w:r>
-        <w:rPr>
-          <w:rStyle w:val="FootnoteReference"/>
-        </w:rPr>
-        <w:footnoteRef/>
-      </w:r>
-      <w:r>
-        <w:t xml:space="preserve"> </w:t>
-      </w:r>
-      <w:r>
-        <w:t xml:space="preserve">Choudhary, K. (2025). DiffractGPT: Atomic Structure Determination from X-ray Diffraction Patterns using a Generative Pretrained Transformer.</w:t>
-      </w:r>
-      <w:r>
-        <w:t xml:space="preserve"> </w:t>
-      </w:r>
-      <w:r>
-        <w:rPr>
-          <w:i/>
-          <w:iCs/>
-        </w:rPr>
-        <w:t xml:space="preserve">The Journal of Physical Chemistry Letters</w:t>
-      </w:r>
-      <w:r>
-        <w:t xml:space="preserve">, 16(8), 2110–2119. DOI: 10.1021/acs.jpclett.4c03137. Reproduced from HF checkpoint</w:t>
-      </w:r>
-      <w:r>
-        <w:t xml:space="preserve"> </w:t>
-      </w:r>
-      <w:r>
-        <w:rPr>
-          <w:rStyle w:val="VerbatimChar"/>
-        </w:rPr>
-        <w:t xml:space="preserve">knc6/diffractgpt_mistral_chemical_formula</w:t>
-      </w:r>
-      <w:r>
-        <w:t xml:space="preserve"> </w:t>
-      </w:r>
-      <w:r>
-        <w:t xml:space="preserve">and code at</w:t>
-      </w:r>
-      <w:r>
-        <w:t xml:space="preserve"> </w:t>
-      </w:r>
-      <w:r>
-        <w:rPr>
-          <w:rStyle w:val="VerbatimChar"/>
-        </w:rPr>
-        <w:t xml:space="preserve">github.com/atomgptlab/atomgpt</w:t>
-      </w:r>
-      <w:r>
-        <w:t xml:space="preserve">.</w:t>
-      </w:r>
-    </w:p>
-  </w:footnote>
-  <w:footnote w:id="58">
-    <w:p>
-      <w:pPr>
-        <w:pStyle w:val="FootnoteText"/>
-      </w:pPr>
-      <w:r>
-        <w:rPr>
-          <w:rStyle w:val="FootnoteReference"/>
-        </w:rPr>
-        <w:footnoteRef/>
-      </w:r>
-      <w:r>
-        <w:t xml:space="preserve"> </w:t>
-      </w:r>
-      <w:r>
-        <w:t xml:space="preserve">Guo, G., Saidi, T. L., Terban, M. W., Valsecchi, M., Billinge, S. J. L., &amp; Lipson, H. (2025). Ab initio structure solutions from nanocrystalline powder diffraction data via diffusion models.</w:t>
-      </w:r>
-      <w:r>
-        <w:t xml:space="preserve"> </w:t>
-      </w:r>
-      <w:r>
-        <w:rPr>
-          <w:i/>
-          <w:iCs/>
-        </w:rPr>
-        <w:t xml:space="preserve">Nature Materials</w:t>
-      </w:r>
-      <w:r>
-        <w:t xml:space="preserve">, 24, 1726–1734. DOI: 10.1038/s41563-025-02220-y (Author Correction: 10.1038/s41563-025-02301-y; preprint arXiv:2406.10796). Reproduced from HF checkpoint</w:t>
-      </w:r>
-      <w:r>
-        <w:t xml:space="preserve"> </w:t>
-      </w:r>
-      <w:r>
-        <w:rPr>
-          <w:rStyle w:val="VerbatimChar"/>
-        </w:rPr>
-        <w:t xml:space="preserve">therealgabeguo/cdvae_xrd_sinc100</w:t>
-      </w:r>
-      <w:r>
-        <w:t xml:space="preserve"> </w:t>
-      </w:r>
-      <w:r>
-        <w:t xml:space="preserve">and code at</w:t>
-      </w:r>
-      <w:r>
-        <w:t xml:space="preserve"> </w:t>
-      </w:r>
-      <w:r>
-        <w:rPr>
-          <w:rStyle w:val="VerbatimChar"/>
-        </w:rPr>
-        <w:t xml:space="preserve">github.com/gabeguo/cdvae_xrd</w:t>
-      </w:r>
-      <w:r>
-        <w:t xml:space="preserve">.</w:t>
-      </w:r>
-    </w:p>
-  </w:footnote>
-  <w:footnote w:id="59">
-    <w:p>
-      <w:pPr>
-        <w:pStyle w:val="FootnoteText"/>
-      </w:pPr>
-      <w:r>
-        <w:rPr>
-          <w:rStyle w:val="FootnoteReference"/>
-        </w:rPr>
-        <w:footnoteRef/>
-      </w:r>
-      <w:r>
-        <w:t xml:space="preserve"> </w:t>
-      </w:r>
-      <w:r>
-        <w:t xml:space="preserve">Johansen, F. L., Friis-Jensen, U., Dam, E. B., Jensen, K. M. Ø., Mercado, R., &amp; Selvan, R. (2025). deCIFer: Crystal Structure Prediction from Powder Diffraction Data using Autoregressive Language Models.</w:t>
-      </w:r>
-      <w:r>
-        <w:t xml:space="preserve"> </w:t>
-      </w:r>
-      <w:r>
-        <w:rPr>
-          <w:i/>
-          <w:iCs/>
-        </w:rPr>
-        <w:t xml:space="preserve">Transactions on Machine Learning Research</w:t>
-      </w:r>
-      <w:r>
-        <w:t xml:space="preserve"> </w:t>
-      </w:r>
-      <w:r>
-        <w:t xml:space="preserve">(arXiv:2502.02189).</w:t>
-      </w:r>
-    </w:p>
-  </w:footnote>
-  <w:footnote w:id="65">
-    <w:p>
-      <w:pPr>
-        <w:pStyle w:val="FootnoteText"/>
-      </w:pPr>
-      <w:r>
-        <w:rPr>
-          <w:rStyle w:val="FootnoteReference"/>
-        </w:rPr>
-        <w:footnoteRef/>
-      </w:r>
-      <w:r>
-        <w:t xml:space="preserve"> </w:t>
-      </w:r>
-      <w:r>
-        <w:t xml:space="preserve">Segal, N., Subramanian, A., Li, M., Miller, B. K., &amp; Gómez-Bombarelli, R. (2025). The Loss Landscape of Powder X-Ray Diffraction-Based Structure Optimization Is Too Rough for Gradient Descent.</w:t>
-      </w:r>
-      <w:r>
-        <w:t xml:space="preserve"> </w:t>
-      </w:r>
-      <w:r>
-        <w:rPr>
-          <w:i/>
-          <w:iCs/>
-        </w:rPr>
-        <w:t xml:space="preserve">arXiv:2512.04036</w:t>
-      </w:r>
-      <w:r>
-        <w:t xml:space="preserve">.</w:t>
       </w:r>
     </w:p>
   </w:footnote>
@@ -12884,10 +11713,37 @@
     <w:abstractNumId w:val="991"/>
   </w:num>
   <w:num w:numId="1003">
-    <w:abstractNumId w:val="991"/>
+    <w:abstractNumId w:val="99411"/>
+    <w:lvlOverride w:ilvl="0">
+      <w:startOverride w:val="1"/>
+    </w:lvlOverride>
+    <w:lvlOverride w:ilvl="1">
+      <w:startOverride w:val="1"/>
+    </w:lvlOverride>
+    <w:lvlOverride w:ilvl="2">
+      <w:startOverride w:val="1"/>
+    </w:lvlOverride>
+    <w:lvlOverride w:ilvl="3">
+      <w:startOverride w:val="1"/>
+    </w:lvlOverride>
+    <w:lvlOverride w:ilvl="4">
+      <w:startOverride w:val="1"/>
+    </w:lvlOverride>
+    <w:lvlOverride w:ilvl="5">
+      <w:startOverride w:val="1"/>
+    </w:lvlOverride>
+    <w:lvlOverride w:ilvl="6">
+      <w:startOverride w:val="1"/>
+    </w:lvlOverride>
+    <w:lvlOverride w:ilvl="7">
+      <w:startOverride w:val="1"/>
+    </w:lvlOverride>
+    <w:lvlOverride w:ilvl="8">
+      <w:startOverride w:val="1"/>
+    </w:lvlOverride>
   </w:num>
   <w:num w:numId="1004">
-    <w:abstractNumId w:val="993"/>
+    <w:abstractNumId w:val="991"/>
   </w:num>
   <w:num w:numId="1005">
     <w:abstractNumId w:val="993"/>
@@ -12902,6 +11758,9 @@
     <w:abstractNumId w:val="993"/>
   </w:num>
   <w:num w:numId="1009">
+    <w:abstractNumId w:val="993"/>
+  </w:num>
+  <w:num w:numId="1010">
     <w:abstractNumId w:val="993"/>
   </w:num>
 </w:numbering>

</xml_diff>

<commit_message>
paper: set author affiliation to Purdue University, West Lafayette IN; regen tex/pdf/docx
</commit_message>
<xml_diff>
--- a/paper/paper.docx
+++ b/paper/paper.docx
@@ -2,9 +2,10 @@
 <file path=word/document.xml><?xml version="1.0" encoding="utf-8"?>
 <w:document xmlns:w="http://schemas.openxmlformats.org/wordprocessingml/2006/main" xmlns:m="http://schemas.openxmlformats.org/officeDocument/2006/math" xmlns:r="http://schemas.openxmlformats.org/officeDocument/2006/relationships" xmlns:o="urn:schemas-microsoft-com:office:office" xmlns:v="urn:schemas-microsoft-com:vml" xmlns:w10="urn:schemas-microsoft-com:office:word" xmlns:a="http://schemas.openxmlformats.org/drawingml/2006/main" xmlns:pic="http://schemas.openxmlformats.org/drawingml/2006/picture" xmlns:wp="http://schemas.openxmlformats.org/drawingml/2006/wordprocessingDrawing">
   <w:body>
-    <w:p>
-      <w:pPr>
-        <w:pStyle w:val="Title"/>
+    <w:bookmarkStart w:id="63" w:name="X2ddac61a38ed9c25ada36f223803948c7dd92e7"/>
+    <w:p>
+      <w:pPr>
+        <w:pStyle w:val="Heading1"/>
       </w:pPr>
       <w:r>
         <w:t xml:space="preserve">PXRD-Diff: Conditional Diffusion for Powder-Diffraction Inversion: an Encoder-Bottleneck Diagnosis and Shared-Harness Reproduction</w:t>
@@ -27,7 +28,7 @@
         <w:pStyle w:val="BodyText"/>
       </w:pPr>
       <w:r>
-        <w:t xml:space="preserve">Independent Researcher, Fort Wayne, IN, USA</w:t>
+        <w:t xml:space="preserve">Purdue University, West Lafayette, IN, USA</w:t>
       </w:r>
     </w:p>
     <w:p>
@@ -60,7 +61,7 @@
     <w:bookmarkStart w:id="9" w:name="abstract"/>
     <w:p>
       <w:pPr>
-        <w:pStyle w:val="Heading1"/>
+        <w:pStyle w:val="Heading2"/>
       </w:pPr>
       <w:r>
         <w:t xml:space="preserve">Abstract</w:t>
@@ -173,7 +174,7 @@
     <w:bookmarkStart w:id="10" w:name="introduction"/>
     <w:p>
       <w:pPr>
-        <w:pStyle w:val="Heading1"/>
+        <w:pStyle w:val="Heading2"/>
       </w:pPr>
       <w:r>
         <w:t xml:space="preserve">1. Introduction</w:t>
@@ -491,7 +492,7 @@
     <w:bookmarkStart w:id="11" w:name="related-work"/>
     <w:p>
       <w:pPr>
-        <w:pStyle w:val="Heading1"/>
+        <w:pStyle w:val="Heading2"/>
       </w:pPr>
       <w:r>
         <w:t xml:space="preserve">2. Related work</w:t>
@@ -666,7 +667,7 @@
     <w:bookmarkStart w:id="22" w:name="method"/>
     <w:p>
       <w:pPr>
-        <w:pStyle w:val="Heading1"/>
+        <w:pStyle w:val="Heading2"/>
       </w:pPr>
       <w:r>
         <w:t xml:space="preserve">3. Method</w:t>
@@ -675,7 +676,7 @@
     <w:bookmarkStart w:id="12" w:name="problem-formulation"/>
     <w:p>
       <w:pPr>
-        <w:pStyle w:val="Heading2"/>
+        <w:pStyle w:val="Heading3"/>
       </w:pPr>
       <w:r>
         <w:t xml:space="preserve">3.1 Problem formulation</w:t>
@@ -1228,7 +1229,7 @@
     <w:bookmarkStart w:id="13" w:name="architecture-overview"/>
     <w:p>
       <w:pPr>
-        <w:pStyle w:val="Heading2"/>
+        <w:pStyle w:val="Heading3"/>
       </w:pPr>
       <w:r>
         <w:t xml:space="preserve">3.2 Architecture overview</w:t>
@@ -2067,7 +2068,7 @@
     <w:bookmarkStart w:id="18" w:name="Xc917a453586cc10256448f63d6af218d81ba9bb"/>
     <w:p>
       <w:pPr>
-        <w:pStyle w:val="Heading2"/>
+        <w:pStyle w:val="Heading3"/>
       </w:pPr>
       <w:r>
         <w:t xml:space="preserve">3.3 Differentiable Bragg structure-factor loss</w:t>
@@ -3082,7 +3083,7 @@
     <w:bookmarkStart w:id="19" w:name="training-objective"/>
     <w:p>
       <w:pPr>
-        <w:pStyle w:val="Heading2"/>
+        <w:pStyle w:val="Heading3"/>
       </w:pPr>
       <w:r>
         <w:t xml:space="preserve">3.4 Training objective</w:t>
@@ -4321,7 +4322,7 @@
     <w:bookmarkStart w:id="20" w:name="X6e75ac1b115bab34c6f95946b56455b7789be55"/>
     <w:p>
       <w:pPr>
-        <w:pStyle w:val="Heading2"/>
+        <w:pStyle w:val="Heading3"/>
       </w:pPr>
       <w:r>
         <w:t xml:space="preserve">3.5 Classical indexing as a drop-in for the learned lattice head</w:t>
@@ -4475,7 +4476,7 @@
     <w:bookmarkStart w:id="21" w:name="sampling"/>
     <w:p>
       <w:pPr>
-        <w:pStyle w:val="Heading2"/>
+        <w:pStyle w:val="Heading3"/>
       </w:pPr>
       <w:r>
         <w:t xml:space="preserve">3.6 Sampling</w:t>
@@ -4809,7 +4810,7 @@
     <w:bookmarkStart w:id="23" w:name="experiments"/>
     <w:p>
       <w:pPr>
-        <w:pStyle w:val="Heading1"/>
+        <w:pStyle w:val="Heading2"/>
       </w:pPr>
       <w:r>
         <w:t xml:space="preserve">4. Experiments</w:t>
@@ -5422,7 +5423,7 @@
     <w:bookmarkStart w:id="46" w:name="results"/>
     <w:p>
       <w:pPr>
-        <w:pStyle w:val="Heading1"/>
+        <w:pStyle w:val="Heading2"/>
       </w:pPr>
       <w:r>
         <w:t xml:space="preserve">5. Results</w:t>
@@ -5439,7 +5440,7 @@
     <w:bookmarkStart w:id="28" w:name="Xadaaeed9a4d3d9b8a4dfaf721f122e0603fe773"/>
     <w:p>
       <w:pPr>
-        <w:pStyle w:val="Heading2"/>
+        <w:pStyle w:val="Heading3"/>
       </w:pPr>
       <w:r>
         <w:t xml:space="preserve">5.1 Phase 4: architectural ablation (true-lattice setting)</w:t>
@@ -6380,7 +6381,7 @@
     <w:bookmarkStart w:id="33" w:name="phase-9-classical-indexer-drop-in"/>
     <w:p>
       <w:pPr>
-        <w:pStyle w:val="Heading2"/>
+        <w:pStyle w:val="Heading3"/>
       </w:pPr>
       <w:r>
         <w:t xml:space="preserve">5.2 Phase 9: classical indexer drop-in</w:t>
@@ -7348,7 +7349,7 @@
     <w:bookmarkStart w:id="38" w:name="head-to-head-with-external-baselines"/>
     <w:p>
       <w:pPr>
-        <w:pStyle w:val="Heading2"/>
+        <w:pStyle w:val="Heading3"/>
       </w:pPr>
       <w:r>
         <w:t xml:space="preserve">5.3 Head-to-head with external baselines</w:t>
@@ -8093,7 +8094,7 @@
     <w:bookmarkStart w:id="43" w:name="what-did-not-work"/>
     <w:p>
       <w:pPr>
-        <w:pStyle w:val="Heading2"/>
+        <w:pStyle w:val="Heading3"/>
       </w:pPr>
       <w:r>
         <w:t xml:space="preserve">5.4 What did</w:t>
@@ -8474,7 +8475,7 @@
     <w:bookmarkStart w:id="44" w:name="encoder-bottleneck-perturbation-study"/>
     <w:p>
       <w:pPr>
-        <w:pStyle w:val="Heading2"/>
+        <w:pStyle w:val="Heading3"/>
       </w:pPr>
       <w:r>
         <w:t xml:space="preserve">5.5 Encoder-bottleneck perturbation study</w:t>
@@ -8578,7 +8579,7 @@
     <w:bookmarkStart w:id="45" w:name="Xe14ee5fe759b907ea0190421ae7272432ef5613"/>
     <w:p>
       <w:pPr>
-        <w:pStyle w:val="Heading2"/>
+        <w:pStyle w:val="Heading3"/>
       </w:pPr>
       <w:r>
         <w:t xml:space="preserve">5.6 Why the learned lattice fails: a pooling bottleneck, not a head bottleneck</w:t>
@@ -8880,7 +8881,7 @@
     <w:bookmarkStart w:id="47" w:name="discussion"/>
     <w:p>
       <w:pPr>
-        <w:pStyle w:val="Heading1"/>
+        <w:pStyle w:val="Heading2"/>
       </w:pPr>
       <w:r>
         <w:t xml:space="preserve">6. Discussion</w:t>
@@ -9118,7 +9119,7 @@
     <w:bookmarkStart w:id="48" w:name="limitations"/>
     <w:p>
       <w:pPr>
-        <w:pStyle w:val="Heading1"/>
+        <w:pStyle w:val="Heading2"/>
       </w:pPr>
       <w:r>
         <w:t xml:space="preserve">7. Limitations</w:t>
@@ -9392,7 +9393,7 @@
     <w:bookmarkStart w:id="49" w:name="conclusion"/>
     <w:p>
       <w:pPr>
-        <w:pStyle w:val="Heading1"/>
+        <w:pStyle w:val="Heading2"/>
       </w:pPr>
       <w:r>
         <w:t xml:space="preserve">8. Conclusion</w:t>
@@ -9432,7 +9433,7 @@
     <w:bookmarkStart w:id="50" w:name="acknowledgments"/>
     <w:p>
       <w:pPr>
-        <w:pStyle w:val="Heading1"/>
+        <w:pStyle w:val="Heading2"/>
       </w:pPr>
       <w:r>
         <w:t xml:space="preserve">Acknowledgments</w:t>
@@ -9492,7 +9493,7 @@
     <w:bookmarkStart w:id="51" w:name="author-contributions-credit"/>
     <w:p>
       <w:pPr>
-        <w:pStyle w:val="Heading1"/>
+        <w:pStyle w:val="Heading2"/>
       </w:pPr>
       <w:r>
         <w:t xml:space="preserve">Author Contributions (CRediT)</w:t>
@@ -9510,7 +9511,7 @@
     <w:bookmarkStart w:id="52" w:name="conflict-of-interest"/>
     <w:p>
       <w:pPr>
-        <w:pStyle w:val="Heading1"/>
+        <w:pStyle w:val="Heading2"/>
       </w:pPr>
       <w:r>
         <w:t xml:space="preserve">Conflict of Interest</w:t>
@@ -9528,7 +9529,7 @@
     <w:bookmarkStart w:id="53" w:name="funding"/>
     <w:p>
       <w:pPr>
-        <w:pStyle w:val="Heading1"/>
+        <w:pStyle w:val="Heading2"/>
       </w:pPr>
       <w:r>
         <w:t xml:space="preserve">Funding</w:t>
@@ -9546,7 +9547,7 @@
     <w:bookmarkStart w:id="55" w:name="data-and-code-availability"/>
     <w:p>
       <w:pPr>
-        <w:pStyle w:val="Heading1"/>
+        <w:pStyle w:val="Heading2"/>
       </w:pPr>
       <w:r>
         <w:t xml:space="preserve">Data and Code Availability</w:t>
@@ -9581,7 +9582,7 @@
     <w:bookmarkStart w:id="56" w:name="ethics-declaration"/>
     <w:p>
       <w:pPr>
-        <w:pStyle w:val="Heading1"/>
+        <w:pStyle w:val="Heading2"/>
       </w:pPr>
       <w:r>
         <w:t xml:space="preserve">Ethics Declaration</w:t>
@@ -9606,7 +9607,7 @@
     <w:bookmarkStart w:id="57" w:name="references"/>
     <w:p>
       <w:pPr>
-        <w:pStyle w:val="Heading1"/>
+        <w:pStyle w:val="Heading2"/>
       </w:pPr>
       <w:r>
         <w:t xml:space="preserve">References</w:t>
@@ -10133,7 +10134,7 @@
     <w:bookmarkStart w:id="62" w:name="appendix"/>
     <w:p>
       <w:pPr>
-        <w:pStyle w:val="Heading1"/>
+        <w:pStyle w:val="Heading2"/>
       </w:pPr>
       <w:r>
         <w:t xml:space="preserve">Appendix</w:t>
@@ -10142,7 +10143,7 @@
     <w:bookmarkStart w:id="58" w:name="a.-full-ablation-history"/>
     <w:p>
       <w:pPr>
-        <w:pStyle w:val="Heading2"/>
+        <w:pStyle w:val="Heading3"/>
       </w:pPr>
       <w:r>
         <w:t xml:space="preserve">A. Full ablation history</w:t>
@@ -11004,7 +11005,7 @@
     <w:bookmarkStart w:id="59" w:name="b.-hyperparameter-sensitivity"/>
     <w:p>
       <w:pPr>
-        <w:pStyle w:val="Heading2"/>
+        <w:pStyle w:val="Heading3"/>
       </w:pPr>
       <w:r>
         <w:t xml:space="preserve">B. Hyperparameter sensitivity</w:t>
@@ -11052,7 +11053,7 @@
     <w:bookmarkStart w:id="60" w:name="X984f5037fa8fa240d4e7791708ee54c226ae797"/>
     <w:p>
       <w:pPr>
-        <w:pStyle w:val="Heading2"/>
+        <w:pStyle w:val="Heading3"/>
       </w:pPr>
       <w:r>
         <w:t xml:space="preserve">C. Differentiable simulator validation details</w:t>
@@ -11222,7 +11223,7 @@
     <w:bookmarkStart w:id="61" w:name="d.-reproducibility-checklist"/>
     <w:p>
       <w:pPr>
-        <w:pStyle w:val="Heading2"/>
+        <w:pStyle w:val="Heading3"/>
       </w:pPr>
       <w:r>
         <w:t xml:space="preserve">D. Reproducibility checklist</w:t>
@@ -11302,6 +11303,7 @@
     </w:p>
     <w:bookmarkEnd w:id="61"/>
     <w:bookmarkEnd w:id="62"/>
+    <w:bookmarkEnd w:id="63"/>
     <w:sectPr>
       <w:footnotePr>
         <w:numRestart w:val="eachSect"/>

</xml_diff>